<commit_message>
Update report: replace with latest revised version
</commit_message>
<xml_diff>
--- a/docs/report/COT4400_Report.docx
+++ b/docs/report/COT4400_Report.docx
@@ -100,26 +100,51 @@
         <w:spacing w:after="80"/>
         <w:jc w:val="center"/>
       </w:pPr>
+      <w:proofErr w:type="spellStart"/>
       <w:r>
         <w:rPr>
           <w:sz w:val="24"/>
           <w:szCs w:val="24"/>
         </w:rPr>
-        <w:t xml:space="preserve">Seyoung </w:t>
-      </w:r>
+        <w:t>Seyoung</w:t>
+      </w:r>
+      <w:proofErr w:type="spellEnd"/>
       <w:r>
         <w:rPr>
           <w:sz w:val="24"/>
           <w:szCs w:val="24"/>
         </w:rPr>
-        <w:t>Kan –</w:t>
+        <w:t xml:space="preserve"> </w:t>
       </w:r>
       <w:r>
         <w:rPr>
           <w:sz w:val="24"/>
           <w:szCs w:val="24"/>
         </w:rPr>
-        <w:t xml:space="preserve">  U36444259</w:t>
+        <w:t xml:space="preserve">Kan </w:t>
+      </w:r>
+      <w:proofErr w:type="gramStart"/>
+      <w:r>
+        <w:rPr>
+          <w:sz w:val="24"/>
+          <w:szCs w:val="24"/>
+        </w:rPr>
+        <w:t>–</w:t>
+      </w:r>
+      <w:r>
+        <w:rPr>
+          <w:sz w:val="24"/>
+          <w:szCs w:val="24"/>
+        </w:rPr>
+        <w:t xml:space="preserve">  U</w:t>
+      </w:r>
+      <w:proofErr w:type="gramEnd"/>
+      <w:r>
+        <w:rPr>
+          <w:sz w:val="24"/>
+          <w:szCs w:val="24"/>
+        </w:rPr>
+        <w:t>36444259</w:t>
       </w:r>
     </w:p>
     <w:p>
@@ -139,14 +164,30 @@
           <w:sz w:val="24"/>
           <w:szCs w:val="24"/>
         </w:rPr>
-        <w:t>Selvakumar –</w:t>
-      </w:r>
+        <w:t xml:space="preserve">Selvakumar </w:t>
+      </w:r>
+      <w:proofErr w:type="gramStart"/>
       <w:r>
         <w:rPr>
           <w:sz w:val="24"/>
           <w:szCs w:val="24"/>
         </w:rPr>
-        <w:t xml:space="preserve">  U75300364</w:t>
+        <w:t>–</w:t>
+      </w:r>
+      <w:r>
+        <w:rPr>
+          <w:sz w:val="24"/>
+          <w:szCs w:val="24"/>
+        </w:rPr>
+        <w:t xml:space="preserve">  U</w:t>
+      </w:r>
+      <w:proofErr w:type="gramEnd"/>
+      <w:r>
+        <w:rPr>
+          <w:sz w:val="24"/>
+          <w:szCs w:val="24"/>
+        </w:rPr>
+        <w:t>75300364</w:t>
       </w:r>
     </w:p>
     <w:p>
@@ -331,12 +372,21 @@
             </w:tcMar>
           </w:tcPr>
           <w:p>
-            <w:r>
-              <w:rPr>
-                <w:sz w:val="20"/>
-                <w:szCs w:val="20"/>
-              </w:rPr>
-              <w:t>Seyoung Kan</w:t>
+            <w:proofErr w:type="spellStart"/>
+            <w:r>
+              <w:rPr>
+                <w:sz w:val="20"/>
+                <w:szCs w:val="20"/>
+              </w:rPr>
+              <w:t>Seyoung</w:t>
+            </w:r>
+            <w:proofErr w:type="spellEnd"/>
+            <w:r>
+              <w:rPr>
+                <w:sz w:val="20"/>
+                <w:szCs w:val="20"/>
+              </w:rPr>
+              <w:t xml:space="preserve"> Kan</w:t>
             </w:r>
           </w:p>
         </w:tc>
@@ -1770,6 +1820,7 @@
             </w:tcMar>
           </w:tcPr>
           <w:p>
+            <w:proofErr w:type="spellStart"/>
             <w:r>
               <w:rPr>
                 <w:sz w:val="20"/>
@@ -1777,6 +1828,7 @@
               </w:rPr>
               <w:t>CoreA</w:t>
             </w:r>
+            <w:proofErr w:type="spellEnd"/>
           </w:p>
         </w:tc>
         <w:tc>
@@ -1886,6 +1938,7 @@
             </w:tcMar>
           </w:tcPr>
           <w:p>
+            <w:proofErr w:type="spellStart"/>
             <w:r>
               <w:rPr>
                 <w:sz w:val="20"/>
@@ -1893,6 +1946,7 @@
               </w:rPr>
               <w:t>CoreB</w:t>
             </w:r>
+            <w:proofErr w:type="spellEnd"/>
           </w:p>
         </w:tc>
         <w:tc>
@@ -2061,8 +2115,33 @@
                 <w:sz w:val="20"/>
                 <w:szCs w:val="20"/>
               </w:rPr>
-              <w:t>Aggregates EdgeA and EdgeB</w:t>
-            </w:r>
+              <w:t xml:space="preserve">Aggregates </w:t>
+            </w:r>
+            <w:proofErr w:type="spellStart"/>
+            <w:r>
+              <w:rPr>
+                <w:sz w:val="20"/>
+                <w:szCs w:val="20"/>
+              </w:rPr>
+              <w:t>EdgeA</w:t>
+            </w:r>
+            <w:proofErr w:type="spellEnd"/>
+            <w:r>
+              <w:rPr>
+                <w:sz w:val="20"/>
+                <w:szCs w:val="20"/>
+              </w:rPr>
+              <w:t xml:space="preserve"> and </w:t>
+            </w:r>
+            <w:proofErr w:type="spellStart"/>
+            <w:r>
+              <w:rPr>
+                <w:sz w:val="20"/>
+                <w:szCs w:val="20"/>
+              </w:rPr>
+              <w:t>EdgeB</w:t>
+            </w:r>
+            <w:proofErr w:type="spellEnd"/>
           </w:p>
         </w:tc>
       </w:tr>
@@ -2177,8 +2256,33 @@
                 <w:sz w:val="20"/>
                 <w:szCs w:val="20"/>
               </w:rPr>
-              <w:t>Aggregates EdgeC and EdgeD</w:t>
-            </w:r>
+              <w:t xml:space="preserve">Aggregates </w:t>
+            </w:r>
+            <w:proofErr w:type="spellStart"/>
+            <w:r>
+              <w:rPr>
+                <w:sz w:val="20"/>
+                <w:szCs w:val="20"/>
+              </w:rPr>
+              <w:t>EdgeC</w:t>
+            </w:r>
+            <w:proofErr w:type="spellEnd"/>
+            <w:r>
+              <w:rPr>
+                <w:sz w:val="20"/>
+                <w:szCs w:val="20"/>
+              </w:rPr>
+              <w:t xml:space="preserve"> and </w:t>
+            </w:r>
+            <w:proofErr w:type="spellStart"/>
+            <w:r>
+              <w:rPr>
+                <w:sz w:val="20"/>
+                <w:szCs w:val="20"/>
+              </w:rPr>
+              <w:t>EdgeD</w:t>
+            </w:r>
+            <w:proofErr w:type="spellEnd"/>
           </w:p>
         </w:tc>
       </w:tr>
@@ -2234,6 +2338,7 @@
             </w:tcMar>
           </w:tcPr>
           <w:p>
+            <w:proofErr w:type="spellStart"/>
             <w:r>
               <w:rPr>
                 <w:sz w:val="20"/>
@@ -2241,6 +2346,7 @@
               </w:rPr>
               <w:t>DistC</w:t>
             </w:r>
+            <w:proofErr w:type="spellEnd"/>
           </w:p>
         </w:tc>
         <w:tc>
@@ -2293,8 +2399,33 @@
                 <w:sz w:val="20"/>
                 <w:szCs w:val="20"/>
               </w:rPr>
-              <w:t>Aggregates EdgeB and EdgeE</w:t>
-            </w:r>
+              <w:t xml:space="preserve">Aggregates </w:t>
+            </w:r>
+            <w:proofErr w:type="spellStart"/>
+            <w:r>
+              <w:rPr>
+                <w:sz w:val="20"/>
+                <w:szCs w:val="20"/>
+              </w:rPr>
+              <w:t>EdgeB</w:t>
+            </w:r>
+            <w:proofErr w:type="spellEnd"/>
+            <w:r>
+              <w:rPr>
+                <w:sz w:val="20"/>
+                <w:szCs w:val="20"/>
+              </w:rPr>
+              <w:t xml:space="preserve"> and </w:t>
+            </w:r>
+            <w:proofErr w:type="spellStart"/>
+            <w:r>
+              <w:rPr>
+                <w:sz w:val="20"/>
+                <w:szCs w:val="20"/>
+              </w:rPr>
+              <w:t>EdgeE</w:t>
+            </w:r>
+            <w:proofErr w:type="spellEnd"/>
           </w:p>
         </w:tc>
       </w:tr>
@@ -2350,6 +2481,7 @@
             </w:tcMar>
           </w:tcPr>
           <w:p>
+            <w:proofErr w:type="spellStart"/>
             <w:r>
               <w:rPr>
                 <w:sz w:val="20"/>
@@ -2357,6 +2489,7 @@
               </w:rPr>
               <w:t>EdgeA</w:t>
             </w:r>
+            <w:proofErr w:type="spellEnd"/>
           </w:p>
         </w:tc>
         <w:tc>
@@ -2466,6 +2599,7 @@
             </w:tcMar>
           </w:tcPr>
           <w:p>
+            <w:proofErr w:type="spellStart"/>
             <w:r>
               <w:rPr>
                 <w:sz w:val="20"/>
@@ -2473,6 +2607,7 @@
               </w:rPr>
               <w:t>EdgeB</w:t>
             </w:r>
+            <w:proofErr w:type="spellEnd"/>
           </w:p>
         </w:tc>
         <w:tc>
@@ -2582,6 +2717,7 @@
             </w:tcMar>
           </w:tcPr>
           <w:p>
+            <w:proofErr w:type="spellStart"/>
             <w:r>
               <w:rPr>
                 <w:sz w:val="20"/>
@@ -2589,6 +2725,7 @@
               </w:rPr>
               <w:t>EdgeC</w:t>
             </w:r>
+            <w:proofErr w:type="spellEnd"/>
           </w:p>
         </w:tc>
         <w:tc>
@@ -2698,6 +2835,7 @@
             </w:tcMar>
           </w:tcPr>
           <w:p>
+            <w:proofErr w:type="spellStart"/>
             <w:r>
               <w:rPr>
                 <w:sz w:val="20"/>
@@ -2705,6 +2843,7 @@
               </w:rPr>
               <w:t>EdgeD</w:t>
             </w:r>
+            <w:proofErr w:type="spellEnd"/>
           </w:p>
         </w:tc>
         <w:tc>
@@ -2814,6 +2953,7 @@
             </w:tcMar>
           </w:tcPr>
           <w:p>
+            <w:proofErr w:type="spellStart"/>
             <w:r>
               <w:rPr>
                 <w:sz w:val="20"/>
@@ -2821,6 +2961,7 @@
               </w:rPr>
               <w:t>EdgeE</w:t>
             </w:r>
+            <w:proofErr w:type="spellEnd"/>
           </w:p>
         </w:tc>
         <w:tc>
@@ -3453,8 +3594,33 @@
                 <w:sz w:val="20"/>
                 <w:szCs w:val="20"/>
               </w:rPr>
-              <w:t>Protects AccessA and AccessB</w:t>
-            </w:r>
+              <w:t xml:space="preserve">Protects </w:t>
+            </w:r>
+            <w:proofErr w:type="spellStart"/>
+            <w:r>
+              <w:rPr>
+                <w:sz w:val="20"/>
+                <w:szCs w:val="20"/>
+              </w:rPr>
+              <w:t>AccessA</w:t>
+            </w:r>
+            <w:proofErr w:type="spellEnd"/>
+            <w:r>
+              <w:rPr>
+                <w:sz w:val="20"/>
+                <w:szCs w:val="20"/>
+              </w:rPr>
+              <w:t xml:space="preserve"> and </w:t>
+            </w:r>
+            <w:proofErr w:type="spellStart"/>
+            <w:r>
+              <w:rPr>
+                <w:sz w:val="20"/>
+                <w:szCs w:val="20"/>
+              </w:rPr>
+              <w:t>AccessB</w:t>
+            </w:r>
+            <w:proofErr w:type="spellEnd"/>
           </w:p>
         </w:tc>
       </w:tr>
@@ -3569,8 +3735,33 @@
                 <w:sz w:val="20"/>
                 <w:szCs w:val="20"/>
               </w:rPr>
-              <w:t>Protects AccessC and AccessD</w:t>
-            </w:r>
+              <w:t xml:space="preserve">Protects </w:t>
+            </w:r>
+            <w:proofErr w:type="spellStart"/>
+            <w:r>
+              <w:rPr>
+                <w:sz w:val="20"/>
+                <w:szCs w:val="20"/>
+              </w:rPr>
+              <w:t>AccessC</w:t>
+            </w:r>
+            <w:proofErr w:type="spellEnd"/>
+            <w:r>
+              <w:rPr>
+                <w:sz w:val="20"/>
+                <w:szCs w:val="20"/>
+              </w:rPr>
+              <w:t xml:space="preserve"> and </w:t>
+            </w:r>
+            <w:proofErr w:type="spellStart"/>
+            <w:r>
+              <w:rPr>
+                <w:sz w:val="20"/>
+                <w:szCs w:val="20"/>
+              </w:rPr>
+              <w:t>AccessD</w:t>
+            </w:r>
+            <w:proofErr w:type="spellEnd"/>
           </w:p>
         </w:tc>
       </w:tr>
@@ -3626,6 +3817,7 @@
             </w:tcMar>
           </w:tcPr>
           <w:p>
+            <w:proofErr w:type="spellStart"/>
             <w:r>
               <w:rPr>
                 <w:sz w:val="20"/>
@@ -3633,6 +3825,7 @@
               </w:rPr>
               <w:t>AccessA</w:t>
             </w:r>
+            <w:proofErr w:type="spellEnd"/>
           </w:p>
         </w:tc>
         <w:tc>
@@ -3742,6 +3935,7 @@
             </w:tcMar>
           </w:tcPr>
           <w:p>
+            <w:proofErr w:type="spellStart"/>
             <w:r>
               <w:rPr>
                 <w:sz w:val="20"/>
@@ -3749,6 +3943,7 @@
               </w:rPr>
               <w:t>AccessB</w:t>
             </w:r>
+            <w:proofErr w:type="spellEnd"/>
           </w:p>
         </w:tc>
         <w:tc>
@@ -3858,6 +4053,7 @@
             </w:tcMar>
           </w:tcPr>
           <w:p>
+            <w:proofErr w:type="spellStart"/>
             <w:r>
               <w:rPr>
                 <w:sz w:val="20"/>
@@ -3865,6 +4061,7 @@
               </w:rPr>
               <w:t>AccessC</w:t>
             </w:r>
+            <w:proofErr w:type="spellEnd"/>
           </w:p>
         </w:tc>
         <w:tc>
@@ -3974,6 +4171,7 @@
             </w:tcMar>
           </w:tcPr>
           <w:p>
+            <w:proofErr w:type="spellStart"/>
             <w:r>
               <w:rPr>
                 <w:sz w:val="20"/>
@@ -3981,6 +4179,7 @@
               </w:rPr>
               <w:t>AccessD</w:t>
             </w:r>
+            <w:proofErr w:type="spellEnd"/>
           </w:p>
         </w:tc>
         <w:tc>
@@ -4100,6 +4299,11 @@
       <w:pPr>
         <w:spacing w:after="120"/>
         <w:jc w:val="center"/>
+        <w:rPr>
+          <w:color w:val="595959"/>
+          <w:sz w:val="18"/>
+          <w:szCs w:val="18"/>
+        </w:rPr>
       </w:pPr>
       <w:r>
         <w:rPr>
@@ -4108,7 +4312,51 @@
           <w:szCs w:val="18"/>
         </w:rPr>
         <w:lastRenderedPageBreak/>
-        <w:t>Run: make &amp;&amp; ./program_name — then screenshot SECTION 1: Graph Adjacency List</w:t>
+        <w:t>Run: make &amp;</w:t>
+      </w:r>
+      <w:proofErr w:type="gramStart"/>
+      <w:r>
+        <w:rPr>
+          <w:color w:val="595959"/>
+          <w:sz w:val="18"/>
+          <w:szCs w:val="18"/>
+        </w:rPr>
+        <w:t>&amp; .</w:t>
+      </w:r>
+      <w:proofErr w:type="gramEnd"/>
+      <w:r>
+        <w:rPr>
+          <w:color w:val="595959"/>
+          <w:sz w:val="18"/>
+          <w:szCs w:val="18"/>
+        </w:rPr>
+        <w:t>/</w:t>
+      </w:r>
+      <w:proofErr w:type="spellStart"/>
+      <w:r>
+        <w:rPr>
+          <w:color w:val="595959"/>
+          <w:sz w:val="18"/>
+          <w:szCs w:val="18"/>
+        </w:rPr>
+        <w:t>program_name</w:t>
+      </w:r>
+      <w:proofErr w:type="spellEnd"/>
+      <w:r>
+        <w:rPr>
+          <w:color w:val="595959"/>
+          <w:sz w:val="18"/>
+          <w:szCs w:val="18"/>
+        </w:rPr>
+        <w:t xml:space="preserve"> — then screenshot SECTION 1: Graph Adjacency List</w:t>
+      </w:r>
+    </w:p>
+    <w:p>
+      <w:pPr>
+        <w:spacing w:after="120"/>
+      </w:pPr>
+      <w:r>
+        <w:t>Below are representative edges from the actual implementation used in the code</w:t>
       </w:r>
     </w:p>
     <w:tbl>
@@ -4227,7 +4475,29 @@
                 <w:sz w:val="20"/>
                 <w:szCs w:val="20"/>
               </w:rPr>
-              <w:t>Weight (ms)</w:t>
+              <w:t>Weight (</w:t>
+            </w:r>
+            <w:proofErr w:type="spellStart"/>
+            <w:r>
+              <w:rPr>
+                <w:b/>
+                <w:bCs/>
+                <w:color w:val="FFFFFF"/>
+                <w:sz w:val="20"/>
+                <w:szCs w:val="20"/>
+              </w:rPr>
+              <w:t>ms</w:t>
+            </w:r>
+            <w:proofErr w:type="spellEnd"/>
+            <w:r>
+              <w:rPr>
+                <w:b/>
+                <w:bCs/>
+                <w:color w:val="FFFFFF"/>
+                <w:sz w:val="20"/>
+                <w:szCs w:val="20"/>
+              </w:rPr>
+              <w:t>)</w:t>
             </w:r>
           </w:p>
         </w:tc>
@@ -4346,7 +4616,7 @@
                 <w:sz w:val="20"/>
                 <w:szCs w:val="20"/>
               </w:rPr>
-              <w:t>2</w:t>
+              <w:t>10</w:t>
             </w:r>
           </w:p>
         </w:tc>
@@ -4373,7 +4643,14 @@
                 <w:sz w:val="20"/>
                 <w:szCs w:val="20"/>
               </w:rPr>
-              <w:t>Core → Core</w:t>
+              <w:t xml:space="preserve">Core → </w:t>
+            </w:r>
+            <w:r>
+              <w:rPr>
+                <w:sz w:val="20"/>
+                <w:szCs w:val="20"/>
+              </w:rPr>
+              <w:t>Edge</w:t>
             </w:r>
           </w:p>
         </w:tc>
@@ -4462,7 +4739,7 @@
                 <w:sz w:val="20"/>
                 <w:szCs w:val="20"/>
               </w:rPr>
-              <w:t>5</w:t>
+              <w:t>15</w:t>
             </w:r>
           </w:p>
         </w:tc>
@@ -4578,7 +4855,7 @@
                 <w:sz w:val="20"/>
                 <w:szCs w:val="20"/>
               </w:rPr>
-              <w:t>8</w:t>
+              <w:t>20</w:t>
             </w:r>
           </w:p>
         </w:tc>
@@ -4694,7 +4971,7 @@
                 <w:sz w:val="20"/>
                 <w:szCs w:val="20"/>
               </w:rPr>
-              <w:t>15</w:t>
+              <w:t>12</w:t>
             </w:r>
           </w:p>
         </w:tc>
@@ -4810,7 +5087,7 @@
                 <w:sz w:val="20"/>
                 <w:szCs w:val="20"/>
               </w:rPr>
-              <w:t>5</w:t>
+              <w:t>18</w:t>
             </w:r>
           </w:p>
         </w:tc>
@@ -5116,12 +5393,21 @@
       <w:r>
         <w:t xml:space="preserve">Time: </w:t>
       </w:r>
+      <w:proofErr w:type="gramStart"/>
       <w:r>
         <w:rPr>
           <w:b/>
           <w:bCs/>
         </w:rPr>
-        <w:t>O(V + E)</w:t>
+        <w:t>O(</w:t>
+      </w:r>
+      <w:proofErr w:type="gramEnd"/>
+      <w:r>
+        <w:rPr>
+          <w:b/>
+          <w:bCs/>
+        </w:rPr>
+        <w:t>V + E)</w:t>
       </w:r>
       <w:r>
         <w:t xml:space="preserve"> </w:t>
@@ -5324,33 +5610,97 @@
             </w:tcMar>
           </w:tcPr>
           <w:p>
-            <w:r>
-              <w:rPr>
-                <w:rFonts w:ascii="Courier New" w:eastAsia="Courier New" w:hAnsi="Courier New" w:cs="Courier New"/>
-                <w:sz w:val="18"/>
-                <w:szCs w:val="18"/>
-              </w:rPr>
-              <w:t>BFS(Graph G, source s):</w:t>
-            </w:r>
-          </w:p>
-          <w:p>
-            <w:r>
-              <w:rPr>
-                <w:rFonts w:ascii="Courier New" w:eastAsia="Courier New" w:hAnsi="Courier New" w:cs="Courier New"/>
-                <w:sz w:val="18"/>
-                <w:szCs w:val="18"/>
-              </w:rPr>
-              <w:t xml:space="preserve">  dist[v] = -1  for all v in V        // -1 = unvisited</w:t>
-            </w:r>
-          </w:p>
-          <w:p>
-            <w:r>
-              <w:rPr>
-                <w:rFonts w:ascii="Courier New" w:eastAsia="Courier New" w:hAnsi="Courier New" w:cs="Courier New"/>
-                <w:sz w:val="18"/>
-                <w:szCs w:val="18"/>
-              </w:rPr>
-              <w:t xml:space="preserve">  dist[s] = 0</w:t>
+            <w:proofErr w:type="gramStart"/>
+            <w:r>
+              <w:rPr>
+                <w:rFonts w:ascii="Courier New" w:eastAsia="Courier New" w:hAnsi="Courier New" w:cs="Courier New"/>
+                <w:sz w:val="18"/>
+                <w:szCs w:val="18"/>
+              </w:rPr>
+              <w:t>BFS(</w:t>
+            </w:r>
+            <w:proofErr w:type="gramEnd"/>
+            <w:r>
+              <w:rPr>
+                <w:rFonts w:ascii="Courier New" w:eastAsia="Courier New" w:hAnsi="Courier New" w:cs="Courier New"/>
+                <w:sz w:val="18"/>
+                <w:szCs w:val="18"/>
+              </w:rPr>
+              <w:t>Graph G, source s):</w:t>
+            </w:r>
+          </w:p>
+          <w:p>
+            <w:r>
+              <w:rPr>
+                <w:rFonts w:ascii="Courier New" w:eastAsia="Courier New" w:hAnsi="Courier New" w:cs="Courier New"/>
+                <w:sz w:val="18"/>
+                <w:szCs w:val="18"/>
+              </w:rPr>
+              <w:t xml:space="preserve">  </w:t>
+            </w:r>
+            <w:proofErr w:type="spellStart"/>
+            <w:r>
+              <w:rPr>
+                <w:rFonts w:ascii="Courier New" w:eastAsia="Courier New" w:hAnsi="Courier New" w:cs="Courier New"/>
+                <w:sz w:val="18"/>
+                <w:szCs w:val="18"/>
+              </w:rPr>
+              <w:t>dist</w:t>
+            </w:r>
+            <w:proofErr w:type="spellEnd"/>
+            <w:r>
+              <w:rPr>
+                <w:rFonts w:ascii="Courier New" w:eastAsia="Courier New" w:hAnsi="Courier New" w:cs="Courier New"/>
+                <w:sz w:val="18"/>
+                <w:szCs w:val="18"/>
+              </w:rPr>
+              <w:t>[v] = -</w:t>
+            </w:r>
+            <w:proofErr w:type="gramStart"/>
+            <w:r>
+              <w:rPr>
+                <w:rFonts w:ascii="Courier New" w:eastAsia="Courier New" w:hAnsi="Courier New" w:cs="Courier New"/>
+                <w:sz w:val="18"/>
+                <w:szCs w:val="18"/>
+              </w:rPr>
+              <w:t>1  for</w:t>
+            </w:r>
+            <w:proofErr w:type="gramEnd"/>
+            <w:r>
+              <w:rPr>
+                <w:rFonts w:ascii="Courier New" w:eastAsia="Courier New" w:hAnsi="Courier New" w:cs="Courier New"/>
+                <w:sz w:val="18"/>
+                <w:szCs w:val="18"/>
+              </w:rPr>
+              <w:t xml:space="preserve"> all v in V        // -1 = unvisited</w:t>
+            </w:r>
+          </w:p>
+          <w:p>
+            <w:r>
+              <w:rPr>
+                <w:rFonts w:ascii="Courier New" w:eastAsia="Courier New" w:hAnsi="Courier New" w:cs="Courier New"/>
+                <w:sz w:val="18"/>
+                <w:szCs w:val="18"/>
+              </w:rPr>
+              <w:t xml:space="preserve">  </w:t>
+            </w:r>
+            <w:proofErr w:type="spellStart"/>
+            <w:r>
+              <w:rPr>
+                <w:rFonts w:ascii="Courier New" w:eastAsia="Courier New" w:hAnsi="Courier New" w:cs="Courier New"/>
+                <w:sz w:val="18"/>
+                <w:szCs w:val="18"/>
+              </w:rPr>
+              <w:t>dist</w:t>
+            </w:r>
+            <w:proofErr w:type="spellEnd"/>
+            <w:r>
+              <w:rPr>
+                <w:rFonts w:ascii="Courier New" w:eastAsia="Courier New" w:hAnsi="Courier New" w:cs="Courier New"/>
+                <w:sz w:val="18"/>
+                <w:szCs w:val="18"/>
+              </w:rPr>
+              <w:t>[s] = 0</w:t>
             </w:r>
           </w:p>
           <w:p>
@@ -5400,17 +5750,71 @@
                 <w:sz w:val="18"/>
                 <w:szCs w:val="18"/>
               </w:rPr>
-              <w:t xml:space="preserve">      if dist[v] == -1:</w:t>
-            </w:r>
-          </w:p>
-          <w:p>
-            <w:r>
-              <w:rPr>
-                <w:rFonts w:ascii="Courier New" w:eastAsia="Courier New" w:hAnsi="Courier New" w:cs="Courier New"/>
-                <w:sz w:val="18"/>
-                <w:szCs w:val="18"/>
-              </w:rPr>
-              <w:t xml:space="preserve">        dist[v] = dist[u] + 1</w:t>
+              <w:t xml:space="preserve">      if </w:t>
+            </w:r>
+            <w:proofErr w:type="spellStart"/>
+            <w:r>
+              <w:rPr>
+                <w:rFonts w:ascii="Courier New" w:eastAsia="Courier New" w:hAnsi="Courier New" w:cs="Courier New"/>
+                <w:sz w:val="18"/>
+                <w:szCs w:val="18"/>
+              </w:rPr>
+              <w:t>dist</w:t>
+            </w:r>
+            <w:proofErr w:type="spellEnd"/>
+            <w:r>
+              <w:rPr>
+                <w:rFonts w:ascii="Courier New" w:eastAsia="Courier New" w:hAnsi="Courier New" w:cs="Courier New"/>
+                <w:sz w:val="18"/>
+                <w:szCs w:val="18"/>
+              </w:rPr>
+              <w:t>[v] == -1:</w:t>
+            </w:r>
+          </w:p>
+          <w:p>
+            <w:r>
+              <w:rPr>
+                <w:rFonts w:ascii="Courier New" w:eastAsia="Courier New" w:hAnsi="Courier New" w:cs="Courier New"/>
+                <w:sz w:val="18"/>
+                <w:szCs w:val="18"/>
+              </w:rPr>
+              <w:t xml:space="preserve">        </w:t>
+            </w:r>
+            <w:proofErr w:type="spellStart"/>
+            <w:r>
+              <w:rPr>
+                <w:rFonts w:ascii="Courier New" w:eastAsia="Courier New" w:hAnsi="Courier New" w:cs="Courier New"/>
+                <w:sz w:val="18"/>
+                <w:szCs w:val="18"/>
+              </w:rPr>
+              <w:t>dist</w:t>
+            </w:r>
+            <w:proofErr w:type="spellEnd"/>
+            <w:r>
+              <w:rPr>
+                <w:rFonts w:ascii="Courier New" w:eastAsia="Courier New" w:hAnsi="Courier New" w:cs="Courier New"/>
+                <w:sz w:val="18"/>
+                <w:szCs w:val="18"/>
+              </w:rPr>
+              <w:t xml:space="preserve">[v] = </w:t>
+            </w:r>
+            <w:proofErr w:type="spellStart"/>
+            <w:r>
+              <w:rPr>
+                <w:rFonts w:ascii="Courier New" w:eastAsia="Courier New" w:hAnsi="Courier New" w:cs="Courier New"/>
+                <w:sz w:val="18"/>
+                <w:szCs w:val="18"/>
+              </w:rPr>
+              <w:t>dist</w:t>
+            </w:r>
+            <w:proofErr w:type="spellEnd"/>
+            <w:r>
+              <w:rPr>
+                <w:rFonts w:ascii="Courier New" w:eastAsia="Courier New" w:hAnsi="Courier New" w:cs="Courier New"/>
+                <w:sz w:val="18"/>
+                <w:szCs w:val="18"/>
+              </w:rPr>
+              <w:t>[u] + 1</w:t>
             </w:r>
           </w:p>
           <w:p>
@@ -5430,7 +5834,25 @@
                 <w:sz w:val="18"/>
                 <w:szCs w:val="18"/>
               </w:rPr>
-              <w:t xml:space="preserve">        enqueue(Q, v)</w:t>
+              <w:t xml:space="preserve">        </w:t>
+            </w:r>
+            <w:proofErr w:type="gramStart"/>
+            <w:r>
+              <w:rPr>
+                <w:rFonts w:ascii="Courier New" w:eastAsia="Courier New" w:hAnsi="Courier New" w:cs="Courier New"/>
+                <w:sz w:val="18"/>
+                <w:szCs w:val="18"/>
+              </w:rPr>
+              <w:t>enqueue(</w:t>
+            </w:r>
+            <w:proofErr w:type="gramEnd"/>
+            <w:r>
+              <w:rPr>
+                <w:rFonts w:ascii="Courier New" w:eastAsia="Courier New" w:hAnsi="Courier New" w:cs="Courier New"/>
+                <w:sz w:val="18"/>
+                <w:szCs w:val="18"/>
+              </w:rPr>
+              <w:t>Q, v)</w:t>
             </w:r>
           </w:p>
         </w:tc>
@@ -5468,12 +5890,21 @@
       <w:r>
         <w:t xml:space="preserve">Time: </w:t>
       </w:r>
+      <w:proofErr w:type="gramStart"/>
       <w:r>
         <w:rPr>
           <w:b/>
           <w:bCs/>
         </w:rPr>
-        <w:t>O(V + E)</w:t>
+        <w:t>O(</w:t>
+      </w:r>
+      <w:proofErr w:type="gramEnd"/>
+      <w:r>
+        <w:rPr>
+          <w:b/>
+          <w:bCs/>
+        </w:rPr>
+        <w:t>V + E)</w:t>
       </w:r>
       <w:r>
         <w:t xml:space="preserve"> </w:t>
@@ -5621,44 +6052,100 @@
             </w:tcMar>
           </w:tcPr>
           <w:p>
-            <w:r>
-              <w:rPr>
-                <w:rFonts w:ascii="Courier New" w:eastAsia="Courier New" w:hAnsi="Courier New" w:cs="Courier New"/>
-                <w:sz w:val="18"/>
-                <w:szCs w:val="18"/>
-              </w:rPr>
-              <w:t>DFS(Graph G, source s):</w:t>
-            </w:r>
-          </w:p>
-          <w:p>
-            <w:r>
-              <w:rPr>
-                <w:rFonts w:ascii="Courier New" w:eastAsia="Courier New" w:hAnsi="Courier New" w:cs="Courier New"/>
-                <w:sz w:val="18"/>
-                <w:szCs w:val="18"/>
-              </w:rPr>
-              <w:t xml:space="preserve">  visited[v] = false  for all v in V</w:t>
-            </w:r>
-          </w:p>
-          <w:p>
-            <w:r>
-              <w:rPr>
-                <w:rFonts w:ascii="Courier New" w:eastAsia="Courier New" w:hAnsi="Courier New" w:cs="Courier New"/>
-                <w:sz w:val="18"/>
-                <w:szCs w:val="18"/>
-              </w:rPr>
-              <w:t xml:space="preserve">  DFS_Visit(s)</w:t>
+            <w:proofErr w:type="gramStart"/>
+            <w:r>
+              <w:rPr>
+                <w:rFonts w:ascii="Courier New" w:eastAsia="Courier New" w:hAnsi="Courier New" w:cs="Courier New"/>
+                <w:sz w:val="18"/>
+                <w:szCs w:val="18"/>
+              </w:rPr>
+              <w:t>DFS(</w:t>
+            </w:r>
+            <w:proofErr w:type="gramEnd"/>
+            <w:r>
+              <w:rPr>
+                <w:rFonts w:ascii="Courier New" w:eastAsia="Courier New" w:hAnsi="Courier New" w:cs="Courier New"/>
+                <w:sz w:val="18"/>
+                <w:szCs w:val="18"/>
+              </w:rPr>
+              <w:t>Graph G, source s):</w:t>
+            </w:r>
+          </w:p>
+          <w:p>
+            <w:r>
+              <w:rPr>
+                <w:rFonts w:ascii="Courier New" w:eastAsia="Courier New" w:hAnsi="Courier New" w:cs="Courier New"/>
+                <w:sz w:val="18"/>
+                <w:szCs w:val="18"/>
+              </w:rPr>
+              <w:t xml:space="preserve">  visited[v] = </w:t>
+            </w:r>
+            <w:proofErr w:type="gramStart"/>
+            <w:r>
+              <w:rPr>
+                <w:rFonts w:ascii="Courier New" w:eastAsia="Courier New" w:hAnsi="Courier New" w:cs="Courier New"/>
+                <w:sz w:val="18"/>
+                <w:szCs w:val="18"/>
+              </w:rPr>
+              <w:t>false  for</w:t>
+            </w:r>
+            <w:proofErr w:type="gramEnd"/>
+            <w:r>
+              <w:rPr>
+                <w:rFonts w:ascii="Courier New" w:eastAsia="Courier New" w:hAnsi="Courier New" w:cs="Courier New"/>
+                <w:sz w:val="18"/>
+                <w:szCs w:val="18"/>
+              </w:rPr>
+              <w:t xml:space="preserve"> all v in V</w:t>
+            </w:r>
+          </w:p>
+          <w:p>
+            <w:r>
+              <w:rPr>
+                <w:rFonts w:ascii="Courier New" w:eastAsia="Courier New" w:hAnsi="Courier New" w:cs="Courier New"/>
+                <w:sz w:val="18"/>
+                <w:szCs w:val="18"/>
+              </w:rPr>
+              <w:t xml:space="preserve">  </w:t>
+            </w:r>
+            <w:proofErr w:type="spellStart"/>
+            <w:r>
+              <w:rPr>
+                <w:rFonts w:ascii="Courier New" w:eastAsia="Courier New" w:hAnsi="Courier New" w:cs="Courier New"/>
+                <w:sz w:val="18"/>
+                <w:szCs w:val="18"/>
+              </w:rPr>
+              <w:t>DFS_Visit</w:t>
+            </w:r>
+            <w:proofErr w:type="spellEnd"/>
+            <w:r>
+              <w:rPr>
+                <w:rFonts w:ascii="Courier New" w:eastAsia="Courier New" w:hAnsi="Courier New" w:cs="Courier New"/>
+                <w:sz w:val="18"/>
+                <w:szCs w:val="18"/>
+              </w:rPr>
+              <w:t>(s)</w:t>
             </w:r>
           </w:p>
           <w:p/>
           <w:p>
-            <w:r>
-              <w:rPr>
-                <w:rFonts w:ascii="Courier New" w:eastAsia="Courier New" w:hAnsi="Courier New" w:cs="Courier New"/>
-                <w:sz w:val="18"/>
-                <w:szCs w:val="18"/>
-              </w:rPr>
-              <w:t>DFS_Visit(u):</w:t>
+            <w:proofErr w:type="spellStart"/>
+            <w:r>
+              <w:rPr>
+                <w:rFonts w:ascii="Courier New" w:eastAsia="Courier New" w:hAnsi="Courier New" w:cs="Courier New"/>
+                <w:sz w:val="18"/>
+                <w:szCs w:val="18"/>
+              </w:rPr>
+              <w:t>DFS_Visit</w:t>
+            </w:r>
+            <w:proofErr w:type="spellEnd"/>
+            <w:r>
+              <w:rPr>
+                <w:rFonts w:ascii="Courier New" w:eastAsia="Courier New" w:hAnsi="Courier New" w:cs="Courier New"/>
+                <w:sz w:val="18"/>
+                <w:szCs w:val="18"/>
+              </w:rPr>
+              <w:t>(u):</w:t>
             </w:r>
           </w:p>
           <w:p>
@@ -5709,7 +6196,25 @@
                 <w:sz w:val="18"/>
                 <w:szCs w:val="18"/>
               </w:rPr>
-              <w:t xml:space="preserve">      DFS_Visit(v)</w:t>
+              <w:t xml:space="preserve">      </w:t>
+            </w:r>
+            <w:proofErr w:type="spellStart"/>
+            <w:r>
+              <w:rPr>
+                <w:rFonts w:ascii="Courier New" w:eastAsia="Courier New" w:hAnsi="Courier New" w:cs="Courier New"/>
+                <w:sz w:val="18"/>
+                <w:szCs w:val="18"/>
+              </w:rPr>
+              <w:t>DFS_Visit</w:t>
+            </w:r>
+            <w:proofErr w:type="spellEnd"/>
+            <w:r>
+              <w:rPr>
+                <w:rFonts w:ascii="Courier New" w:eastAsia="Courier New" w:hAnsi="Courier New" w:cs="Courier New"/>
+                <w:sz w:val="18"/>
+                <w:szCs w:val="18"/>
+              </w:rPr>
+              <w:t>(v)</w:t>
             </w:r>
           </w:p>
         </w:tc>
@@ -5747,12 +6252,21 @@
       <w:r>
         <w:t xml:space="preserve">Time: </w:t>
       </w:r>
+      <w:proofErr w:type="gramStart"/>
       <w:r>
         <w:rPr>
           <w:b/>
           <w:bCs/>
         </w:rPr>
-        <w:t>O((V + E) log V)</w:t>
+        <w:t>O(</w:t>
+      </w:r>
+      <w:proofErr w:type="gramEnd"/>
+      <w:r>
+        <w:rPr>
+          <w:b/>
+          <w:bCs/>
+        </w:rPr>
+        <w:t>(V + E) log V)</w:t>
       </w:r>
       <w:r>
         <w:t xml:space="preserve"> </w:t>
@@ -5785,7 +6299,15 @@
         <w:spacing w:after="120"/>
       </w:pPr>
       <w:r>
-        <w:t>It works great as long as there are no negative weights.</w:t>
+        <w:t xml:space="preserve">It works great </w:t>
+      </w:r>
+      <w:proofErr w:type="gramStart"/>
+      <w:r>
+        <w:t>as long as</w:t>
+      </w:r>
+      <w:proofErr w:type="gramEnd"/>
+      <w:r>
+        <w:t xml:space="preserve"> there are no negative weights.</w:t>
       </w:r>
     </w:p>
     <w:p>
@@ -5939,44 +6461,154 @@
             </w:tcMar>
           </w:tcPr>
           <w:p>
-            <w:r>
-              <w:rPr>
-                <w:rFonts w:ascii="Courier New" w:eastAsia="Courier New" w:hAnsi="Courier New" w:cs="Courier New"/>
-                <w:sz w:val="18"/>
-                <w:szCs w:val="18"/>
-              </w:rPr>
-              <w:t>Dijkstra(Graph G, source s):</w:t>
-            </w:r>
-          </w:p>
-          <w:p>
-            <w:r>
-              <w:rPr>
-                <w:rFonts w:ascii="Courier New" w:eastAsia="Courier New" w:hAnsi="Courier New" w:cs="Courier New"/>
-                <w:sz w:val="18"/>
-                <w:szCs w:val="18"/>
-              </w:rPr>
-              <w:t xml:space="preserve">  dist[v] = ∞  for all v in V</w:t>
-            </w:r>
-          </w:p>
-          <w:p>
-            <w:r>
-              <w:rPr>
-                <w:rFonts w:ascii="Courier New" w:eastAsia="Courier New" w:hAnsi="Courier New" w:cs="Courier New"/>
-                <w:sz w:val="18"/>
-                <w:szCs w:val="18"/>
-              </w:rPr>
-              <w:t xml:space="preserve">  dist[s] = 0</w:t>
-            </w:r>
-          </w:p>
-          <w:p>
-            <w:r>
-              <w:rPr>
-                <w:rFonts w:ascii="Courier New" w:eastAsia="Courier New" w:hAnsi="Courier New" w:cs="Courier New"/>
-                <w:sz w:val="18"/>
-                <w:szCs w:val="18"/>
-              </w:rPr>
-              <w:t xml:space="preserve">  MinHeap Q = {(0, s)}</w:t>
-            </w:r>
+            <w:proofErr w:type="gramStart"/>
+            <w:r>
+              <w:rPr>
+                <w:rFonts w:ascii="Courier New" w:eastAsia="Courier New" w:hAnsi="Courier New" w:cs="Courier New"/>
+                <w:sz w:val="18"/>
+                <w:szCs w:val="18"/>
+              </w:rPr>
+              <w:t>Dijkstra(</w:t>
+            </w:r>
+            <w:proofErr w:type="gramEnd"/>
+            <w:r>
+              <w:rPr>
+                <w:rFonts w:ascii="Courier New" w:eastAsia="Courier New" w:hAnsi="Courier New" w:cs="Courier New"/>
+                <w:sz w:val="18"/>
+                <w:szCs w:val="18"/>
+              </w:rPr>
+              <w:t>Graph G, source s):</w:t>
+            </w:r>
+          </w:p>
+          <w:p>
+            <w:r>
+              <w:rPr>
+                <w:rFonts w:ascii="Courier New" w:eastAsia="Courier New" w:hAnsi="Courier New" w:cs="Courier New"/>
+                <w:sz w:val="18"/>
+                <w:szCs w:val="18"/>
+              </w:rPr>
+              <w:t xml:space="preserve">  </w:t>
+            </w:r>
+            <w:proofErr w:type="spellStart"/>
+            <w:r>
+              <w:rPr>
+                <w:rFonts w:ascii="Courier New" w:eastAsia="Courier New" w:hAnsi="Courier New" w:cs="Courier New"/>
+                <w:sz w:val="18"/>
+                <w:szCs w:val="18"/>
+              </w:rPr>
+              <w:t>dist</w:t>
+            </w:r>
+            <w:proofErr w:type="spellEnd"/>
+            <w:r>
+              <w:rPr>
+                <w:rFonts w:ascii="Courier New" w:eastAsia="Courier New" w:hAnsi="Courier New" w:cs="Courier New"/>
+                <w:sz w:val="18"/>
+                <w:szCs w:val="18"/>
+              </w:rPr>
+              <w:t xml:space="preserve">[v] = </w:t>
+            </w:r>
+            <w:proofErr w:type="gramStart"/>
+            <w:r>
+              <w:rPr>
+                <w:rFonts w:ascii="Courier New" w:eastAsia="Courier New" w:hAnsi="Courier New" w:cs="Courier New"/>
+                <w:sz w:val="18"/>
+                <w:szCs w:val="18"/>
+              </w:rPr>
+              <w:t>∞  for</w:t>
+            </w:r>
+            <w:proofErr w:type="gramEnd"/>
+            <w:r>
+              <w:rPr>
+                <w:rFonts w:ascii="Courier New" w:eastAsia="Courier New" w:hAnsi="Courier New" w:cs="Courier New"/>
+                <w:sz w:val="18"/>
+                <w:szCs w:val="18"/>
+              </w:rPr>
+              <w:t xml:space="preserve"> all v in V</w:t>
+            </w:r>
+          </w:p>
+          <w:p>
+            <w:r>
+              <w:rPr>
+                <w:rFonts w:ascii="Courier New" w:eastAsia="Courier New" w:hAnsi="Courier New" w:cs="Courier New"/>
+                <w:sz w:val="18"/>
+                <w:szCs w:val="18"/>
+              </w:rPr>
+              <w:t xml:space="preserve">  </w:t>
+            </w:r>
+            <w:proofErr w:type="spellStart"/>
+            <w:r>
+              <w:rPr>
+                <w:rFonts w:ascii="Courier New" w:eastAsia="Courier New" w:hAnsi="Courier New" w:cs="Courier New"/>
+                <w:sz w:val="18"/>
+                <w:szCs w:val="18"/>
+              </w:rPr>
+              <w:t>dist</w:t>
+            </w:r>
+            <w:proofErr w:type="spellEnd"/>
+            <w:r>
+              <w:rPr>
+                <w:rFonts w:ascii="Courier New" w:eastAsia="Courier New" w:hAnsi="Courier New" w:cs="Courier New"/>
+                <w:sz w:val="18"/>
+                <w:szCs w:val="18"/>
+              </w:rPr>
+              <w:t>[s] = 0</w:t>
+            </w:r>
+          </w:p>
+          <w:p>
+            <w:r>
+              <w:rPr>
+                <w:rFonts w:ascii="Courier New" w:eastAsia="Courier New" w:hAnsi="Courier New" w:cs="Courier New"/>
+                <w:sz w:val="18"/>
+                <w:szCs w:val="18"/>
+              </w:rPr>
+              <w:t xml:space="preserve">  </w:t>
+            </w:r>
+            <w:proofErr w:type="spellStart"/>
+            <w:r>
+              <w:rPr>
+                <w:rFonts w:ascii="Courier New" w:eastAsia="Courier New" w:hAnsi="Courier New" w:cs="Courier New"/>
+                <w:sz w:val="18"/>
+                <w:szCs w:val="18"/>
+              </w:rPr>
+              <w:t>MinHeap</w:t>
+            </w:r>
+            <w:proofErr w:type="spellEnd"/>
+            <w:r>
+              <w:rPr>
+                <w:rFonts w:ascii="Courier New" w:eastAsia="Courier New" w:hAnsi="Courier New" w:cs="Courier New"/>
+                <w:sz w:val="18"/>
+                <w:szCs w:val="18"/>
+              </w:rPr>
+              <w:t xml:space="preserve"> Q </w:t>
+            </w:r>
+            <w:proofErr w:type="gramStart"/>
+            <w:r>
+              <w:rPr>
+                <w:rFonts w:ascii="Courier New" w:eastAsia="Courier New" w:hAnsi="Courier New" w:cs="Courier New"/>
+                <w:sz w:val="18"/>
+                <w:szCs w:val="18"/>
+              </w:rPr>
+              <w:t>= {(</w:t>
+            </w:r>
+            <w:proofErr w:type="gramEnd"/>
+            <w:r>
+              <w:rPr>
+                <w:rFonts w:ascii="Courier New" w:eastAsia="Courier New" w:hAnsi="Courier New" w:cs="Courier New"/>
+                <w:sz w:val="18"/>
+                <w:szCs w:val="18"/>
+              </w:rPr>
+              <w:t xml:space="preserve">0, </w:t>
+            </w:r>
+            <w:proofErr w:type="gramStart"/>
+            <w:r>
+              <w:rPr>
+                <w:rFonts w:ascii="Courier New" w:eastAsia="Courier New" w:hAnsi="Courier New" w:cs="Courier New"/>
+                <w:sz w:val="18"/>
+                <w:szCs w:val="18"/>
+              </w:rPr>
+              <w:t>s)}</w:t>
+            </w:r>
+            <w:proofErr w:type="gramEnd"/>
           </w:p>
           <w:p>
             <w:r>
@@ -5995,47 +6627,173 @@
                 <w:sz w:val="18"/>
                 <w:szCs w:val="18"/>
               </w:rPr>
-              <w:t xml:space="preserve">    (d, u) = extract_min(Q)</w:t>
-            </w:r>
-          </w:p>
-          <w:p>
-            <w:r>
-              <w:rPr>
-                <w:rFonts w:ascii="Courier New" w:eastAsia="Courier New" w:hAnsi="Courier New" w:cs="Courier New"/>
-                <w:sz w:val="18"/>
-                <w:szCs w:val="18"/>
-              </w:rPr>
-              <w:t xml:space="preserve">    if d &gt; dist[u]: continue          // stale entry</w:t>
-            </w:r>
-          </w:p>
-          <w:p>
-            <w:r>
-              <w:rPr>
-                <w:rFonts w:ascii="Courier New" w:eastAsia="Courier New" w:hAnsi="Courier New" w:cs="Courier New"/>
-                <w:sz w:val="18"/>
-                <w:szCs w:val="18"/>
-              </w:rPr>
-              <w:t xml:space="preserve">    for each edge (u→v, weight w):</w:t>
-            </w:r>
-          </w:p>
-          <w:p>
-            <w:r>
-              <w:rPr>
-                <w:rFonts w:ascii="Courier New" w:eastAsia="Courier New" w:hAnsi="Courier New" w:cs="Courier New"/>
-                <w:sz w:val="18"/>
-                <w:szCs w:val="18"/>
-              </w:rPr>
-              <w:t xml:space="preserve">      if dist[u] + w &lt; dist[v]:</w:t>
-            </w:r>
-          </w:p>
-          <w:p>
-            <w:r>
-              <w:rPr>
-                <w:rFonts w:ascii="Courier New" w:eastAsia="Courier New" w:hAnsi="Courier New" w:cs="Courier New"/>
-                <w:sz w:val="18"/>
-                <w:szCs w:val="18"/>
-              </w:rPr>
-              <w:t xml:space="preserve">        dist[v] = dist[u] + w</w:t>
+              <w:t xml:space="preserve">    (d, u) = </w:t>
+            </w:r>
+            <w:proofErr w:type="spellStart"/>
+            <w:r>
+              <w:rPr>
+                <w:rFonts w:ascii="Courier New" w:eastAsia="Courier New" w:hAnsi="Courier New" w:cs="Courier New"/>
+                <w:sz w:val="18"/>
+                <w:szCs w:val="18"/>
+              </w:rPr>
+              <w:t>extract_min</w:t>
+            </w:r>
+            <w:proofErr w:type="spellEnd"/>
+            <w:r>
+              <w:rPr>
+                <w:rFonts w:ascii="Courier New" w:eastAsia="Courier New" w:hAnsi="Courier New" w:cs="Courier New"/>
+                <w:sz w:val="18"/>
+                <w:szCs w:val="18"/>
+              </w:rPr>
+              <w:t>(Q)</w:t>
+            </w:r>
+          </w:p>
+          <w:p>
+            <w:r>
+              <w:rPr>
+                <w:rFonts w:ascii="Courier New" w:eastAsia="Courier New" w:hAnsi="Courier New" w:cs="Courier New"/>
+                <w:sz w:val="18"/>
+                <w:szCs w:val="18"/>
+              </w:rPr>
+              <w:t xml:space="preserve">    if d &gt; </w:t>
+            </w:r>
+            <w:proofErr w:type="spellStart"/>
+            <w:r>
+              <w:rPr>
+                <w:rFonts w:ascii="Courier New" w:eastAsia="Courier New" w:hAnsi="Courier New" w:cs="Courier New"/>
+                <w:sz w:val="18"/>
+                <w:szCs w:val="18"/>
+              </w:rPr>
+              <w:t>dist</w:t>
+            </w:r>
+            <w:proofErr w:type="spellEnd"/>
+            <w:r>
+              <w:rPr>
+                <w:rFonts w:ascii="Courier New" w:eastAsia="Courier New" w:hAnsi="Courier New" w:cs="Courier New"/>
+                <w:sz w:val="18"/>
+                <w:szCs w:val="18"/>
+              </w:rPr>
+              <w:t>[u]: continue          // stale entry</w:t>
+            </w:r>
+          </w:p>
+          <w:p>
+            <w:r>
+              <w:rPr>
+                <w:rFonts w:ascii="Courier New" w:eastAsia="Courier New" w:hAnsi="Courier New" w:cs="Courier New"/>
+                <w:sz w:val="18"/>
+                <w:szCs w:val="18"/>
+              </w:rPr>
+              <w:t xml:space="preserve">    for each edge (</w:t>
+            </w:r>
+            <w:proofErr w:type="spellStart"/>
+            <w:r>
+              <w:rPr>
+                <w:rFonts w:ascii="Courier New" w:eastAsia="Courier New" w:hAnsi="Courier New" w:cs="Courier New"/>
+                <w:sz w:val="18"/>
+                <w:szCs w:val="18"/>
+              </w:rPr>
+              <w:t>u→v</w:t>
+            </w:r>
+            <w:proofErr w:type="spellEnd"/>
+            <w:r>
+              <w:rPr>
+                <w:rFonts w:ascii="Courier New" w:eastAsia="Courier New" w:hAnsi="Courier New" w:cs="Courier New"/>
+                <w:sz w:val="18"/>
+                <w:szCs w:val="18"/>
+              </w:rPr>
+              <w:t>, weight w):</w:t>
+            </w:r>
+          </w:p>
+          <w:p>
+            <w:r>
+              <w:rPr>
+                <w:rFonts w:ascii="Courier New" w:eastAsia="Courier New" w:hAnsi="Courier New" w:cs="Courier New"/>
+                <w:sz w:val="18"/>
+                <w:szCs w:val="18"/>
+              </w:rPr>
+              <w:t xml:space="preserve">      if </w:t>
+            </w:r>
+            <w:proofErr w:type="spellStart"/>
+            <w:r>
+              <w:rPr>
+                <w:rFonts w:ascii="Courier New" w:eastAsia="Courier New" w:hAnsi="Courier New" w:cs="Courier New"/>
+                <w:sz w:val="18"/>
+                <w:szCs w:val="18"/>
+              </w:rPr>
+              <w:t>dist</w:t>
+            </w:r>
+            <w:proofErr w:type="spellEnd"/>
+            <w:r>
+              <w:rPr>
+                <w:rFonts w:ascii="Courier New" w:eastAsia="Courier New" w:hAnsi="Courier New" w:cs="Courier New"/>
+                <w:sz w:val="18"/>
+                <w:szCs w:val="18"/>
+              </w:rPr>
+              <w:t xml:space="preserve">[u] + w &lt; </w:t>
+            </w:r>
+            <w:proofErr w:type="spellStart"/>
+            <w:r>
+              <w:rPr>
+                <w:rFonts w:ascii="Courier New" w:eastAsia="Courier New" w:hAnsi="Courier New" w:cs="Courier New"/>
+                <w:sz w:val="18"/>
+                <w:szCs w:val="18"/>
+              </w:rPr>
+              <w:t>dist</w:t>
+            </w:r>
+            <w:proofErr w:type="spellEnd"/>
+            <w:r>
+              <w:rPr>
+                <w:rFonts w:ascii="Courier New" w:eastAsia="Courier New" w:hAnsi="Courier New" w:cs="Courier New"/>
+                <w:sz w:val="18"/>
+                <w:szCs w:val="18"/>
+              </w:rPr>
+              <w:t>[v]:</w:t>
+            </w:r>
+          </w:p>
+          <w:p>
+            <w:r>
+              <w:rPr>
+                <w:rFonts w:ascii="Courier New" w:eastAsia="Courier New" w:hAnsi="Courier New" w:cs="Courier New"/>
+                <w:sz w:val="18"/>
+                <w:szCs w:val="18"/>
+              </w:rPr>
+              <w:t xml:space="preserve">        </w:t>
+            </w:r>
+            <w:proofErr w:type="spellStart"/>
+            <w:r>
+              <w:rPr>
+                <w:rFonts w:ascii="Courier New" w:eastAsia="Courier New" w:hAnsi="Courier New" w:cs="Courier New"/>
+                <w:sz w:val="18"/>
+                <w:szCs w:val="18"/>
+              </w:rPr>
+              <w:t>dist</w:t>
+            </w:r>
+            <w:proofErr w:type="spellEnd"/>
+            <w:r>
+              <w:rPr>
+                <w:rFonts w:ascii="Courier New" w:eastAsia="Courier New" w:hAnsi="Courier New" w:cs="Courier New"/>
+                <w:sz w:val="18"/>
+                <w:szCs w:val="18"/>
+              </w:rPr>
+              <w:t xml:space="preserve">[v] = </w:t>
+            </w:r>
+            <w:proofErr w:type="spellStart"/>
+            <w:r>
+              <w:rPr>
+                <w:rFonts w:ascii="Courier New" w:eastAsia="Courier New" w:hAnsi="Courier New" w:cs="Courier New"/>
+                <w:sz w:val="18"/>
+                <w:szCs w:val="18"/>
+              </w:rPr>
+              <w:t>dist</w:t>
+            </w:r>
+            <w:proofErr w:type="spellEnd"/>
+            <w:r>
+              <w:rPr>
+                <w:rFonts w:ascii="Courier New" w:eastAsia="Courier New" w:hAnsi="Courier New" w:cs="Courier New"/>
+                <w:sz w:val="18"/>
+                <w:szCs w:val="18"/>
+              </w:rPr>
+              <w:t>[u] + w</w:t>
             </w:r>
           </w:p>
           <w:p>
@@ -6055,7 +6813,43 @@
                 <w:sz w:val="18"/>
                 <w:szCs w:val="18"/>
               </w:rPr>
-              <w:t xml:space="preserve">        insert(Q, (dist[v], v))</w:t>
+              <w:t xml:space="preserve">        </w:t>
+            </w:r>
+            <w:proofErr w:type="gramStart"/>
+            <w:r>
+              <w:rPr>
+                <w:rFonts w:ascii="Courier New" w:eastAsia="Courier New" w:hAnsi="Courier New" w:cs="Courier New"/>
+                <w:sz w:val="18"/>
+                <w:szCs w:val="18"/>
+              </w:rPr>
+              <w:t>insert(</w:t>
+            </w:r>
+            <w:proofErr w:type="gramEnd"/>
+            <w:r>
+              <w:rPr>
+                <w:rFonts w:ascii="Courier New" w:eastAsia="Courier New" w:hAnsi="Courier New" w:cs="Courier New"/>
+                <w:sz w:val="18"/>
+                <w:szCs w:val="18"/>
+              </w:rPr>
+              <w:t>Q, (</w:t>
+            </w:r>
+            <w:proofErr w:type="spellStart"/>
+            <w:r>
+              <w:rPr>
+                <w:rFonts w:ascii="Courier New" w:eastAsia="Courier New" w:hAnsi="Courier New" w:cs="Courier New"/>
+                <w:sz w:val="18"/>
+                <w:szCs w:val="18"/>
+              </w:rPr>
+              <w:t>dist</w:t>
+            </w:r>
+            <w:proofErr w:type="spellEnd"/>
+            <w:r>
+              <w:rPr>
+                <w:rFonts w:ascii="Courier New" w:eastAsia="Courier New" w:hAnsi="Courier New" w:cs="Courier New"/>
+                <w:sz w:val="18"/>
+                <w:szCs w:val="18"/>
+              </w:rPr>
+              <w:t>[v], v))</w:t>
             </w:r>
           </w:p>
         </w:tc>
@@ -6079,7 +6873,15 @@
         <w:spacing w:after="120"/>
       </w:pPr>
       <w:r>
-        <w:t>Bellman-Ford is similar to Dijkstra but more flexible.</w:t>
+        <w:t xml:space="preserve">Bellman-Ford is </w:t>
+      </w:r>
+      <w:proofErr w:type="gramStart"/>
+      <w:r>
+        <w:t>similar to</w:t>
+      </w:r>
+      <w:proofErr w:type="gramEnd"/>
+      <w:r>
+        <w:t xml:space="preserve"> Dijkstra but more flexible.</w:t>
       </w:r>
     </w:p>
     <w:p>
@@ -6093,12 +6895,21 @@
       <w:r>
         <w:t xml:space="preserve">Time: </w:t>
       </w:r>
+      <w:proofErr w:type="gramStart"/>
       <w:r>
         <w:rPr>
           <w:b/>
           <w:bCs/>
         </w:rPr>
-        <w:t>O(V × E)</w:t>
+        <w:t>O(</w:t>
+      </w:r>
+      <w:proofErr w:type="gramEnd"/>
+      <w:r>
+        <w:rPr>
+          <w:b/>
+          <w:bCs/>
+        </w:rPr>
+        <w:t>V × E)</w:t>
       </w:r>
       <w:r>
         <w:t xml:space="preserve"> </w:t>
@@ -6313,73 +7124,255 @@
             </w:tcMar>
           </w:tcPr>
           <w:p>
-            <w:r>
-              <w:rPr>
-                <w:rFonts w:ascii="Courier New" w:eastAsia="Courier New" w:hAnsi="Courier New" w:cs="Courier New"/>
-                <w:sz w:val="18"/>
-                <w:szCs w:val="18"/>
-              </w:rPr>
-              <w:t>BellmanFord(Graph G, source s):</w:t>
-            </w:r>
-          </w:p>
-          <w:p>
-            <w:r>
-              <w:rPr>
-                <w:rFonts w:ascii="Courier New" w:eastAsia="Courier New" w:hAnsi="Courier New" w:cs="Courier New"/>
-                <w:sz w:val="18"/>
-                <w:szCs w:val="18"/>
-              </w:rPr>
-              <w:t xml:space="preserve">  dist[v] = ∞  for all v in V</w:t>
-            </w:r>
-          </w:p>
-          <w:p>
-            <w:r>
-              <w:rPr>
-                <w:rFonts w:ascii="Courier New" w:eastAsia="Courier New" w:hAnsi="Courier New" w:cs="Courier New"/>
-                <w:sz w:val="18"/>
-                <w:szCs w:val="18"/>
-              </w:rPr>
-              <w:t xml:space="preserve">  dist[s] = 0</w:t>
-            </w:r>
-          </w:p>
-          <w:p>
-            <w:r>
-              <w:rPr>
-                <w:rFonts w:ascii="Courier New" w:eastAsia="Courier New" w:hAnsi="Courier New" w:cs="Courier New"/>
-                <w:sz w:val="18"/>
-                <w:szCs w:val="18"/>
-              </w:rPr>
-              <w:t xml:space="preserve">  for i = 1 to V-1:</w:t>
-            </w:r>
-          </w:p>
-          <w:p>
-            <w:r>
-              <w:rPr>
-                <w:rFonts w:ascii="Courier New" w:eastAsia="Courier New" w:hAnsi="Courier New" w:cs="Courier New"/>
-                <w:sz w:val="18"/>
-                <w:szCs w:val="18"/>
-              </w:rPr>
-              <w:t xml:space="preserve">    for each edge (u→v, weight w) in E:</w:t>
-            </w:r>
-          </w:p>
-          <w:p>
-            <w:r>
-              <w:rPr>
-                <w:rFonts w:ascii="Courier New" w:eastAsia="Courier New" w:hAnsi="Courier New" w:cs="Courier New"/>
-                <w:sz w:val="18"/>
-                <w:szCs w:val="18"/>
-              </w:rPr>
-              <w:t xml:space="preserve">      if dist[u] + w &lt; dist[v]:</w:t>
-            </w:r>
-          </w:p>
-          <w:p>
-            <w:r>
-              <w:rPr>
-                <w:rFonts w:ascii="Courier New" w:eastAsia="Courier New" w:hAnsi="Courier New" w:cs="Courier New"/>
-                <w:sz w:val="18"/>
-                <w:szCs w:val="18"/>
-              </w:rPr>
-              <w:t xml:space="preserve">        dist[v] = dist[u] + w</w:t>
+            <w:proofErr w:type="spellStart"/>
+            <w:proofErr w:type="gramStart"/>
+            <w:r>
+              <w:rPr>
+                <w:rFonts w:ascii="Courier New" w:eastAsia="Courier New" w:hAnsi="Courier New" w:cs="Courier New"/>
+                <w:sz w:val="18"/>
+                <w:szCs w:val="18"/>
+              </w:rPr>
+              <w:t>BellmanFord</w:t>
+            </w:r>
+            <w:proofErr w:type="spellEnd"/>
+            <w:r>
+              <w:rPr>
+                <w:rFonts w:ascii="Courier New" w:eastAsia="Courier New" w:hAnsi="Courier New" w:cs="Courier New"/>
+                <w:sz w:val="18"/>
+                <w:szCs w:val="18"/>
+              </w:rPr>
+              <w:t>(</w:t>
+            </w:r>
+            <w:proofErr w:type="gramEnd"/>
+            <w:r>
+              <w:rPr>
+                <w:rFonts w:ascii="Courier New" w:eastAsia="Courier New" w:hAnsi="Courier New" w:cs="Courier New"/>
+                <w:sz w:val="18"/>
+                <w:szCs w:val="18"/>
+              </w:rPr>
+              <w:t>Graph G, source s):</w:t>
+            </w:r>
+          </w:p>
+          <w:p>
+            <w:r>
+              <w:rPr>
+                <w:rFonts w:ascii="Courier New" w:eastAsia="Courier New" w:hAnsi="Courier New" w:cs="Courier New"/>
+                <w:sz w:val="18"/>
+                <w:szCs w:val="18"/>
+              </w:rPr>
+              <w:t xml:space="preserve">  </w:t>
+            </w:r>
+            <w:proofErr w:type="spellStart"/>
+            <w:r>
+              <w:rPr>
+                <w:rFonts w:ascii="Courier New" w:eastAsia="Courier New" w:hAnsi="Courier New" w:cs="Courier New"/>
+                <w:sz w:val="18"/>
+                <w:szCs w:val="18"/>
+              </w:rPr>
+              <w:t>dist</w:t>
+            </w:r>
+            <w:proofErr w:type="spellEnd"/>
+            <w:r>
+              <w:rPr>
+                <w:rFonts w:ascii="Courier New" w:eastAsia="Courier New" w:hAnsi="Courier New" w:cs="Courier New"/>
+                <w:sz w:val="18"/>
+                <w:szCs w:val="18"/>
+              </w:rPr>
+              <w:t xml:space="preserve">[v] = </w:t>
+            </w:r>
+            <w:proofErr w:type="gramStart"/>
+            <w:r>
+              <w:rPr>
+                <w:rFonts w:ascii="Courier New" w:eastAsia="Courier New" w:hAnsi="Courier New" w:cs="Courier New"/>
+                <w:sz w:val="18"/>
+                <w:szCs w:val="18"/>
+              </w:rPr>
+              <w:t>∞  for</w:t>
+            </w:r>
+            <w:proofErr w:type="gramEnd"/>
+            <w:r>
+              <w:rPr>
+                <w:rFonts w:ascii="Courier New" w:eastAsia="Courier New" w:hAnsi="Courier New" w:cs="Courier New"/>
+                <w:sz w:val="18"/>
+                <w:szCs w:val="18"/>
+              </w:rPr>
+              <w:t xml:space="preserve"> all v in V</w:t>
+            </w:r>
+          </w:p>
+          <w:p>
+            <w:r>
+              <w:rPr>
+                <w:rFonts w:ascii="Courier New" w:eastAsia="Courier New" w:hAnsi="Courier New" w:cs="Courier New"/>
+                <w:sz w:val="18"/>
+                <w:szCs w:val="18"/>
+              </w:rPr>
+              <w:t xml:space="preserve">  </w:t>
+            </w:r>
+            <w:proofErr w:type="spellStart"/>
+            <w:r>
+              <w:rPr>
+                <w:rFonts w:ascii="Courier New" w:eastAsia="Courier New" w:hAnsi="Courier New" w:cs="Courier New"/>
+                <w:sz w:val="18"/>
+                <w:szCs w:val="18"/>
+              </w:rPr>
+              <w:t>dist</w:t>
+            </w:r>
+            <w:proofErr w:type="spellEnd"/>
+            <w:r>
+              <w:rPr>
+                <w:rFonts w:ascii="Courier New" w:eastAsia="Courier New" w:hAnsi="Courier New" w:cs="Courier New"/>
+                <w:sz w:val="18"/>
+                <w:szCs w:val="18"/>
+              </w:rPr>
+              <w:t>[s] = 0</w:t>
+            </w:r>
+          </w:p>
+          <w:p>
+            <w:r>
+              <w:rPr>
+                <w:rFonts w:ascii="Courier New" w:eastAsia="Courier New" w:hAnsi="Courier New" w:cs="Courier New"/>
+                <w:sz w:val="18"/>
+                <w:szCs w:val="18"/>
+              </w:rPr>
+              <w:t xml:space="preserve">  for </w:t>
+            </w:r>
+            <w:proofErr w:type="spellStart"/>
+            <w:r>
+              <w:rPr>
+                <w:rFonts w:ascii="Courier New" w:eastAsia="Courier New" w:hAnsi="Courier New" w:cs="Courier New"/>
+                <w:sz w:val="18"/>
+                <w:szCs w:val="18"/>
+              </w:rPr>
+              <w:t>i</w:t>
+            </w:r>
+            <w:proofErr w:type="spellEnd"/>
+            <w:r>
+              <w:rPr>
+                <w:rFonts w:ascii="Courier New" w:eastAsia="Courier New" w:hAnsi="Courier New" w:cs="Courier New"/>
+                <w:sz w:val="18"/>
+                <w:szCs w:val="18"/>
+              </w:rPr>
+              <w:t xml:space="preserve"> = 1 to V-1:</w:t>
+            </w:r>
+          </w:p>
+          <w:p>
+            <w:r>
+              <w:rPr>
+                <w:rFonts w:ascii="Courier New" w:eastAsia="Courier New" w:hAnsi="Courier New" w:cs="Courier New"/>
+                <w:sz w:val="18"/>
+                <w:szCs w:val="18"/>
+              </w:rPr>
+              <w:t xml:space="preserve">    for each edge (</w:t>
+            </w:r>
+            <w:proofErr w:type="spellStart"/>
+            <w:r>
+              <w:rPr>
+                <w:rFonts w:ascii="Courier New" w:eastAsia="Courier New" w:hAnsi="Courier New" w:cs="Courier New"/>
+                <w:sz w:val="18"/>
+                <w:szCs w:val="18"/>
+              </w:rPr>
+              <w:t>u→v</w:t>
+            </w:r>
+            <w:proofErr w:type="spellEnd"/>
+            <w:r>
+              <w:rPr>
+                <w:rFonts w:ascii="Courier New" w:eastAsia="Courier New" w:hAnsi="Courier New" w:cs="Courier New"/>
+                <w:sz w:val="18"/>
+                <w:szCs w:val="18"/>
+              </w:rPr>
+              <w:t>, weight w) in E:</w:t>
+            </w:r>
+          </w:p>
+          <w:p>
+            <w:r>
+              <w:rPr>
+                <w:rFonts w:ascii="Courier New" w:eastAsia="Courier New" w:hAnsi="Courier New" w:cs="Courier New"/>
+                <w:sz w:val="18"/>
+                <w:szCs w:val="18"/>
+              </w:rPr>
+              <w:t xml:space="preserve">      if </w:t>
+            </w:r>
+            <w:proofErr w:type="spellStart"/>
+            <w:r>
+              <w:rPr>
+                <w:rFonts w:ascii="Courier New" w:eastAsia="Courier New" w:hAnsi="Courier New" w:cs="Courier New"/>
+                <w:sz w:val="18"/>
+                <w:szCs w:val="18"/>
+              </w:rPr>
+              <w:t>dist</w:t>
+            </w:r>
+            <w:proofErr w:type="spellEnd"/>
+            <w:r>
+              <w:rPr>
+                <w:rFonts w:ascii="Courier New" w:eastAsia="Courier New" w:hAnsi="Courier New" w:cs="Courier New"/>
+                <w:sz w:val="18"/>
+                <w:szCs w:val="18"/>
+              </w:rPr>
+              <w:t xml:space="preserve">[u] + w &lt; </w:t>
+            </w:r>
+            <w:proofErr w:type="spellStart"/>
+            <w:r>
+              <w:rPr>
+                <w:rFonts w:ascii="Courier New" w:eastAsia="Courier New" w:hAnsi="Courier New" w:cs="Courier New"/>
+                <w:sz w:val="18"/>
+                <w:szCs w:val="18"/>
+              </w:rPr>
+              <w:t>dist</w:t>
+            </w:r>
+            <w:proofErr w:type="spellEnd"/>
+            <w:r>
+              <w:rPr>
+                <w:rFonts w:ascii="Courier New" w:eastAsia="Courier New" w:hAnsi="Courier New" w:cs="Courier New"/>
+                <w:sz w:val="18"/>
+                <w:szCs w:val="18"/>
+              </w:rPr>
+              <w:t>[v]:</w:t>
+            </w:r>
+          </w:p>
+          <w:p>
+            <w:r>
+              <w:rPr>
+                <w:rFonts w:ascii="Courier New" w:eastAsia="Courier New" w:hAnsi="Courier New" w:cs="Courier New"/>
+                <w:sz w:val="18"/>
+                <w:szCs w:val="18"/>
+              </w:rPr>
+              <w:t xml:space="preserve">        </w:t>
+            </w:r>
+            <w:proofErr w:type="spellStart"/>
+            <w:r>
+              <w:rPr>
+                <w:rFonts w:ascii="Courier New" w:eastAsia="Courier New" w:hAnsi="Courier New" w:cs="Courier New"/>
+                <w:sz w:val="18"/>
+                <w:szCs w:val="18"/>
+              </w:rPr>
+              <w:t>dist</w:t>
+            </w:r>
+            <w:proofErr w:type="spellEnd"/>
+            <w:r>
+              <w:rPr>
+                <w:rFonts w:ascii="Courier New" w:eastAsia="Courier New" w:hAnsi="Courier New" w:cs="Courier New"/>
+                <w:sz w:val="18"/>
+                <w:szCs w:val="18"/>
+              </w:rPr>
+              <w:t xml:space="preserve">[v] = </w:t>
+            </w:r>
+            <w:proofErr w:type="spellStart"/>
+            <w:r>
+              <w:rPr>
+                <w:rFonts w:ascii="Courier New" w:eastAsia="Courier New" w:hAnsi="Courier New" w:cs="Courier New"/>
+                <w:sz w:val="18"/>
+                <w:szCs w:val="18"/>
+              </w:rPr>
+              <w:t>dist</w:t>
+            </w:r>
+            <w:proofErr w:type="spellEnd"/>
+            <w:r>
+              <w:rPr>
+                <w:rFonts w:ascii="Courier New" w:eastAsia="Courier New" w:hAnsi="Courier New" w:cs="Courier New"/>
+                <w:sz w:val="18"/>
+                <w:szCs w:val="18"/>
+              </w:rPr>
+              <w:t>[u] + w</w:t>
             </w:r>
           </w:p>
           <w:p>
@@ -6399,27 +7392,99 @@
                 <w:sz w:val="18"/>
                 <w:szCs w:val="18"/>
               </w:rPr>
-              <w:t xml:space="preserve">  // Negative cycle detection (V-th relaxation)</w:t>
-            </w:r>
-          </w:p>
-          <w:p>
-            <w:r>
-              <w:rPr>
-                <w:rFonts w:ascii="Courier New" w:eastAsia="Courier New" w:hAnsi="Courier New" w:cs="Courier New"/>
-                <w:sz w:val="18"/>
-                <w:szCs w:val="18"/>
-              </w:rPr>
-              <w:t xml:space="preserve">  for each edge (u→v, weight w) in E:</w:t>
-            </w:r>
-          </w:p>
-          <w:p>
-            <w:r>
-              <w:rPr>
-                <w:rFonts w:ascii="Courier New" w:eastAsia="Courier New" w:hAnsi="Courier New" w:cs="Courier New"/>
-                <w:sz w:val="18"/>
-                <w:szCs w:val="18"/>
-              </w:rPr>
-              <w:t xml:space="preserve">    if dist[u] + w &lt; dist[v]:</w:t>
+              <w:t xml:space="preserve">  // Negative cycle detection (V-</w:t>
+            </w:r>
+            <w:proofErr w:type="spellStart"/>
+            <w:r>
+              <w:rPr>
+                <w:rFonts w:ascii="Courier New" w:eastAsia="Courier New" w:hAnsi="Courier New" w:cs="Courier New"/>
+                <w:sz w:val="18"/>
+                <w:szCs w:val="18"/>
+              </w:rPr>
+              <w:t>th</w:t>
+            </w:r>
+            <w:proofErr w:type="spellEnd"/>
+            <w:r>
+              <w:rPr>
+                <w:rFonts w:ascii="Courier New" w:eastAsia="Courier New" w:hAnsi="Courier New" w:cs="Courier New"/>
+                <w:sz w:val="18"/>
+                <w:szCs w:val="18"/>
+              </w:rPr>
+              <w:t xml:space="preserve"> relaxation)</w:t>
+            </w:r>
+          </w:p>
+          <w:p>
+            <w:r>
+              <w:rPr>
+                <w:rFonts w:ascii="Courier New" w:eastAsia="Courier New" w:hAnsi="Courier New" w:cs="Courier New"/>
+                <w:sz w:val="18"/>
+                <w:szCs w:val="18"/>
+              </w:rPr>
+              <w:t xml:space="preserve">  for each edge (</w:t>
+            </w:r>
+            <w:proofErr w:type="spellStart"/>
+            <w:r>
+              <w:rPr>
+                <w:rFonts w:ascii="Courier New" w:eastAsia="Courier New" w:hAnsi="Courier New" w:cs="Courier New"/>
+                <w:sz w:val="18"/>
+                <w:szCs w:val="18"/>
+              </w:rPr>
+              <w:t>u→v</w:t>
+            </w:r>
+            <w:proofErr w:type="spellEnd"/>
+            <w:r>
+              <w:rPr>
+                <w:rFonts w:ascii="Courier New" w:eastAsia="Courier New" w:hAnsi="Courier New" w:cs="Courier New"/>
+                <w:sz w:val="18"/>
+                <w:szCs w:val="18"/>
+              </w:rPr>
+              <w:t>, weight w) in E:</w:t>
+            </w:r>
+          </w:p>
+          <w:p>
+            <w:r>
+              <w:rPr>
+                <w:rFonts w:ascii="Courier New" w:eastAsia="Courier New" w:hAnsi="Courier New" w:cs="Courier New"/>
+                <w:sz w:val="18"/>
+                <w:szCs w:val="18"/>
+              </w:rPr>
+              <w:t xml:space="preserve">    if </w:t>
+            </w:r>
+            <w:proofErr w:type="spellStart"/>
+            <w:r>
+              <w:rPr>
+                <w:rFonts w:ascii="Courier New" w:eastAsia="Courier New" w:hAnsi="Courier New" w:cs="Courier New"/>
+                <w:sz w:val="18"/>
+                <w:szCs w:val="18"/>
+              </w:rPr>
+              <w:t>dist</w:t>
+            </w:r>
+            <w:proofErr w:type="spellEnd"/>
+            <w:r>
+              <w:rPr>
+                <w:rFonts w:ascii="Courier New" w:eastAsia="Courier New" w:hAnsi="Courier New" w:cs="Courier New"/>
+                <w:sz w:val="18"/>
+                <w:szCs w:val="18"/>
+              </w:rPr>
+              <w:t xml:space="preserve">[u] + w &lt; </w:t>
+            </w:r>
+            <w:proofErr w:type="spellStart"/>
+            <w:r>
+              <w:rPr>
+                <w:rFonts w:ascii="Courier New" w:eastAsia="Courier New" w:hAnsi="Courier New" w:cs="Courier New"/>
+                <w:sz w:val="18"/>
+                <w:szCs w:val="18"/>
+              </w:rPr>
+              <w:t>dist</w:t>
+            </w:r>
+            <w:proofErr w:type="spellEnd"/>
+            <w:r>
+              <w:rPr>
+                <w:rFonts w:ascii="Courier New" w:eastAsia="Courier New" w:hAnsi="Courier New" w:cs="Courier New"/>
+                <w:sz w:val="18"/>
+                <w:szCs w:val="18"/>
+              </w:rPr>
+              <w:t>[v]:</w:t>
             </w:r>
           </w:p>
           <w:p>
@@ -6467,12 +7532,21 @@
       <w:r>
         <w:t xml:space="preserve">Time: </w:t>
       </w:r>
+      <w:proofErr w:type="gramStart"/>
       <w:r>
         <w:rPr>
           <w:b/>
           <w:bCs/>
         </w:rPr>
-        <w:t>O(E log E)</w:t>
+        <w:t>O(</w:t>
+      </w:r>
+      <w:proofErr w:type="gramEnd"/>
+      <w:r>
+        <w:rPr>
+          <w:b/>
+          <w:bCs/>
+        </w:rPr>
+        <w:t>E log E)</w:t>
       </w:r>
       <w:r>
         <w:t xml:space="preserve"> </w:t>
@@ -6726,13 +7800,33 @@
             </w:tcMar>
           </w:tcPr>
           <w:p>
-            <w:r>
-              <w:rPr>
-                <w:rFonts w:ascii="Courier New" w:eastAsia="Courier New" w:hAnsi="Courier New" w:cs="Courier New"/>
-                <w:sz w:val="18"/>
-                <w:szCs w:val="18"/>
-              </w:rPr>
-              <w:t>KruskalMST(Graph G):</w:t>
+            <w:proofErr w:type="spellStart"/>
+            <w:proofErr w:type="gramStart"/>
+            <w:r>
+              <w:rPr>
+                <w:rFonts w:ascii="Courier New" w:eastAsia="Courier New" w:hAnsi="Courier New" w:cs="Courier New"/>
+                <w:sz w:val="18"/>
+                <w:szCs w:val="18"/>
+              </w:rPr>
+              <w:t>KruskalMST</w:t>
+            </w:r>
+            <w:proofErr w:type="spellEnd"/>
+            <w:r>
+              <w:rPr>
+                <w:rFonts w:ascii="Courier New" w:eastAsia="Courier New" w:hAnsi="Courier New" w:cs="Courier New"/>
+                <w:sz w:val="18"/>
+                <w:szCs w:val="18"/>
+              </w:rPr>
+              <w:t>(</w:t>
+            </w:r>
+            <w:proofErr w:type="gramEnd"/>
+            <w:r>
+              <w:rPr>
+                <w:rFonts w:ascii="Courier New" w:eastAsia="Courier New" w:hAnsi="Courier New" w:cs="Courier New"/>
+                <w:sz w:val="18"/>
+                <w:szCs w:val="18"/>
+              </w:rPr>
+              <w:t>Graph G):</w:t>
             </w:r>
           </w:p>
           <w:p>
@@ -6752,7 +7846,25 @@
                 <w:sz w:val="18"/>
                 <w:szCs w:val="18"/>
               </w:rPr>
-              <w:t xml:space="preserve">  Initialize DSU with V components</w:t>
+              <w:t xml:space="preserve">  </w:t>
+            </w:r>
+            <w:proofErr w:type="gramStart"/>
+            <w:r>
+              <w:rPr>
+                <w:rFonts w:ascii="Courier New" w:eastAsia="Courier New" w:hAnsi="Courier New" w:cs="Courier New"/>
+                <w:sz w:val="18"/>
+                <w:szCs w:val="18"/>
+              </w:rPr>
+              <w:t>Initialize</w:t>
+            </w:r>
+            <w:proofErr w:type="gramEnd"/>
+            <w:r>
+              <w:rPr>
+                <w:rFonts w:ascii="Courier New" w:eastAsia="Courier New" w:hAnsi="Courier New" w:cs="Courier New"/>
+                <w:sz w:val="18"/>
+                <w:szCs w:val="18"/>
+              </w:rPr>
+              <w:t xml:space="preserve"> DSU with V components</w:t>
             </w:r>
           </w:p>
           <w:p>
@@ -6792,17 +7904,63 @@
                 <w:sz w:val="18"/>
                 <w:szCs w:val="18"/>
               </w:rPr>
-              <w:t xml:space="preserve">      MST.add(u, v, w)</w:t>
-            </w:r>
-          </w:p>
-          <w:p>
-            <w:r>
-              <w:rPr>
-                <w:rFonts w:ascii="Courier New" w:eastAsia="Courier New" w:hAnsi="Courier New" w:cs="Courier New"/>
-                <w:sz w:val="18"/>
-                <w:szCs w:val="18"/>
-              </w:rPr>
-              <w:t xml:space="preserve">      union(u, v)</w:t>
+              <w:t xml:space="preserve">      </w:t>
+            </w:r>
+            <w:proofErr w:type="spellStart"/>
+            <w:proofErr w:type="gramStart"/>
+            <w:r>
+              <w:rPr>
+                <w:rFonts w:ascii="Courier New" w:eastAsia="Courier New" w:hAnsi="Courier New" w:cs="Courier New"/>
+                <w:sz w:val="18"/>
+                <w:szCs w:val="18"/>
+              </w:rPr>
+              <w:t>MST.add</w:t>
+            </w:r>
+            <w:proofErr w:type="spellEnd"/>
+            <w:r>
+              <w:rPr>
+                <w:rFonts w:ascii="Courier New" w:eastAsia="Courier New" w:hAnsi="Courier New" w:cs="Courier New"/>
+                <w:sz w:val="18"/>
+                <w:szCs w:val="18"/>
+              </w:rPr>
+              <w:t>(</w:t>
+            </w:r>
+            <w:proofErr w:type="gramEnd"/>
+            <w:r>
+              <w:rPr>
+                <w:rFonts w:ascii="Courier New" w:eastAsia="Courier New" w:hAnsi="Courier New" w:cs="Courier New"/>
+                <w:sz w:val="18"/>
+                <w:szCs w:val="18"/>
+              </w:rPr>
+              <w:t>u, v, w)</w:t>
+            </w:r>
+          </w:p>
+          <w:p>
+            <w:r>
+              <w:rPr>
+                <w:rFonts w:ascii="Courier New" w:eastAsia="Courier New" w:hAnsi="Courier New" w:cs="Courier New"/>
+                <w:sz w:val="18"/>
+                <w:szCs w:val="18"/>
+              </w:rPr>
+              <w:t xml:space="preserve">      </w:t>
+            </w:r>
+            <w:proofErr w:type="gramStart"/>
+            <w:r>
+              <w:rPr>
+                <w:rFonts w:ascii="Courier New" w:eastAsia="Courier New" w:hAnsi="Courier New" w:cs="Courier New"/>
+                <w:sz w:val="18"/>
+                <w:szCs w:val="18"/>
+              </w:rPr>
+              <w:t>union(</w:t>
+            </w:r>
+            <w:proofErr w:type="gramEnd"/>
+            <w:r>
+              <w:rPr>
+                <w:rFonts w:ascii="Courier New" w:eastAsia="Courier New" w:hAnsi="Courier New" w:cs="Courier New"/>
+                <w:sz w:val="18"/>
+                <w:szCs w:val="18"/>
+              </w:rPr>
+              <w:t>u, v)</w:t>
             </w:r>
           </w:p>
           <w:p>
@@ -7071,12 +8229,21 @@
             </w:tcMar>
           </w:tcPr>
           <w:p>
-            <w:r>
-              <w:rPr>
-                <w:sz w:val="20"/>
-                <w:szCs w:val="20"/>
-              </w:rPr>
-              <w:t>O(V + E)</w:t>
+            <w:proofErr w:type="gramStart"/>
+            <w:r>
+              <w:rPr>
+                <w:sz w:val="20"/>
+                <w:szCs w:val="20"/>
+              </w:rPr>
+              <w:t>O(</w:t>
+            </w:r>
+            <w:proofErr w:type="gramEnd"/>
+            <w:r>
+              <w:rPr>
+                <w:sz w:val="20"/>
+                <w:szCs w:val="20"/>
+              </w:rPr>
+              <w:t>V + E)</w:t>
             </w:r>
           </w:p>
         </w:tc>
@@ -7214,12 +8381,21 @@
             </w:tcMar>
           </w:tcPr>
           <w:p>
-            <w:r>
-              <w:rPr>
-                <w:sz w:val="20"/>
-                <w:szCs w:val="20"/>
-              </w:rPr>
-              <w:t>O(V + E)</w:t>
+            <w:proofErr w:type="gramStart"/>
+            <w:r>
+              <w:rPr>
+                <w:sz w:val="20"/>
+                <w:szCs w:val="20"/>
+              </w:rPr>
+              <w:t>O(</w:t>
+            </w:r>
+            <w:proofErr w:type="gramEnd"/>
+            <w:r>
+              <w:rPr>
+                <w:sz w:val="20"/>
+                <w:szCs w:val="20"/>
+              </w:rPr>
+              <w:t>V + E)</w:t>
             </w:r>
           </w:p>
         </w:tc>
@@ -7357,12 +8533,21 @@
             </w:tcMar>
           </w:tcPr>
           <w:p>
-            <w:r>
-              <w:rPr>
-                <w:sz w:val="20"/>
-                <w:szCs w:val="20"/>
-              </w:rPr>
-              <w:t>O((V+E) log V)</w:t>
+            <w:proofErr w:type="gramStart"/>
+            <w:r>
+              <w:rPr>
+                <w:sz w:val="20"/>
+                <w:szCs w:val="20"/>
+              </w:rPr>
+              <w:t>O((</w:t>
+            </w:r>
+            <w:proofErr w:type="gramEnd"/>
+            <w:r>
+              <w:rPr>
+                <w:sz w:val="20"/>
+                <w:szCs w:val="20"/>
+              </w:rPr>
+              <w:t>V+E) log V)</w:t>
             </w:r>
           </w:p>
         </w:tc>
@@ -7500,12 +8685,21 @@
             </w:tcMar>
           </w:tcPr>
           <w:p>
-            <w:r>
-              <w:rPr>
-                <w:sz w:val="20"/>
-                <w:szCs w:val="20"/>
-              </w:rPr>
-              <w:t>O(V × E)</w:t>
+            <w:proofErr w:type="gramStart"/>
+            <w:r>
+              <w:rPr>
+                <w:sz w:val="20"/>
+                <w:szCs w:val="20"/>
+              </w:rPr>
+              <w:t>O(</w:t>
+            </w:r>
+            <w:proofErr w:type="gramEnd"/>
+            <w:r>
+              <w:rPr>
+                <w:sz w:val="20"/>
+                <w:szCs w:val="20"/>
+              </w:rPr>
+              <w:t>V × E)</w:t>
             </w:r>
           </w:p>
         </w:tc>
@@ -7643,12 +8837,21 @@
             </w:tcMar>
           </w:tcPr>
           <w:p>
-            <w:r>
-              <w:rPr>
-                <w:sz w:val="20"/>
-                <w:szCs w:val="20"/>
-              </w:rPr>
-              <w:t>O(E log E)</w:t>
+            <w:proofErr w:type="gramStart"/>
+            <w:r>
+              <w:rPr>
+                <w:sz w:val="20"/>
+                <w:szCs w:val="20"/>
+              </w:rPr>
+              <w:t>O(</w:t>
+            </w:r>
+            <w:proofErr w:type="gramEnd"/>
+            <w:r>
+              <w:rPr>
+                <w:sz w:val="20"/>
+                <w:szCs w:val="20"/>
+              </w:rPr>
+              <w:t>E log E)</w:t>
             </w:r>
           </w:p>
         </w:tc>
@@ -7766,7 +8969,31 @@
         <w:spacing w:after="120"/>
       </w:pPr>
       <w:r>
-        <w:t>Dijkstra – O((V+E) log V) time: Each vertex is extracted from the min-heap once (O(V log V)), and each edge may trigger a heap insertion (O(E log V)). With a Fibonacci heap this reduces to O(E + V log V). Space is O(V) for distances and parent arrays plus O(V+E) for the heap.</w:t>
+        <w:t>Dijkstra – O((V+E) log V) time: Each vertex is extracted from the min-heap once (</w:t>
+      </w:r>
+      <w:proofErr w:type="gramStart"/>
+      <w:r>
+        <w:t>O(</w:t>
+      </w:r>
+      <w:proofErr w:type="gramEnd"/>
+      <w:r>
+        <w:t>V log V)), and each edge may trigger a heap insertion (</w:t>
+      </w:r>
+      <w:proofErr w:type="gramStart"/>
+      <w:r>
+        <w:t>O(</w:t>
+      </w:r>
+      <w:proofErr w:type="gramEnd"/>
+      <w:r>
+        <w:t xml:space="preserve">E log V)). With a Fibonacci heap this reduces to </w:t>
+      </w:r>
+      <w:proofErr w:type="gramStart"/>
+      <w:r>
+        <w:t>O(</w:t>
+      </w:r>
+      <w:proofErr w:type="gramEnd"/>
+      <w:r>
+        <w:t>E + V log V). Space is O(V) for distances and parent arrays plus O(V+E) for the heap.</w:t>
       </w:r>
     </w:p>
     <w:p>
@@ -7792,7 +9019,23 @@
         <w:spacing w:after="120"/>
       </w:pPr>
       <w:r>
-        <w:t>Kruskal – O(E log E) time: Dominated by sorting the edge list. Union-Find operations are nearly O(1) amortized with path compression. Space is O(V) for the DSU structure. Best case: sparse graph with few edges; worst case: dense graph with E close to V².</w:t>
+        <w:t xml:space="preserve">Kruskal – </w:t>
+      </w:r>
+      <w:proofErr w:type="gramStart"/>
+      <w:r>
+        <w:t>O(</w:t>
+      </w:r>
+      <w:proofErr w:type="gramEnd"/>
+      <w:r>
+        <w:t xml:space="preserve">E log E) time: Dominated by sorting the edge list. Union-Find operations are nearly </w:t>
+      </w:r>
+      <w:proofErr w:type="gramStart"/>
+      <w:r>
+        <w:t>O(</w:t>
+      </w:r>
+      <w:proofErr w:type="gramEnd"/>
+      <w:r>
+        <w:t>1) amortized with path compression. Space is O(V) for the DSU structure. Best case: sparse graph with few edges; worst case: dense graph with E close to V².</w:t>
       </w:r>
     </w:p>
     <w:p>
@@ -8464,12 +9707,46 @@
             </w:tcMar>
           </w:tcPr>
           <w:p>
-            <w:r>
-              <w:rPr>
-                <w:sz w:val="18"/>
-                <w:szCs w:val="18"/>
-              </w:rPr>
-              <w:t>O((V+E)logV)</w:t>
+            <w:proofErr w:type="gramStart"/>
+            <w:r>
+              <w:rPr>
+                <w:sz w:val="18"/>
+                <w:szCs w:val="18"/>
+              </w:rPr>
+              <w:t>O((</w:t>
+            </w:r>
+            <w:proofErr w:type="gramEnd"/>
+            <w:r>
+              <w:rPr>
+                <w:sz w:val="18"/>
+                <w:szCs w:val="18"/>
+              </w:rPr>
+              <w:t>V+</w:t>
+            </w:r>
+            <w:proofErr w:type="gramStart"/>
+            <w:r>
+              <w:rPr>
+                <w:sz w:val="18"/>
+                <w:szCs w:val="18"/>
+              </w:rPr>
+              <w:t>E)</w:t>
+            </w:r>
+            <w:proofErr w:type="spellStart"/>
+            <w:r>
+              <w:rPr>
+                <w:sz w:val="18"/>
+                <w:szCs w:val="18"/>
+              </w:rPr>
+              <w:t>logV</w:t>
+            </w:r>
+            <w:proofErr w:type="spellEnd"/>
+            <w:proofErr w:type="gramEnd"/>
+            <w:r>
+              <w:rPr>
+                <w:sz w:val="18"/>
+                <w:szCs w:val="18"/>
+              </w:rPr>
+              <w:t>)</w:t>
             </w:r>
           </w:p>
         </w:tc>
@@ -8804,12 +10081,21 @@
             </w:tcMar>
           </w:tcPr>
           <w:p>
-            <w:r>
-              <w:rPr>
-                <w:sz w:val="18"/>
-                <w:szCs w:val="18"/>
-              </w:rPr>
-              <w:t>O(E log E)</w:t>
+            <w:proofErr w:type="gramStart"/>
+            <w:r>
+              <w:rPr>
+                <w:sz w:val="18"/>
+                <w:szCs w:val="18"/>
+              </w:rPr>
+              <w:t>O(</w:t>
+            </w:r>
+            <w:proofErr w:type="gramEnd"/>
+            <w:r>
+              <w:rPr>
+                <w:sz w:val="18"/>
+                <w:szCs w:val="18"/>
+              </w:rPr>
+              <w:t>E log E)</w:t>
             </w:r>
           </w:p>
         </w:tc>
@@ -8933,7 +10219,20 @@
         <w:spacing w:after="120"/>
       </w:pPr>
       <w:r>
-        <w:t>Results were measured using C++ chrono::high_resolution_clock on a 20-router directed graph with 33 edges. As expected, BFS and DFS are fastest due to their O(V+E) linear complexity. Dijkstra is slower than Bellman-Ford on our small dataset due to heap overhead, but Dijkstra scales much better on larger graphs.</w:t>
+        <w:t xml:space="preserve">Results were measured using C++ </w:t>
+      </w:r>
+      <w:proofErr w:type="gramStart"/>
+      <w:r>
+        <w:t>chrono::</w:t>
+      </w:r>
+      <w:proofErr w:type="spellStart"/>
+      <w:proofErr w:type="gramEnd"/>
+      <w:r>
+        <w:t>high_resolution_clock</w:t>
+      </w:r>
+      <w:proofErr w:type="spellEnd"/>
+      <w:r>
+        <w:t xml:space="preserve"> on a 20-router directed graph with 33 edges. As expected, BFS and DFS are fastest due to their O(V+E) linear complexity. Dijkstra is slower than Bellman-Ford on our small dataset due to heap overhead, but Dijkstra scales much better on larger graphs.</w:t>
       </w:r>
     </w:p>
     <w:p>
@@ -8954,7 +10253,15 @@
         <w:spacing w:after="120"/>
       </w:pPr>
       <w:r>
-        <w:t>Our 20-router graph is moderately sparse (33 edges vs. maximum of 380 for a complete directed graph). On sparse graphs, Dijkstra significantly outperforms Bellman-Ford because fewer edge relaxations are needed. On dense graphs approaching E = V², Bellman-Ford's O(V×E) = O(V³) becomes prohibitive while Dijkstra's O((V+E)log V) remains manageable.</w:t>
+        <w:t>Our 20-router graph is moderately sparse (33 edges vs. maximum of 380 for a complete directed graph). On sparse graphs, Dijkstra significantly outperforms Bellman-Ford because fewer edge relaxations are needed. On dense graphs approaching E = V², Bellman-Ford's O(V×E) = O(V³) becomes prohibitive while Dijkstra's O((V+</w:t>
+      </w:r>
+      <w:proofErr w:type="gramStart"/>
+      <w:r>
+        <w:t>E)log</w:t>
+      </w:r>
+      <w:proofErr w:type="gramEnd"/>
+      <w:r>
+        <w:t xml:space="preserve"> V) remains manageable.</w:t>
       </w:r>
     </w:p>
     <w:p>
@@ -9101,7 +10408,15 @@
         <w:spacing w:after="60"/>
       </w:pPr>
       <w:r>
-        <w:t>BFS: Use when all edges have equal weight or when minimizing hop count. Also for level-order traversal and checking graph connectivity</w:t>
+        <w:t xml:space="preserve">BFS: Use when all edges have equal weight or when minimizing hop count. </w:t>
+      </w:r>
+      <w:proofErr w:type="gramStart"/>
+      <w:r>
+        <w:t>Also</w:t>
+      </w:r>
+      <w:proofErr w:type="gramEnd"/>
+      <w:r>
+        <w:t xml:space="preserve"> for level-order traversal and checking graph connectivity</w:t>
       </w:r>
       <w:r>
         <w:t xml:space="preserve"> </w:t>
@@ -9374,7 +10689,23 @@
         <w:spacing w:after="120"/>
       </w:pPr>
       <w:r>
-        <w:t>A notable finding from our experiment was that Dijkstra and Bellman-Ford produced identical shortest-path results on our dataset — confirming correctness of both implementations. The MST total weight (115 ms) was substantially less than any individual long path (e.g., R0 → R3 → R7 → R11 → R16 → R19 = 49 ms by Dijkstra), demonstrating how the MST backbone minimizes total infrastructure cost while individual paths minimize per-packet latency — two distinct but complementary optimization goals.</w:t>
+        <w:t xml:space="preserve">A notable finding from our experiment was that Dijkstra and Bellman-Ford produced identical shortest-path results on our dataset — confirming correctness of both implementations. The MST total weight (115 </w:t>
+      </w:r>
+      <w:proofErr w:type="spellStart"/>
+      <w:r>
+        <w:t>ms</w:t>
+      </w:r>
+      <w:proofErr w:type="spellEnd"/>
+      <w:r>
+        <w:t xml:space="preserve">) was substantially less than any individual long path (e.g., R0 → R3 → R7 → R11 → R16 → R19 = 49 </w:t>
+      </w:r>
+      <w:proofErr w:type="spellStart"/>
+      <w:r>
+        <w:t>ms</w:t>
+      </w:r>
+      <w:proofErr w:type="spellEnd"/>
+      <w:r>
+        <w:t xml:space="preserve"> by Dijkstra), demonstrating how the MST backbone minimizes total infrastructure cost while individual paths minimize per-packet latency — two distinct but complementary optimization goals.</w:t>
       </w:r>
     </w:p>
     <w:p>
@@ -9470,7 +10801,15 @@
         <w:spacing w:after="120"/>
       </w:pPr>
       <w:r>
-        <w:t>Overall, this gives a good picture of how theoretical algorithms are actually used in real systems like the internet.</w:t>
+        <w:t xml:space="preserve">Overall, this gives a good picture of how theoretical algorithms are </w:t>
+      </w:r>
+      <w:proofErr w:type="gramStart"/>
+      <w:r>
+        <w:t>actually used</w:t>
+      </w:r>
+      <w:proofErr w:type="gramEnd"/>
+      <w:r>
+        <w:t xml:space="preserve"> in real systems like the internet.</w:t>
       </w:r>
       <w:r>
         <w:t xml:space="preserve"> </w:t>
@@ -9483,8 +10822,8 @@
       </w:r>
     </w:p>
     <w:sectPr>
-      <w:headerReference w:type="default" r:id="rId7"/>
-      <w:footerReference w:type="default" r:id="rId8"/>
+      <w:headerReference w:type="default" r:id="rId8"/>
+      <w:footerReference w:type="default" r:id="rId9"/>
       <w:pgSz w:w="12240" w:h="15840"/>
       <w:pgMar w:top="1440" w:right="1440" w:bottom="1440" w:left="1440" w:header="708" w:footer="708" w:gutter="0"/>
       <w:cols w:space="720"/>
@@ -9577,7 +10916,25 @@
         <w:sz w:val="18"/>
         <w:szCs w:val="18"/>
       </w:rPr>
-      <w:t xml:space="preserve"> | Seyoung Kan &amp; Kaushik Selvakumar</w:t>
+      <w:t xml:space="preserve"> | </w:t>
+    </w:r>
+    <w:proofErr w:type="spellStart"/>
+    <w:r>
+      <w:rPr>
+        <w:color w:val="555555"/>
+        <w:sz w:val="18"/>
+        <w:szCs w:val="18"/>
+      </w:rPr>
+      <w:t>Seyoung</w:t>
+    </w:r>
+    <w:proofErr w:type="spellEnd"/>
+    <w:r>
+      <w:rPr>
+        <w:color w:val="555555"/>
+        <w:sz w:val="18"/>
+        <w:szCs w:val="18"/>
+      </w:rPr>
+      <w:t xml:space="preserve"> Kan &amp; Kaushik Selvakumar</w:t>
     </w:r>
   </w:p>
 </w:ftr>
@@ -12382,4 +13739,16 @@
     </a:ext>
   </a:extLst>
 </a:theme>
+</file>
+
+<file path=customXml/item1.xml><?xml version="1.0" encoding="utf-8"?>
+<b:Sources xmlns:b="http://schemas.openxmlformats.org/officeDocument/2006/bibliography" xmlns="http://schemas.openxmlformats.org/officeDocument/2006/bibliography" SelectedStyle="\APASixthEditionOfficeOnline.xsl" StyleName="APA" Version="6"/>
+</file>
+
+<file path=customXml/itemProps1.xml><?xml version="1.0" encoding="utf-8"?>
+<ds:datastoreItem xmlns:ds="http://schemas.openxmlformats.org/officeDocument/2006/customXml" ds:itemID="{A69E0DC0-9A90-44D6-8C0B-8A65B25A001C}">
+  <ds:schemaRefs>
+    <ds:schemaRef ds:uri="http://schemas.openxmlformats.org/officeDocument/2006/bibliography"/>
+  </ds:schemaRefs>
+</ds:datastoreItem>
 </file>
</xml_diff>

<commit_message>
Replace docs: add final COT4400_Report.docx, COT4400_Report.pdf, COT4400_Presentation.pptx
</commit_message>
<xml_diff>
--- a/docs/report/COT4400_Report.docx
+++ b/docs/report/COT4400_Report.docx
@@ -123,22 +123,13 @@
         </w:rPr>
         <w:t xml:space="preserve">Kan </w:t>
       </w:r>
-      <w:proofErr w:type="gramStart"/>
       <w:r>
         <w:rPr>
           <w:sz w:val="24"/>
           <w:szCs w:val="24"/>
         </w:rPr>
-        <w:t>–</w:t>
-      </w:r>
-      <w:r>
-        <w:rPr>
-          <w:sz w:val="24"/>
-          <w:szCs w:val="24"/>
-        </w:rPr>
-        <w:t xml:space="preserve">  U</w:t>
-      </w:r>
-      <w:proofErr w:type="gramEnd"/>
+        <w:t>– U</w:t>
+      </w:r>
       <w:r>
         <w:rPr>
           <w:sz w:val="24"/>
@@ -166,22 +157,13 @@
         </w:rPr>
         <w:t xml:space="preserve">Selvakumar </w:t>
       </w:r>
-      <w:proofErr w:type="gramStart"/>
       <w:r>
         <w:rPr>
           <w:sz w:val="24"/>
           <w:szCs w:val="24"/>
         </w:rPr>
-        <w:t>–</w:t>
-      </w:r>
-      <w:r>
-        <w:rPr>
-          <w:sz w:val="24"/>
-          <w:szCs w:val="24"/>
-        </w:rPr>
-        <w:t xml:space="preserve">  U</w:t>
-      </w:r>
-      <w:proofErr w:type="gramEnd"/>
+        <w:t>– U</w:t>
+      </w:r>
       <w:r>
         <w:rPr>
           <w:sz w:val="24"/>
@@ -1616,6 +1598,19 @@
       <w:r>
         <w:t>3.1 Router Dataset</w:t>
       </w:r>
+    </w:p>
+    <w:p>
+      <w:pPr>
+        <w:spacing w:after="60"/>
+      </w:pPr>
+      <w:r>
+        <w:t>The table below summarizes all routers in the network, including their labels, layers, and roles within the system.</w:t>
+      </w:r>
+    </w:p>
+    <w:p>
+      <w:pPr>
+        <w:spacing w:after="60"/>
+      </w:pPr>
     </w:p>
     <w:tbl>
       <w:tblPr>
@@ -1881,7 +1876,7 @@
                 <w:sz w:val="20"/>
                 <w:szCs w:val="20"/>
               </w:rPr>
-              <w:t>Internet backbone hub, connects all distribution</w:t>
+              <w:t>Internet backbone hub, connects to all distribution routers</w:t>
             </w:r>
           </w:p>
         </w:tc>
@@ -3621,6 +3616,13 @@
               <w:t>AccessB</w:t>
             </w:r>
             <w:proofErr w:type="spellEnd"/>
+            <w:r>
+              <w:rPr>
+                <w:sz w:val="20"/>
+                <w:szCs w:val="20"/>
+              </w:rPr>
+              <w:t xml:space="preserve"> subnets</w:t>
+            </w:r>
           </w:p>
         </w:tc>
       </w:tr>
@@ -3878,7 +3880,7 @@
                 <w:sz w:val="20"/>
                 <w:szCs w:val="20"/>
               </w:rPr>
-              <w:t>End-user subnet A</w:t>
+              <w:t>End-user subnet (A)</w:t>
             </w:r>
           </w:p>
         </w:tc>
@@ -3996,7 +3998,21 @@
                 <w:sz w:val="20"/>
                 <w:szCs w:val="20"/>
               </w:rPr>
-              <w:t>End-user subnet B</w:t>
+              <w:t>End-user subnet (</w:t>
+            </w:r>
+            <w:r>
+              <w:rPr>
+                <w:sz w:val="20"/>
+                <w:szCs w:val="20"/>
+              </w:rPr>
+              <w:t>B</w:t>
+            </w:r>
+            <w:r>
+              <w:rPr>
+                <w:sz w:val="20"/>
+                <w:szCs w:val="20"/>
+              </w:rPr>
+              <w:t>)</w:t>
             </w:r>
           </w:p>
         </w:tc>
@@ -4114,7 +4130,21 @@
                 <w:sz w:val="20"/>
                 <w:szCs w:val="20"/>
               </w:rPr>
-              <w:t>End-user subnet C</w:t>
+              <w:t>End-user subnet (</w:t>
+            </w:r>
+            <w:r>
+              <w:rPr>
+                <w:sz w:val="20"/>
+                <w:szCs w:val="20"/>
+              </w:rPr>
+              <w:t>C</w:t>
+            </w:r>
+            <w:r>
+              <w:rPr>
+                <w:sz w:val="20"/>
+                <w:szCs w:val="20"/>
+              </w:rPr>
+              <w:t>)</w:t>
             </w:r>
           </w:p>
         </w:tc>
@@ -4126,6 +4156,9 @@
             <w:bottom w:w="0" w:type="dxa"/>
           </w:tblCellMar>
         </w:tblPrEx>
+        <w:trPr>
+          <w:trHeight w:val="19"/>
+        </w:trPr>
         <w:tc>
           <w:tcPr>
             <w:tcW w:w="936" w:type="dxa"/>
@@ -4232,7 +4265,21 @@
                 <w:sz w:val="20"/>
                 <w:szCs w:val="20"/>
               </w:rPr>
-              <w:t>End-user subnet D</w:t>
+              <w:t>End-user subnet (</w:t>
+            </w:r>
+            <w:r>
+              <w:rPr>
+                <w:sz w:val="20"/>
+                <w:szCs w:val="20"/>
+              </w:rPr>
+              <w:t>D</w:t>
+            </w:r>
+            <w:r>
+              <w:rPr>
+                <w:sz w:val="20"/>
+                <w:szCs w:val="20"/>
+              </w:rPr>
+              <w:t>)</w:t>
             </w:r>
           </w:p>
         </w:tc>
@@ -4248,7 +4295,7 @@
         <w:pStyle w:val="Heading2"/>
       </w:pPr>
       <w:r>
-        <w:t>3.2 Key Edge Connections (sample)</w:t>
+        <w:t>3.2 Key Edge Connections</w:t>
       </w:r>
     </w:p>
     <w:p>
@@ -4263,6 +4310,7 @@
           <w:sz w:val="20"/>
           <w:szCs w:val="20"/>
         </w:rPr>
+        <w:lastRenderedPageBreak/>
         <w:t xml:space="preserve">  [IMAGE PLACEHOLDER]  </w:t>
       </w:r>
     </w:p>
@@ -4270,6 +4318,11 @@
       <w:pPr>
         <w:spacing w:after="60"/>
         <w:jc w:val="center"/>
+        <w:rPr>
+          <w:b/>
+          <w:sz w:val="20"/>
+          <w:szCs w:val="20"/>
+        </w:rPr>
       </w:pPr>
       <w:r>
         <w:rPr>
@@ -4279,6 +4332,22 @@
         </w:rPr>
         <w:t>Screenshot: SECTION 1: Graph Adjacency List</w:t>
       </w:r>
+      <w:r>
+        <w:rPr>
+          <w:b/>
+          <w:sz w:val="20"/>
+          <w:szCs w:val="20"/>
+        </w:rPr>
+        <w:t xml:space="preserve"> </w:t>
+      </w:r>
+      <w:r>
+        <w:rPr>
+          <w:b/>
+          <w:sz w:val="20"/>
+          <w:szCs w:val="20"/>
+        </w:rPr>
+        <w:t>(20 routers, 33 directed edges)</w:t>
+      </w:r>
     </w:p>
     <w:p>
       <w:pPr>
@@ -4286,18 +4355,76 @@
         <w:jc w:val="center"/>
       </w:pPr>
       <w:r>
+        <w:drawing>
+          <wp:inline distT="0" distB="0" distL="0" distR="0" wp14:anchorId="2850D92D" wp14:editId="1D66A3C0">
+            <wp:extent cx="3359888" cy="5388651"/>
+            <wp:effectExtent l="0" t="0" r="0" b="2540"/>
+            <wp:docPr id="2073401686" name="Picture 1"/>
+            <wp:cNvGraphicFramePr>
+              <a:graphicFrameLocks xmlns:a="http://schemas.openxmlformats.org/drawingml/2006/main" noChangeAspect="1"/>
+            </wp:cNvGraphicFramePr>
+            <a:graphic xmlns:a="http://schemas.openxmlformats.org/drawingml/2006/main">
+              <a:graphicData uri="http://schemas.openxmlformats.org/drawingml/2006/picture">
+                <pic:pic xmlns:pic="http://schemas.openxmlformats.org/drawingml/2006/picture">
+                  <pic:nvPicPr>
+                    <pic:cNvPr id="2073401686" name=""/>
+                    <pic:cNvPicPr/>
+                  </pic:nvPicPr>
+                  <pic:blipFill>
+                    <a:blip r:embed="rId8"/>
+                    <a:stretch>
+                      <a:fillRect/>
+                    </a:stretch>
+                  </pic:blipFill>
+                  <pic:spPr>
+                    <a:xfrm>
+                      <a:off x="0" y="0"/>
+                      <a:ext cx="3363614" cy="5394627"/>
+                    </a:xfrm>
+                    <a:prstGeom prst="rect">
+                      <a:avLst/>
+                    </a:prstGeom>
+                  </pic:spPr>
+                </pic:pic>
+              </a:graphicData>
+            </a:graphic>
+          </wp:inline>
+        </w:drawing>
+      </w:r>
+    </w:p>
+    <w:p>
+      <w:pPr>
+        <w:spacing w:after="60"/>
+        <w:jc w:val="center"/>
         <w:rPr>
           <w:i/>
           <w:color w:val="595959"/>
           <w:sz w:val="18"/>
           <w:szCs w:val="18"/>
         </w:rPr>
-        <w:t>Source: results/experimental_results.md or terminal output</w:t>
-      </w:r>
-    </w:p>
-    <w:p>
-      <w:pPr>
-        <w:spacing w:after="120"/>
+      </w:pPr>
+      <w:r>
+        <w:rPr>
+          <w:i/>
+          <w:color w:val="595959"/>
+          <w:sz w:val="18"/>
+          <w:szCs w:val="18"/>
+        </w:rPr>
+        <w:t xml:space="preserve">Source: </w:t>
+      </w:r>
+      <w:r>
+        <w:rPr>
+          <w:i/>
+          <w:color w:val="595959"/>
+          <w:sz w:val="18"/>
+          <w:szCs w:val="18"/>
+        </w:rPr>
+        <w:t>Source: Terminal output after running main.cpp</w:t>
+      </w:r>
+    </w:p>
+    <w:p>
+      <w:pPr>
+        <w:spacing w:after="60"/>
         <w:jc w:val="center"/>
         <w:rPr>
           <w:color w:val="595959"/>
@@ -4305,51 +4432,6 @@
           <w:szCs w:val="18"/>
         </w:rPr>
       </w:pPr>
-      <w:r>
-        <w:rPr>
-          <w:color w:val="595959"/>
-          <w:sz w:val="18"/>
-          <w:szCs w:val="18"/>
-        </w:rPr>
-        <w:lastRenderedPageBreak/>
-        <w:t>Run: make &amp;</w:t>
-      </w:r>
-      <w:proofErr w:type="gramStart"/>
-      <w:r>
-        <w:rPr>
-          <w:color w:val="595959"/>
-          <w:sz w:val="18"/>
-          <w:szCs w:val="18"/>
-        </w:rPr>
-        <w:t>&amp; .</w:t>
-      </w:r>
-      <w:proofErr w:type="gramEnd"/>
-      <w:r>
-        <w:rPr>
-          <w:color w:val="595959"/>
-          <w:sz w:val="18"/>
-          <w:szCs w:val="18"/>
-        </w:rPr>
-        <w:t>/</w:t>
-      </w:r>
-      <w:proofErr w:type="spellStart"/>
-      <w:r>
-        <w:rPr>
-          <w:color w:val="595959"/>
-          <w:sz w:val="18"/>
-          <w:szCs w:val="18"/>
-        </w:rPr>
-        <w:t>program_name</w:t>
-      </w:r>
-      <w:proofErr w:type="spellEnd"/>
-      <w:r>
-        <w:rPr>
-          <w:color w:val="595959"/>
-          <w:sz w:val="18"/>
-          <w:szCs w:val="18"/>
-        </w:rPr>
-        <w:t xml:space="preserve"> — then screenshot SECTION 1: Graph Adjacency List</w:t>
-      </w:r>
     </w:p>
     <w:p>
       <w:pPr>
@@ -4712,7 +4794,14 @@
                 <w:sz w:val="20"/>
                 <w:szCs w:val="20"/>
               </w:rPr>
-              <w:t>R2</w:t>
+              <w:t>R</w:t>
+            </w:r>
+            <w:r>
+              <w:rPr>
+                <w:sz w:val="20"/>
+                <w:szCs w:val="20"/>
+              </w:rPr>
+              <w:t>2</w:t>
             </w:r>
           </w:p>
         </w:tc>
@@ -4766,7 +4855,14 @@
                 <w:sz w:val="20"/>
                 <w:szCs w:val="20"/>
               </w:rPr>
-              <w:t>Core → Distribution</w:t>
+              <w:t xml:space="preserve">Core → </w:t>
+            </w:r>
+            <w:r>
+              <w:rPr>
+                <w:sz w:val="20"/>
+                <w:szCs w:val="20"/>
+              </w:rPr>
+              <w:t>Edge</w:t>
             </w:r>
           </w:p>
         </w:tc>
@@ -4801,7 +4897,14 @@
                 <w:sz w:val="20"/>
                 <w:szCs w:val="20"/>
               </w:rPr>
-              <w:t>R2</w:t>
+              <w:t>R</w:t>
+            </w:r>
+            <w:r>
+              <w:rPr>
+                <w:sz w:val="20"/>
+                <w:szCs w:val="20"/>
+              </w:rPr>
+              <w:t>0</w:t>
             </w:r>
           </w:p>
         </w:tc>
@@ -4828,7 +4931,14 @@
                 <w:sz w:val="20"/>
                 <w:szCs w:val="20"/>
               </w:rPr>
-              <w:t>R5</w:t>
+              <w:t>R</w:t>
+            </w:r>
+            <w:r>
+              <w:rPr>
+                <w:sz w:val="20"/>
+                <w:szCs w:val="20"/>
+              </w:rPr>
+              <w:t>3</w:t>
             </w:r>
           </w:p>
         </w:tc>
@@ -4882,7 +4992,14 @@
                 <w:sz w:val="20"/>
                 <w:szCs w:val="20"/>
               </w:rPr>
-              <w:t>Distribution → Edge</w:t>
+              <w:t xml:space="preserve">Core → </w:t>
+            </w:r>
+            <w:r>
+              <w:rPr>
+                <w:sz w:val="20"/>
+                <w:szCs w:val="20"/>
+              </w:rPr>
+              <w:t>Edge</w:t>
             </w:r>
           </w:p>
         </w:tc>
@@ -4917,7 +5034,14 @@
                 <w:sz w:val="20"/>
                 <w:szCs w:val="20"/>
               </w:rPr>
-              <w:t>R5</w:t>
+              <w:t>R</w:t>
+            </w:r>
+            <w:r>
+              <w:rPr>
+                <w:sz w:val="20"/>
+                <w:szCs w:val="20"/>
+              </w:rPr>
+              <w:t>1</w:t>
             </w:r>
           </w:p>
         </w:tc>
@@ -4944,7 +5068,14 @@
                 <w:sz w:val="20"/>
                 <w:szCs w:val="20"/>
               </w:rPr>
-              <w:t>R10</w:t>
+              <w:t>R</w:t>
+            </w:r>
+            <w:r>
+              <w:rPr>
+                <w:sz w:val="20"/>
+                <w:szCs w:val="20"/>
+              </w:rPr>
+              <w:t>4</w:t>
             </w:r>
           </w:p>
         </w:tc>
@@ -4998,7 +5129,14 @@
                 <w:sz w:val="20"/>
                 <w:szCs w:val="20"/>
               </w:rPr>
-              <w:t>Edge → ISP</w:t>
+              <w:t xml:space="preserve">Edge → </w:t>
+            </w:r>
+            <w:r>
+              <w:rPr>
+                <w:sz w:val="20"/>
+                <w:szCs w:val="20"/>
+              </w:rPr>
+              <w:t>Distribution</w:t>
             </w:r>
           </w:p>
         </w:tc>
@@ -5033,7 +5171,7 @@
                 <w:sz w:val="20"/>
                 <w:szCs w:val="20"/>
               </w:rPr>
-              <w:t>R10</w:t>
+              <w:t>R1</w:t>
             </w:r>
           </w:p>
         </w:tc>
@@ -5060,7 +5198,14 @@
                 <w:sz w:val="20"/>
                 <w:szCs w:val="20"/>
               </w:rPr>
-              <w:t>R14</w:t>
+              <w:t>R</w:t>
+            </w:r>
+            <w:r>
+              <w:rPr>
+                <w:sz w:val="20"/>
+                <w:szCs w:val="20"/>
+              </w:rPr>
+              <w:t>5</w:t>
             </w:r>
           </w:p>
         </w:tc>
@@ -5114,7 +5259,7 @@
                 <w:sz w:val="20"/>
                 <w:szCs w:val="20"/>
               </w:rPr>
-              <w:t>ISP → Firewall</w:t>
+              <w:t>Edge → Distribution</w:t>
             </w:r>
           </w:p>
         </w:tc>
@@ -5149,7 +5294,14 @@
                 <w:sz w:val="20"/>
                 <w:szCs w:val="20"/>
               </w:rPr>
-              <w:t>R14</w:t>
+              <w:t>R</w:t>
+            </w:r>
+            <w:r>
+              <w:rPr>
+                <w:sz w:val="20"/>
+                <w:szCs w:val="20"/>
+              </w:rPr>
+              <w:t>2</w:t>
             </w:r>
           </w:p>
         </w:tc>
@@ -5176,7 +5328,14 @@
                 <w:sz w:val="20"/>
                 <w:szCs w:val="20"/>
               </w:rPr>
-              <w:t>R16</w:t>
+              <w:t>R</w:t>
+            </w:r>
+            <w:r>
+              <w:rPr>
+                <w:sz w:val="20"/>
+                <w:szCs w:val="20"/>
+              </w:rPr>
+              <w:t>4</w:t>
             </w:r>
           </w:p>
         </w:tc>
@@ -5199,11 +5358,7 @@
           </w:tcPr>
           <w:p>
             <w:r>
-              <w:rPr>
-                <w:sz w:val="20"/>
-                <w:szCs w:val="20"/>
-              </w:rPr>
-              <w:t>4</w:t>
+              <w:t>8</w:t>
             </w:r>
           </w:p>
         </w:tc>
@@ -5230,7 +5385,7 @@
                 <w:sz w:val="20"/>
                 <w:szCs w:val="20"/>
               </w:rPr>
-              <w:t>Firewall → Access</w:t>
+              <w:t>Edge → Distribution</w:t>
             </w:r>
           </w:p>
         </w:tc>
@@ -5265,6 +5420,125 @@
                 <w:sz w:val="20"/>
                 <w:szCs w:val="20"/>
               </w:rPr>
+              <w:lastRenderedPageBreak/>
+              <w:t>R2</w:t>
+            </w:r>
+          </w:p>
+        </w:tc>
+        <w:tc>
+          <w:tcPr>
+            <w:tcW w:w="2340" w:type="dxa"/>
+            <w:tcBorders>
+              <w:top w:val="single" w:sz="1" w:space="0" w:color="CCCCCC"/>
+              <w:left w:val="single" w:sz="1" w:space="0" w:color="CCCCCC"/>
+              <w:bottom w:val="single" w:sz="1" w:space="0" w:color="CCCCCC"/>
+              <w:right w:val="single" w:sz="1" w:space="0" w:color="CCCCCC"/>
+            </w:tcBorders>
+            <w:shd w:val="clear" w:color="auto" w:fill="FFFFFF"/>
+            <w:tcMar>
+              <w:top w:w="80" w:type="dxa"/>
+              <w:left w:w="120" w:type="dxa"/>
+              <w:bottom w:w="80" w:type="dxa"/>
+              <w:right w:w="120" w:type="dxa"/>
+            </w:tcMar>
+          </w:tcPr>
+          <w:p>
+            <w:r>
+              <w:rPr>
+                <w:sz w:val="20"/>
+                <w:szCs w:val="20"/>
+              </w:rPr>
+              <w:t>R6</w:t>
+            </w:r>
+          </w:p>
+        </w:tc>
+        <w:tc>
+          <w:tcPr>
+            <w:tcW w:w="2340" w:type="dxa"/>
+            <w:tcBorders>
+              <w:top w:val="single" w:sz="1" w:space="0" w:color="CCCCCC"/>
+              <w:left w:val="single" w:sz="1" w:space="0" w:color="CCCCCC"/>
+              <w:bottom w:val="single" w:sz="1" w:space="0" w:color="CCCCCC"/>
+              <w:right w:val="single" w:sz="1" w:space="0" w:color="CCCCCC"/>
+            </w:tcBorders>
+            <w:shd w:val="clear" w:color="auto" w:fill="FFFFFF"/>
+            <w:tcMar>
+              <w:top w:w="80" w:type="dxa"/>
+              <w:left w:w="120" w:type="dxa"/>
+              <w:bottom w:w="80" w:type="dxa"/>
+              <w:right w:w="120" w:type="dxa"/>
+            </w:tcMar>
+          </w:tcPr>
+          <w:p>
+            <w:r>
+              <w:t>14</w:t>
+            </w:r>
+          </w:p>
+        </w:tc>
+        <w:tc>
+          <w:tcPr>
+            <w:tcW w:w="2340" w:type="dxa"/>
+            <w:tcBorders>
+              <w:top w:val="single" w:sz="1" w:space="0" w:color="CCCCCC"/>
+              <w:left w:val="single" w:sz="1" w:space="0" w:color="CCCCCC"/>
+              <w:bottom w:val="single" w:sz="1" w:space="0" w:color="CCCCCC"/>
+              <w:right w:val="single" w:sz="1" w:space="0" w:color="CCCCCC"/>
+            </w:tcBorders>
+            <w:shd w:val="clear" w:color="auto" w:fill="FFFFFF"/>
+            <w:tcMar>
+              <w:top w:w="80" w:type="dxa"/>
+              <w:left w:w="120" w:type="dxa"/>
+              <w:bottom w:w="80" w:type="dxa"/>
+              <w:right w:w="120" w:type="dxa"/>
+            </w:tcMar>
+          </w:tcPr>
+          <w:p>
+            <w:r>
+              <w:rPr>
+                <w:sz w:val="20"/>
+                <w:szCs w:val="20"/>
+              </w:rPr>
+              <w:t>Edge → Distribution</w:t>
+            </w:r>
+          </w:p>
+        </w:tc>
+      </w:tr>
+      <w:tr>
+        <w:tblPrEx>
+          <w:tblCellMar>
+            <w:top w:w="0" w:type="dxa"/>
+            <w:bottom w:w="0" w:type="dxa"/>
+          </w:tblCellMar>
+        </w:tblPrEx>
+        <w:tc>
+          <w:tcPr>
+            <w:tcW w:w="2340" w:type="dxa"/>
+            <w:tcBorders>
+              <w:top w:val="single" w:sz="1" w:space="0" w:color="CCCCCC"/>
+              <w:left w:val="single" w:sz="1" w:space="0" w:color="CCCCCC"/>
+              <w:bottom w:val="single" w:sz="1" w:space="0" w:color="CCCCCC"/>
+              <w:right w:val="single" w:sz="1" w:space="0" w:color="CCCCCC"/>
+            </w:tcBorders>
+            <w:shd w:val="clear" w:color="auto" w:fill="FFFFFF"/>
+            <w:tcMar>
+              <w:top w:w="80" w:type="dxa"/>
+              <w:left w:w="120" w:type="dxa"/>
+              <w:bottom w:w="80" w:type="dxa"/>
+              <w:right w:w="120" w:type="dxa"/>
+            </w:tcMar>
+          </w:tcPr>
+          <w:p>
+            <w:pPr>
+              <w:rPr>
+                <w:sz w:val="20"/>
+                <w:szCs w:val="20"/>
+              </w:rPr>
+            </w:pPr>
+            <w:r>
+              <w:rPr>
+                <w:sz w:val="20"/>
+                <w:szCs w:val="20"/>
+              </w:rPr>
               <w:t>R3</w:t>
             </w:r>
           </w:p>
@@ -5287,12 +5561,18 @@
             </w:tcMar>
           </w:tcPr>
           <w:p>
-            <w:r>
-              <w:rPr>
-                <w:sz w:val="20"/>
-                <w:szCs w:val="20"/>
-              </w:rPr>
-              <w:t>R4</w:t>
+            <w:pPr>
+              <w:rPr>
+                <w:sz w:val="20"/>
+                <w:szCs w:val="20"/>
+              </w:rPr>
+            </w:pPr>
+            <w:r>
+              <w:rPr>
+                <w:sz w:val="20"/>
+                <w:szCs w:val="20"/>
+              </w:rPr>
+              <w:t>R7</w:t>
             </w:r>
           </w:p>
         </w:tc>
@@ -5315,6 +5595,83 @@
           </w:tcPr>
           <w:p>
             <w:r>
+              <w:t>9</w:t>
+            </w:r>
+          </w:p>
+        </w:tc>
+        <w:tc>
+          <w:tcPr>
+            <w:tcW w:w="2340" w:type="dxa"/>
+            <w:tcBorders>
+              <w:top w:val="single" w:sz="1" w:space="0" w:color="CCCCCC"/>
+              <w:left w:val="single" w:sz="1" w:space="0" w:color="CCCCCC"/>
+              <w:bottom w:val="single" w:sz="1" w:space="0" w:color="CCCCCC"/>
+              <w:right w:val="single" w:sz="1" w:space="0" w:color="CCCCCC"/>
+            </w:tcBorders>
+            <w:shd w:val="clear" w:color="auto" w:fill="FFFFFF"/>
+            <w:tcMar>
+              <w:top w:w="80" w:type="dxa"/>
+              <w:left w:w="120" w:type="dxa"/>
+              <w:bottom w:w="80" w:type="dxa"/>
+              <w:right w:w="120" w:type="dxa"/>
+            </w:tcMar>
+          </w:tcPr>
+          <w:p>
+            <w:pPr>
+              <w:rPr>
+                <w:sz w:val="20"/>
+                <w:szCs w:val="20"/>
+              </w:rPr>
+            </w:pPr>
+            <w:r>
+              <w:rPr>
+                <w:sz w:val="20"/>
+                <w:szCs w:val="20"/>
+              </w:rPr>
+              <w:t>Edge → Distribution</w:t>
+            </w:r>
+          </w:p>
+        </w:tc>
+      </w:tr>
+      <w:tr>
+        <w:tblPrEx>
+          <w:tblCellMar>
+            <w:top w:w="0" w:type="dxa"/>
+            <w:bottom w:w="0" w:type="dxa"/>
+          </w:tblCellMar>
+        </w:tblPrEx>
+        <w:tc>
+          <w:tcPr>
+            <w:tcW w:w="2340" w:type="dxa"/>
+            <w:tcBorders>
+              <w:top w:val="single" w:sz="1" w:space="0" w:color="CCCCCC"/>
+              <w:left w:val="single" w:sz="1" w:space="0" w:color="CCCCCC"/>
+              <w:bottom w:val="single" w:sz="1" w:space="0" w:color="CCCCCC"/>
+              <w:right w:val="single" w:sz="1" w:space="0" w:color="CCCCCC"/>
+            </w:tcBorders>
+            <w:shd w:val="clear" w:color="auto" w:fill="FFFFFF"/>
+            <w:tcMar>
+              <w:top w:w="80" w:type="dxa"/>
+              <w:left w:w="120" w:type="dxa"/>
+              <w:bottom w:w="80" w:type="dxa"/>
+              <w:right w:w="120" w:type="dxa"/>
+            </w:tcMar>
+          </w:tcPr>
+          <w:p>
+            <w:pPr>
+              <w:rPr>
+                <w:sz w:val="20"/>
+                <w:szCs w:val="20"/>
+              </w:rPr>
+            </w:pPr>
+            <w:r>
+              <w:rPr>
+                <w:sz w:val="20"/>
+                <w:szCs w:val="20"/>
+              </w:rPr>
+              <w:t>R</w:t>
+            </w:r>
+            <w:r>
               <w:rPr>
                 <w:sz w:val="20"/>
                 <w:szCs w:val="20"/>
@@ -5341,12 +5698,1177 @@
             </w:tcMar>
           </w:tcPr>
           <w:p>
-            <w:r>
-              <w:rPr>
-                <w:sz w:val="20"/>
-                <w:szCs w:val="20"/>
-              </w:rPr>
-              <w:t>Cross-link peering</w:t>
+            <w:pPr>
+              <w:rPr>
+                <w:sz w:val="20"/>
+                <w:szCs w:val="20"/>
+              </w:rPr>
+            </w:pPr>
+            <w:r>
+              <w:rPr>
+                <w:sz w:val="20"/>
+                <w:szCs w:val="20"/>
+              </w:rPr>
+              <w:t>R</w:t>
+            </w:r>
+            <w:r>
+              <w:rPr>
+                <w:sz w:val="20"/>
+                <w:szCs w:val="20"/>
+              </w:rPr>
+              <w:t>9</w:t>
+            </w:r>
+          </w:p>
+        </w:tc>
+        <w:tc>
+          <w:tcPr>
+            <w:tcW w:w="2340" w:type="dxa"/>
+            <w:tcBorders>
+              <w:top w:val="single" w:sz="1" w:space="0" w:color="CCCCCC"/>
+              <w:left w:val="single" w:sz="1" w:space="0" w:color="CCCCCC"/>
+              <w:bottom w:val="single" w:sz="1" w:space="0" w:color="CCCCCC"/>
+              <w:right w:val="single" w:sz="1" w:space="0" w:color="CCCCCC"/>
+            </w:tcBorders>
+            <w:shd w:val="clear" w:color="auto" w:fill="FFFFFF"/>
+            <w:tcMar>
+              <w:top w:w="80" w:type="dxa"/>
+              <w:left w:w="120" w:type="dxa"/>
+              <w:bottom w:w="80" w:type="dxa"/>
+              <w:right w:w="120" w:type="dxa"/>
+            </w:tcMar>
+          </w:tcPr>
+          <w:p>
+            <w:r>
+              <w:t>7</w:t>
+            </w:r>
+          </w:p>
+        </w:tc>
+        <w:tc>
+          <w:tcPr>
+            <w:tcW w:w="2340" w:type="dxa"/>
+            <w:tcBorders>
+              <w:top w:val="single" w:sz="1" w:space="0" w:color="CCCCCC"/>
+              <w:left w:val="single" w:sz="1" w:space="0" w:color="CCCCCC"/>
+              <w:bottom w:val="single" w:sz="1" w:space="0" w:color="CCCCCC"/>
+              <w:right w:val="single" w:sz="1" w:space="0" w:color="CCCCCC"/>
+            </w:tcBorders>
+            <w:shd w:val="clear" w:color="auto" w:fill="FFFFFF"/>
+            <w:tcMar>
+              <w:top w:w="80" w:type="dxa"/>
+              <w:left w:w="120" w:type="dxa"/>
+              <w:bottom w:w="80" w:type="dxa"/>
+              <w:right w:w="120" w:type="dxa"/>
+            </w:tcMar>
+          </w:tcPr>
+          <w:p>
+            <w:pPr>
+              <w:rPr>
+                <w:sz w:val="20"/>
+                <w:szCs w:val="20"/>
+              </w:rPr>
+            </w:pPr>
+            <w:r>
+              <w:rPr>
+                <w:sz w:val="20"/>
+                <w:szCs w:val="20"/>
+              </w:rPr>
+              <w:t>Distribution</w:t>
+            </w:r>
+            <w:r>
+              <w:rPr>
+                <w:sz w:val="20"/>
+                <w:szCs w:val="20"/>
+              </w:rPr>
+              <w:t xml:space="preserve"> → </w:t>
+            </w:r>
+            <w:r>
+              <w:rPr>
+                <w:sz w:val="20"/>
+                <w:szCs w:val="20"/>
+              </w:rPr>
+              <w:t>Access</w:t>
+            </w:r>
+          </w:p>
+        </w:tc>
+      </w:tr>
+      <w:tr>
+        <w:tblPrEx>
+          <w:tblCellMar>
+            <w:top w:w="0" w:type="dxa"/>
+            <w:bottom w:w="0" w:type="dxa"/>
+          </w:tblCellMar>
+        </w:tblPrEx>
+        <w:tc>
+          <w:tcPr>
+            <w:tcW w:w="2340" w:type="dxa"/>
+            <w:tcBorders>
+              <w:top w:val="single" w:sz="1" w:space="0" w:color="CCCCCC"/>
+              <w:left w:val="single" w:sz="1" w:space="0" w:color="CCCCCC"/>
+              <w:bottom w:val="single" w:sz="1" w:space="0" w:color="CCCCCC"/>
+              <w:right w:val="single" w:sz="1" w:space="0" w:color="CCCCCC"/>
+            </w:tcBorders>
+            <w:shd w:val="clear" w:color="auto" w:fill="FFFFFF"/>
+            <w:tcMar>
+              <w:top w:w="80" w:type="dxa"/>
+              <w:left w:w="120" w:type="dxa"/>
+              <w:bottom w:w="80" w:type="dxa"/>
+              <w:right w:w="120" w:type="dxa"/>
+            </w:tcMar>
+          </w:tcPr>
+          <w:p>
+            <w:pPr>
+              <w:rPr>
+                <w:sz w:val="20"/>
+                <w:szCs w:val="20"/>
+              </w:rPr>
+            </w:pPr>
+            <w:r>
+              <w:rPr>
+                <w:sz w:val="20"/>
+                <w:szCs w:val="20"/>
+              </w:rPr>
+              <w:t>R9</w:t>
+            </w:r>
+          </w:p>
+        </w:tc>
+        <w:tc>
+          <w:tcPr>
+            <w:tcW w:w="2340" w:type="dxa"/>
+            <w:tcBorders>
+              <w:top w:val="single" w:sz="1" w:space="0" w:color="CCCCCC"/>
+              <w:left w:val="single" w:sz="1" w:space="0" w:color="CCCCCC"/>
+              <w:bottom w:val="single" w:sz="1" w:space="0" w:color="CCCCCC"/>
+              <w:right w:val="single" w:sz="1" w:space="0" w:color="CCCCCC"/>
+            </w:tcBorders>
+            <w:shd w:val="clear" w:color="auto" w:fill="FFFFFF"/>
+            <w:tcMar>
+              <w:top w:w="80" w:type="dxa"/>
+              <w:left w:w="120" w:type="dxa"/>
+              <w:bottom w:w="80" w:type="dxa"/>
+              <w:right w:w="120" w:type="dxa"/>
+            </w:tcMar>
+          </w:tcPr>
+          <w:p>
+            <w:pPr>
+              <w:rPr>
+                <w:sz w:val="20"/>
+                <w:szCs w:val="20"/>
+              </w:rPr>
+            </w:pPr>
+            <w:r>
+              <w:rPr>
+                <w:sz w:val="20"/>
+                <w:szCs w:val="20"/>
+              </w:rPr>
+              <w:t>R15</w:t>
+            </w:r>
+          </w:p>
+        </w:tc>
+        <w:tc>
+          <w:tcPr>
+            <w:tcW w:w="2340" w:type="dxa"/>
+            <w:tcBorders>
+              <w:top w:val="single" w:sz="1" w:space="0" w:color="CCCCCC"/>
+              <w:left w:val="single" w:sz="1" w:space="0" w:color="CCCCCC"/>
+              <w:bottom w:val="single" w:sz="1" w:space="0" w:color="CCCCCC"/>
+              <w:right w:val="single" w:sz="1" w:space="0" w:color="CCCCCC"/>
+            </w:tcBorders>
+            <w:shd w:val="clear" w:color="auto" w:fill="FFFFFF"/>
+            <w:tcMar>
+              <w:top w:w="80" w:type="dxa"/>
+              <w:left w:w="120" w:type="dxa"/>
+              <w:bottom w:w="80" w:type="dxa"/>
+              <w:right w:w="120" w:type="dxa"/>
+            </w:tcMar>
+          </w:tcPr>
+          <w:p>
+            <w:r>
+              <w:t>11</w:t>
+            </w:r>
+          </w:p>
+        </w:tc>
+        <w:tc>
+          <w:tcPr>
+            <w:tcW w:w="2340" w:type="dxa"/>
+            <w:tcBorders>
+              <w:top w:val="single" w:sz="1" w:space="0" w:color="CCCCCC"/>
+              <w:left w:val="single" w:sz="1" w:space="0" w:color="CCCCCC"/>
+              <w:bottom w:val="single" w:sz="1" w:space="0" w:color="CCCCCC"/>
+              <w:right w:val="single" w:sz="1" w:space="0" w:color="CCCCCC"/>
+            </w:tcBorders>
+            <w:shd w:val="clear" w:color="auto" w:fill="FFFFFF"/>
+            <w:tcMar>
+              <w:top w:w="80" w:type="dxa"/>
+              <w:left w:w="120" w:type="dxa"/>
+              <w:bottom w:w="80" w:type="dxa"/>
+              <w:right w:w="120" w:type="dxa"/>
+            </w:tcMar>
+          </w:tcPr>
+          <w:p>
+            <w:pPr>
+              <w:rPr>
+                <w:sz w:val="20"/>
+                <w:szCs w:val="20"/>
+              </w:rPr>
+            </w:pPr>
+            <w:r>
+              <w:rPr>
+                <w:sz w:val="20"/>
+                <w:szCs w:val="20"/>
+              </w:rPr>
+              <w:t>Access</w:t>
+            </w:r>
+            <w:r>
+              <w:rPr>
+                <w:sz w:val="20"/>
+                <w:szCs w:val="20"/>
+              </w:rPr>
+              <w:t xml:space="preserve"> → </w:t>
+            </w:r>
+            <w:r>
+              <w:rPr>
+                <w:sz w:val="20"/>
+                <w:szCs w:val="20"/>
+              </w:rPr>
+              <w:t>Gateway</w:t>
+            </w:r>
+          </w:p>
+        </w:tc>
+      </w:tr>
+      <w:tr>
+        <w:tblPrEx>
+          <w:tblCellMar>
+            <w:top w:w="0" w:type="dxa"/>
+            <w:bottom w:w="0" w:type="dxa"/>
+          </w:tblCellMar>
+        </w:tblPrEx>
+        <w:tc>
+          <w:tcPr>
+            <w:tcW w:w="2340" w:type="dxa"/>
+            <w:tcBorders>
+              <w:top w:val="single" w:sz="1" w:space="0" w:color="CCCCCC"/>
+              <w:left w:val="single" w:sz="1" w:space="0" w:color="CCCCCC"/>
+              <w:bottom w:val="single" w:sz="1" w:space="0" w:color="CCCCCC"/>
+              <w:right w:val="single" w:sz="1" w:space="0" w:color="CCCCCC"/>
+            </w:tcBorders>
+            <w:shd w:val="clear" w:color="auto" w:fill="FFFFFF"/>
+            <w:tcMar>
+              <w:top w:w="80" w:type="dxa"/>
+              <w:left w:w="120" w:type="dxa"/>
+              <w:bottom w:w="80" w:type="dxa"/>
+              <w:right w:w="120" w:type="dxa"/>
+            </w:tcMar>
+          </w:tcPr>
+          <w:p>
+            <w:pPr>
+              <w:rPr>
+                <w:sz w:val="20"/>
+                <w:szCs w:val="20"/>
+              </w:rPr>
+            </w:pPr>
+            <w:r>
+              <w:rPr>
+                <w:sz w:val="20"/>
+                <w:szCs w:val="20"/>
+              </w:rPr>
+              <w:t>R</w:t>
+            </w:r>
+            <w:r>
+              <w:rPr>
+                <w:sz w:val="20"/>
+                <w:szCs w:val="20"/>
+              </w:rPr>
+              <w:t>7</w:t>
+            </w:r>
+          </w:p>
+        </w:tc>
+        <w:tc>
+          <w:tcPr>
+            <w:tcW w:w="2340" w:type="dxa"/>
+            <w:tcBorders>
+              <w:top w:val="single" w:sz="1" w:space="0" w:color="CCCCCC"/>
+              <w:left w:val="single" w:sz="1" w:space="0" w:color="CCCCCC"/>
+              <w:bottom w:val="single" w:sz="1" w:space="0" w:color="CCCCCC"/>
+              <w:right w:val="single" w:sz="1" w:space="0" w:color="CCCCCC"/>
+            </w:tcBorders>
+            <w:shd w:val="clear" w:color="auto" w:fill="FFFFFF"/>
+            <w:tcMar>
+              <w:top w:w="80" w:type="dxa"/>
+              <w:left w:w="120" w:type="dxa"/>
+              <w:bottom w:w="80" w:type="dxa"/>
+              <w:right w:w="120" w:type="dxa"/>
+            </w:tcMar>
+          </w:tcPr>
+          <w:p>
+            <w:pPr>
+              <w:rPr>
+                <w:sz w:val="20"/>
+                <w:szCs w:val="20"/>
+              </w:rPr>
+            </w:pPr>
+            <w:r>
+              <w:rPr>
+                <w:sz w:val="20"/>
+                <w:szCs w:val="20"/>
+              </w:rPr>
+              <w:t>R1</w:t>
+            </w:r>
+            <w:r>
+              <w:rPr>
+                <w:sz w:val="20"/>
+                <w:szCs w:val="20"/>
+              </w:rPr>
+              <w:t>1</w:t>
+            </w:r>
+          </w:p>
+        </w:tc>
+        <w:tc>
+          <w:tcPr>
+            <w:tcW w:w="2340" w:type="dxa"/>
+            <w:tcBorders>
+              <w:top w:val="single" w:sz="1" w:space="0" w:color="CCCCCC"/>
+              <w:left w:val="single" w:sz="1" w:space="0" w:color="CCCCCC"/>
+              <w:bottom w:val="single" w:sz="1" w:space="0" w:color="CCCCCC"/>
+              <w:right w:val="single" w:sz="1" w:space="0" w:color="CCCCCC"/>
+            </w:tcBorders>
+            <w:shd w:val="clear" w:color="auto" w:fill="FFFFFF"/>
+            <w:tcMar>
+              <w:top w:w="80" w:type="dxa"/>
+              <w:left w:w="120" w:type="dxa"/>
+              <w:bottom w:w="80" w:type="dxa"/>
+              <w:right w:w="120" w:type="dxa"/>
+            </w:tcMar>
+          </w:tcPr>
+          <w:p>
+            <w:r>
+              <w:t>5</w:t>
+            </w:r>
+          </w:p>
+        </w:tc>
+        <w:tc>
+          <w:tcPr>
+            <w:tcW w:w="2340" w:type="dxa"/>
+            <w:tcBorders>
+              <w:top w:val="single" w:sz="1" w:space="0" w:color="CCCCCC"/>
+              <w:left w:val="single" w:sz="1" w:space="0" w:color="CCCCCC"/>
+              <w:bottom w:val="single" w:sz="1" w:space="0" w:color="CCCCCC"/>
+              <w:right w:val="single" w:sz="1" w:space="0" w:color="CCCCCC"/>
+            </w:tcBorders>
+            <w:shd w:val="clear" w:color="auto" w:fill="FFFFFF"/>
+            <w:tcMar>
+              <w:top w:w="80" w:type="dxa"/>
+              <w:left w:w="120" w:type="dxa"/>
+              <w:bottom w:w="80" w:type="dxa"/>
+              <w:right w:w="120" w:type="dxa"/>
+            </w:tcMar>
+          </w:tcPr>
+          <w:p>
+            <w:pPr>
+              <w:rPr>
+                <w:sz w:val="20"/>
+                <w:szCs w:val="20"/>
+              </w:rPr>
+            </w:pPr>
+            <w:r>
+              <w:rPr>
+                <w:sz w:val="20"/>
+                <w:szCs w:val="20"/>
+              </w:rPr>
+              <w:t>Distribution → Access</w:t>
+            </w:r>
+          </w:p>
+        </w:tc>
+      </w:tr>
+      <w:tr>
+        <w:tblPrEx>
+          <w:tblCellMar>
+            <w:top w:w="0" w:type="dxa"/>
+            <w:bottom w:w="0" w:type="dxa"/>
+          </w:tblCellMar>
+        </w:tblPrEx>
+        <w:tc>
+          <w:tcPr>
+            <w:tcW w:w="2340" w:type="dxa"/>
+            <w:tcBorders>
+              <w:top w:val="single" w:sz="1" w:space="0" w:color="CCCCCC"/>
+              <w:left w:val="single" w:sz="1" w:space="0" w:color="CCCCCC"/>
+              <w:bottom w:val="single" w:sz="1" w:space="0" w:color="CCCCCC"/>
+              <w:right w:val="single" w:sz="1" w:space="0" w:color="CCCCCC"/>
+            </w:tcBorders>
+            <w:shd w:val="clear" w:color="auto" w:fill="FFFFFF"/>
+            <w:tcMar>
+              <w:top w:w="80" w:type="dxa"/>
+              <w:left w:w="120" w:type="dxa"/>
+              <w:bottom w:w="80" w:type="dxa"/>
+              <w:right w:w="120" w:type="dxa"/>
+            </w:tcMar>
+          </w:tcPr>
+          <w:p>
+            <w:pPr>
+              <w:rPr>
+                <w:sz w:val="20"/>
+                <w:szCs w:val="20"/>
+              </w:rPr>
+            </w:pPr>
+            <w:r>
+              <w:rPr>
+                <w:sz w:val="20"/>
+                <w:szCs w:val="20"/>
+              </w:rPr>
+              <w:t>R15</w:t>
+            </w:r>
+          </w:p>
+        </w:tc>
+        <w:tc>
+          <w:tcPr>
+            <w:tcW w:w="2340" w:type="dxa"/>
+            <w:tcBorders>
+              <w:top w:val="single" w:sz="1" w:space="0" w:color="CCCCCC"/>
+              <w:left w:val="single" w:sz="1" w:space="0" w:color="CCCCCC"/>
+              <w:bottom w:val="single" w:sz="1" w:space="0" w:color="CCCCCC"/>
+              <w:right w:val="single" w:sz="1" w:space="0" w:color="CCCCCC"/>
+            </w:tcBorders>
+            <w:shd w:val="clear" w:color="auto" w:fill="FFFFFF"/>
+            <w:tcMar>
+              <w:top w:w="80" w:type="dxa"/>
+              <w:left w:w="120" w:type="dxa"/>
+              <w:bottom w:w="80" w:type="dxa"/>
+              <w:right w:w="120" w:type="dxa"/>
+            </w:tcMar>
+          </w:tcPr>
+          <w:p>
+            <w:pPr>
+              <w:rPr>
+                <w:sz w:val="20"/>
+                <w:szCs w:val="20"/>
+              </w:rPr>
+            </w:pPr>
+            <w:r>
+              <w:rPr>
+                <w:sz w:val="20"/>
+                <w:szCs w:val="20"/>
+              </w:rPr>
+              <w:t>R19</w:t>
+            </w:r>
+          </w:p>
+        </w:tc>
+        <w:tc>
+          <w:tcPr>
+            <w:tcW w:w="2340" w:type="dxa"/>
+            <w:tcBorders>
+              <w:top w:val="single" w:sz="1" w:space="0" w:color="CCCCCC"/>
+              <w:left w:val="single" w:sz="1" w:space="0" w:color="CCCCCC"/>
+              <w:bottom w:val="single" w:sz="1" w:space="0" w:color="CCCCCC"/>
+              <w:right w:val="single" w:sz="1" w:space="0" w:color="CCCCCC"/>
+            </w:tcBorders>
+            <w:shd w:val="clear" w:color="auto" w:fill="FFFFFF"/>
+            <w:tcMar>
+              <w:top w:w="80" w:type="dxa"/>
+              <w:left w:w="120" w:type="dxa"/>
+              <w:bottom w:w="80" w:type="dxa"/>
+              <w:right w:w="120" w:type="dxa"/>
+            </w:tcMar>
+          </w:tcPr>
+          <w:p>
+            <w:r>
+              <w:t>9</w:t>
+            </w:r>
+          </w:p>
+        </w:tc>
+        <w:tc>
+          <w:tcPr>
+            <w:tcW w:w="2340" w:type="dxa"/>
+            <w:tcBorders>
+              <w:top w:val="single" w:sz="1" w:space="0" w:color="CCCCCC"/>
+              <w:left w:val="single" w:sz="1" w:space="0" w:color="CCCCCC"/>
+              <w:bottom w:val="single" w:sz="1" w:space="0" w:color="CCCCCC"/>
+              <w:right w:val="single" w:sz="1" w:space="0" w:color="CCCCCC"/>
+            </w:tcBorders>
+            <w:shd w:val="clear" w:color="auto" w:fill="FFFFFF"/>
+            <w:tcMar>
+              <w:top w:w="80" w:type="dxa"/>
+              <w:left w:w="120" w:type="dxa"/>
+              <w:bottom w:w="80" w:type="dxa"/>
+              <w:right w:w="120" w:type="dxa"/>
+            </w:tcMar>
+          </w:tcPr>
+          <w:p>
+            <w:pPr>
+              <w:rPr>
+                <w:sz w:val="20"/>
+                <w:szCs w:val="20"/>
+              </w:rPr>
+            </w:pPr>
+            <w:r>
+              <w:rPr>
+                <w:sz w:val="20"/>
+                <w:szCs w:val="20"/>
+              </w:rPr>
+              <w:t>Gateway link</w:t>
+            </w:r>
+          </w:p>
+        </w:tc>
+      </w:tr>
+      <w:tr>
+        <w:tblPrEx>
+          <w:tblCellMar>
+            <w:top w:w="0" w:type="dxa"/>
+            <w:bottom w:w="0" w:type="dxa"/>
+          </w:tblCellMar>
+        </w:tblPrEx>
+        <w:tc>
+          <w:tcPr>
+            <w:tcW w:w="2340" w:type="dxa"/>
+            <w:tcBorders>
+              <w:top w:val="single" w:sz="1" w:space="0" w:color="CCCCCC"/>
+              <w:left w:val="single" w:sz="1" w:space="0" w:color="CCCCCC"/>
+              <w:bottom w:val="single" w:sz="1" w:space="0" w:color="CCCCCC"/>
+              <w:right w:val="single" w:sz="1" w:space="0" w:color="CCCCCC"/>
+            </w:tcBorders>
+            <w:shd w:val="clear" w:color="auto" w:fill="FFFFFF"/>
+            <w:tcMar>
+              <w:top w:w="80" w:type="dxa"/>
+              <w:left w:w="120" w:type="dxa"/>
+              <w:bottom w:w="80" w:type="dxa"/>
+              <w:right w:w="120" w:type="dxa"/>
+            </w:tcMar>
+          </w:tcPr>
+          <w:p>
+            <w:pPr>
+              <w:rPr>
+                <w:sz w:val="20"/>
+                <w:szCs w:val="20"/>
+              </w:rPr>
+            </w:pPr>
+            <w:r>
+              <w:rPr>
+                <w:sz w:val="20"/>
+                <w:szCs w:val="20"/>
+              </w:rPr>
+              <w:t>R7</w:t>
+            </w:r>
+          </w:p>
+        </w:tc>
+        <w:tc>
+          <w:tcPr>
+            <w:tcW w:w="2340" w:type="dxa"/>
+            <w:tcBorders>
+              <w:top w:val="single" w:sz="1" w:space="0" w:color="CCCCCC"/>
+              <w:left w:val="single" w:sz="1" w:space="0" w:color="CCCCCC"/>
+              <w:bottom w:val="single" w:sz="1" w:space="0" w:color="CCCCCC"/>
+              <w:right w:val="single" w:sz="1" w:space="0" w:color="CCCCCC"/>
+            </w:tcBorders>
+            <w:shd w:val="clear" w:color="auto" w:fill="FFFFFF"/>
+            <w:tcMar>
+              <w:top w:w="80" w:type="dxa"/>
+              <w:left w:w="120" w:type="dxa"/>
+              <w:bottom w:w="80" w:type="dxa"/>
+              <w:right w:w="120" w:type="dxa"/>
+            </w:tcMar>
+          </w:tcPr>
+          <w:p>
+            <w:pPr>
+              <w:rPr>
+                <w:sz w:val="20"/>
+                <w:szCs w:val="20"/>
+              </w:rPr>
+            </w:pPr>
+            <w:r>
+              <w:rPr>
+                <w:sz w:val="20"/>
+                <w:szCs w:val="20"/>
+              </w:rPr>
+              <w:t>R11</w:t>
+            </w:r>
+          </w:p>
+        </w:tc>
+        <w:tc>
+          <w:tcPr>
+            <w:tcW w:w="2340" w:type="dxa"/>
+            <w:tcBorders>
+              <w:top w:val="single" w:sz="1" w:space="0" w:color="CCCCCC"/>
+              <w:left w:val="single" w:sz="1" w:space="0" w:color="CCCCCC"/>
+              <w:bottom w:val="single" w:sz="1" w:space="0" w:color="CCCCCC"/>
+              <w:right w:val="single" w:sz="1" w:space="0" w:color="CCCCCC"/>
+            </w:tcBorders>
+            <w:shd w:val="clear" w:color="auto" w:fill="FFFFFF"/>
+            <w:tcMar>
+              <w:top w:w="80" w:type="dxa"/>
+              <w:left w:w="120" w:type="dxa"/>
+              <w:bottom w:w="80" w:type="dxa"/>
+              <w:right w:w="120" w:type="dxa"/>
+            </w:tcMar>
+          </w:tcPr>
+          <w:p>
+            <w:r>
+              <w:t>5</w:t>
+            </w:r>
+          </w:p>
+        </w:tc>
+        <w:tc>
+          <w:tcPr>
+            <w:tcW w:w="2340" w:type="dxa"/>
+            <w:tcBorders>
+              <w:top w:val="single" w:sz="1" w:space="0" w:color="CCCCCC"/>
+              <w:left w:val="single" w:sz="1" w:space="0" w:color="CCCCCC"/>
+              <w:bottom w:val="single" w:sz="1" w:space="0" w:color="CCCCCC"/>
+              <w:right w:val="single" w:sz="1" w:space="0" w:color="CCCCCC"/>
+            </w:tcBorders>
+            <w:shd w:val="clear" w:color="auto" w:fill="FFFFFF"/>
+            <w:tcMar>
+              <w:top w:w="80" w:type="dxa"/>
+              <w:left w:w="120" w:type="dxa"/>
+              <w:bottom w:w="80" w:type="dxa"/>
+              <w:right w:w="120" w:type="dxa"/>
+            </w:tcMar>
+          </w:tcPr>
+          <w:p>
+            <w:pPr>
+              <w:rPr>
+                <w:sz w:val="20"/>
+                <w:szCs w:val="20"/>
+              </w:rPr>
+            </w:pPr>
+            <w:r>
+              <w:rPr>
+                <w:sz w:val="20"/>
+                <w:szCs w:val="20"/>
+              </w:rPr>
+              <w:t>Distribution → Access</w:t>
+            </w:r>
+          </w:p>
+        </w:tc>
+      </w:tr>
+      <w:tr>
+        <w:tblPrEx>
+          <w:tblCellMar>
+            <w:top w:w="0" w:type="dxa"/>
+            <w:bottom w:w="0" w:type="dxa"/>
+          </w:tblCellMar>
+        </w:tblPrEx>
+        <w:tc>
+          <w:tcPr>
+            <w:tcW w:w="2340" w:type="dxa"/>
+            <w:tcBorders>
+              <w:top w:val="single" w:sz="1" w:space="0" w:color="CCCCCC"/>
+              <w:left w:val="single" w:sz="1" w:space="0" w:color="CCCCCC"/>
+              <w:bottom w:val="single" w:sz="1" w:space="0" w:color="CCCCCC"/>
+              <w:right w:val="single" w:sz="1" w:space="0" w:color="CCCCCC"/>
+            </w:tcBorders>
+            <w:shd w:val="clear" w:color="auto" w:fill="FFFFFF"/>
+            <w:tcMar>
+              <w:top w:w="80" w:type="dxa"/>
+              <w:left w:w="120" w:type="dxa"/>
+              <w:bottom w:w="80" w:type="dxa"/>
+              <w:right w:w="120" w:type="dxa"/>
+            </w:tcMar>
+          </w:tcPr>
+          <w:p>
+            <w:pPr>
+              <w:rPr>
+                <w:sz w:val="20"/>
+                <w:szCs w:val="20"/>
+              </w:rPr>
+            </w:pPr>
+            <w:r>
+              <w:rPr>
+                <w:sz w:val="20"/>
+                <w:szCs w:val="20"/>
+              </w:rPr>
+              <w:t>R11</w:t>
+            </w:r>
+          </w:p>
+        </w:tc>
+        <w:tc>
+          <w:tcPr>
+            <w:tcW w:w="2340" w:type="dxa"/>
+            <w:tcBorders>
+              <w:top w:val="single" w:sz="1" w:space="0" w:color="CCCCCC"/>
+              <w:left w:val="single" w:sz="1" w:space="0" w:color="CCCCCC"/>
+              <w:bottom w:val="single" w:sz="1" w:space="0" w:color="CCCCCC"/>
+              <w:right w:val="single" w:sz="1" w:space="0" w:color="CCCCCC"/>
+            </w:tcBorders>
+            <w:shd w:val="clear" w:color="auto" w:fill="FFFFFF"/>
+            <w:tcMar>
+              <w:top w:w="80" w:type="dxa"/>
+              <w:left w:w="120" w:type="dxa"/>
+              <w:bottom w:w="80" w:type="dxa"/>
+              <w:right w:w="120" w:type="dxa"/>
+            </w:tcMar>
+          </w:tcPr>
+          <w:p>
+            <w:pPr>
+              <w:rPr>
+                <w:sz w:val="20"/>
+                <w:szCs w:val="20"/>
+              </w:rPr>
+            </w:pPr>
+            <w:r>
+              <w:rPr>
+                <w:sz w:val="20"/>
+                <w:szCs w:val="20"/>
+              </w:rPr>
+              <w:t>R16</w:t>
+            </w:r>
+          </w:p>
+        </w:tc>
+        <w:tc>
+          <w:tcPr>
+            <w:tcW w:w="2340" w:type="dxa"/>
+            <w:tcBorders>
+              <w:top w:val="single" w:sz="1" w:space="0" w:color="CCCCCC"/>
+              <w:left w:val="single" w:sz="1" w:space="0" w:color="CCCCCC"/>
+              <w:bottom w:val="single" w:sz="1" w:space="0" w:color="CCCCCC"/>
+              <w:right w:val="single" w:sz="1" w:space="0" w:color="CCCCCC"/>
+            </w:tcBorders>
+            <w:shd w:val="clear" w:color="auto" w:fill="FFFFFF"/>
+            <w:tcMar>
+              <w:top w:w="80" w:type="dxa"/>
+              <w:left w:w="120" w:type="dxa"/>
+              <w:bottom w:w="80" w:type="dxa"/>
+              <w:right w:w="120" w:type="dxa"/>
+            </w:tcMar>
+          </w:tcPr>
+          <w:p>
+            <w:r>
+              <w:t>8</w:t>
+            </w:r>
+          </w:p>
+        </w:tc>
+        <w:tc>
+          <w:tcPr>
+            <w:tcW w:w="2340" w:type="dxa"/>
+            <w:tcBorders>
+              <w:top w:val="single" w:sz="1" w:space="0" w:color="CCCCCC"/>
+              <w:left w:val="single" w:sz="1" w:space="0" w:color="CCCCCC"/>
+              <w:bottom w:val="single" w:sz="1" w:space="0" w:color="CCCCCC"/>
+              <w:right w:val="single" w:sz="1" w:space="0" w:color="CCCCCC"/>
+            </w:tcBorders>
+            <w:shd w:val="clear" w:color="auto" w:fill="FFFFFF"/>
+            <w:tcMar>
+              <w:top w:w="80" w:type="dxa"/>
+              <w:left w:w="120" w:type="dxa"/>
+              <w:bottom w:w="80" w:type="dxa"/>
+              <w:right w:w="120" w:type="dxa"/>
+            </w:tcMar>
+          </w:tcPr>
+          <w:p>
+            <w:pPr>
+              <w:rPr>
+                <w:sz w:val="20"/>
+                <w:szCs w:val="20"/>
+              </w:rPr>
+            </w:pPr>
+            <w:r>
+              <w:rPr>
+                <w:sz w:val="20"/>
+                <w:szCs w:val="20"/>
+              </w:rPr>
+              <w:t>Access</w:t>
+            </w:r>
+            <w:r>
+              <w:rPr>
+                <w:sz w:val="20"/>
+                <w:szCs w:val="20"/>
+              </w:rPr>
+              <w:t xml:space="preserve"> → </w:t>
+            </w:r>
+            <w:r>
+              <w:rPr>
+                <w:sz w:val="20"/>
+                <w:szCs w:val="20"/>
+              </w:rPr>
+              <w:t>Gateway</w:t>
+            </w:r>
+          </w:p>
+        </w:tc>
+      </w:tr>
+      <w:tr>
+        <w:tblPrEx>
+          <w:tblCellMar>
+            <w:top w:w="0" w:type="dxa"/>
+            <w:bottom w:w="0" w:type="dxa"/>
+          </w:tblCellMar>
+        </w:tblPrEx>
+        <w:tc>
+          <w:tcPr>
+            <w:tcW w:w="2340" w:type="dxa"/>
+            <w:tcBorders>
+              <w:top w:val="single" w:sz="1" w:space="0" w:color="CCCCCC"/>
+              <w:left w:val="single" w:sz="1" w:space="0" w:color="CCCCCC"/>
+              <w:bottom w:val="single" w:sz="1" w:space="0" w:color="CCCCCC"/>
+              <w:right w:val="single" w:sz="1" w:space="0" w:color="CCCCCC"/>
+            </w:tcBorders>
+            <w:shd w:val="clear" w:color="auto" w:fill="FFFFFF"/>
+            <w:tcMar>
+              <w:top w:w="80" w:type="dxa"/>
+              <w:left w:w="120" w:type="dxa"/>
+              <w:bottom w:w="80" w:type="dxa"/>
+              <w:right w:w="120" w:type="dxa"/>
+            </w:tcMar>
+          </w:tcPr>
+          <w:p>
+            <w:pPr>
+              <w:rPr>
+                <w:sz w:val="20"/>
+                <w:szCs w:val="20"/>
+              </w:rPr>
+            </w:pPr>
+            <w:r>
+              <w:rPr>
+                <w:sz w:val="20"/>
+                <w:szCs w:val="20"/>
+              </w:rPr>
+              <w:t>R16</w:t>
+            </w:r>
+          </w:p>
+        </w:tc>
+        <w:tc>
+          <w:tcPr>
+            <w:tcW w:w="2340" w:type="dxa"/>
+            <w:tcBorders>
+              <w:top w:val="single" w:sz="1" w:space="0" w:color="CCCCCC"/>
+              <w:left w:val="single" w:sz="1" w:space="0" w:color="CCCCCC"/>
+              <w:bottom w:val="single" w:sz="1" w:space="0" w:color="CCCCCC"/>
+              <w:right w:val="single" w:sz="1" w:space="0" w:color="CCCCCC"/>
+            </w:tcBorders>
+            <w:shd w:val="clear" w:color="auto" w:fill="FFFFFF"/>
+            <w:tcMar>
+              <w:top w:w="80" w:type="dxa"/>
+              <w:left w:w="120" w:type="dxa"/>
+              <w:bottom w:w="80" w:type="dxa"/>
+              <w:right w:w="120" w:type="dxa"/>
+            </w:tcMar>
+          </w:tcPr>
+          <w:p>
+            <w:pPr>
+              <w:rPr>
+                <w:sz w:val="20"/>
+                <w:szCs w:val="20"/>
+              </w:rPr>
+            </w:pPr>
+            <w:r>
+              <w:rPr>
+                <w:sz w:val="20"/>
+                <w:szCs w:val="20"/>
+              </w:rPr>
+              <w:t>R19</w:t>
+            </w:r>
+          </w:p>
+        </w:tc>
+        <w:tc>
+          <w:tcPr>
+            <w:tcW w:w="2340" w:type="dxa"/>
+            <w:tcBorders>
+              <w:top w:val="single" w:sz="1" w:space="0" w:color="CCCCCC"/>
+              <w:left w:val="single" w:sz="1" w:space="0" w:color="CCCCCC"/>
+              <w:bottom w:val="single" w:sz="1" w:space="0" w:color="CCCCCC"/>
+              <w:right w:val="single" w:sz="1" w:space="0" w:color="CCCCCC"/>
+            </w:tcBorders>
+            <w:shd w:val="clear" w:color="auto" w:fill="FFFFFF"/>
+            <w:tcMar>
+              <w:top w:w="80" w:type="dxa"/>
+              <w:left w:w="120" w:type="dxa"/>
+              <w:bottom w:w="80" w:type="dxa"/>
+              <w:right w:w="120" w:type="dxa"/>
+            </w:tcMar>
+          </w:tcPr>
+          <w:p>
+            <w:r>
+              <w:t>7</w:t>
+            </w:r>
+          </w:p>
+        </w:tc>
+        <w:tc>
+          <w:tcPr>
+            <w:tcW w:w="2340" w:type="dxa"/>
+            <w:tcBorders>
+              <w:top w:val="single" w:sz="1" w:space="0" w:color="CCCCCC"/>
+              <w:left w:val="single" w:sz="1" w:space="0" w:color="CCCCCC"/>
+              <w:bottom w:val="single" w:sz="1" w:space="0" w:color="CCCCCC"/>
+              <w:right w:val="single" w:sz="1" w:space="0" w:color="CCCCCC"/>
+            </w:tcBorders>
+            <w:shd w:val="clear" w:color="auto" w:fill="FFFFFF"/>
+            <w:tcMar>
+              <w:top w:w="80" w:type="dxa"/>
+              <w:left w:w="120" w:type="dxa"/>
+              <w:bottom w:w="80" w:type="dxa"/>
+              <w:right w:w="120" w:type="dxa"/>
+            </w:tcMar>
+          </w:tcPr>
+          <w:p>
+            <w:pPr>
+              <w:rPr>
+                <w:sz w:val="20"/>
+                <w:szCs w:val="20"/>
+              </w:rPr>
+            </w:pPr>
+            <w:r>
+              <w:rPr>
+                <w:sz w:val="20"/>
+                <w:szCs w:val="20"/>
+              </w:rPr>
+              <w:t>Gateway Link</w:t>
+            </w:r>
+          </w:p>
+        </w:tc>
+      </w:tr>
+      <w:tr>
+        <w:tblPrEx>
+          <w:tblCellMar>
+            <w:top w:w="0" w:type="dxa"/>
+            <w:bottom w:w="0" w:type="dxa"/>
+          </w:tblCellMar>
+        </w:tblPrEx>
+        <w:tc>
+          <w:tcPr>
+            <w:tcW w:w="2340" w:type="dxa"/>
+            <w:tcBorders>
+              <w:top w:val="single" w:sz="1" w:space="0" w:color="CCCCCC"/>
+              <w:left w:val="single" w:sz="1" w:space="0" w:color="CCCCCC"/>
+              <w:bottom w:val="single" w:sz="1" w:space="0" w:color="CCCCCC"/>
+              <w:right w:val="single" w:sz="1" w:space="0" w:color="CCCCCC"/>
+            </w:tcBorders>
+            <w:shd w:val="clear" w:color="auto" w:fill="FFFFFF"/>
+            <w:tcMar>
+              <w:top w:w="80" w:type="dxa"/>
+              <w:left w:w="120" w:type="dxa"/>
+              <w:bottom w:w="80" w:type="dxa"/>
+              <w:right w:w="120" w:type="dxa"/>
+            </w:tcMar>
+          </w:tcPr>
+          <w:p>
+            <w:pPr>
+              <w:rPr>
+                <w:sz w:val="20"/>
+                <w:szCs w:val="20"/>
+              </w:rPr>
+            </w:pPr>
+            <w:r>
+              <w:rPr>
+                <w:sz w:val="20"/>
+                <w:szCs w:val="20"/>
+              </w:rPr>
+              <w:t>R13</w:t>
+            </w:r>
+          </w:p>
+        </w:tc>
+        <w:tc>
+          <w:tcPr>
+            <w:tcW w:w="2340" w:type="dxa"/>
+            <w:tcBorders>
+              <w:top w:val="single" w:sz="1" w:space="0" w:color="CCCCCC"/>
+              <w:left w:val="single" w:sz="1" w:space="0" w:color="CCCCCC"/>
+              <w:bottom w:val="single" w:sz="1" w:space="0" w:color="CCCCCC"/>
+              <w:right w:val="single" w:sz="1" w:space="0" w:color="CCCCCC"/>
+            </w:tcBorders>
+            <w:shd w:val="clear" w:color="auto" w:fill="FFFFFF"/>
+            <w:tcMar>
+              <w:top w:w="80" w:type="dxa"/>
+              <w:left w:w="120" w:type="dxa"/>
+              <w:bottom w:w="80" w:type="dxa"/>
+              <w:right w:w="120" w:type="dxa"/>
+            </w:tcMar>
+          </w:tcPr>
+          <w:p>
+            <w:pPr>
+              <w:rPr>
+                <w:sz w:val="20"/>
+                <w:szCs w:val="20"/>
+              </w:rPr>
+            </w:pPr>
+            <w:r>
+              <w:rPr>
+                <w:sz w:val="20"/>
+                <w:szCs w:val="20"/>
+              </w:rPr>
+              <w:t>R19</w:t>
+            </w:r>
+          </w:p>
+        </w:tc>
+        <w:tc>
+          <w:tcPr>
+            <w:tcW w:w="2340" w:type="dxa"/>
+            <w:tcBorders>
+              <w:top w:val="single" w:sz="1" w:space="0" w:color="CCCCCC"/>
+              <w:left w:val="single" w:sz="1" w:space="0" w:color="CCCCCC"/>
+              <w:bottom w:val="single" w:sz="1" w:space="0" w:color="CCCCCC"/>
+              <w:right w:val="single" w:sz="1" w:space="0" w:color="CCCCCC"/>
+            </w:tcBorders>
+            <w:shd w:val="clear" w:color="auto" w:fill="FFFFFF"/>
+            <w:tcMar>
+              <w:top w:w="80" w:type="dxa"/>
+              <w:left w:w="120" w:type="dxa"/>
+              <w:bottom w:w="80" w:type="dxa"/>
+              <w:right w:w="120" w:type="dxa"/>
+            </w:tcMar>
+          </w:tcPr>
+          <w:p>
+            <w:r>
+              <w:t>10</w:t>
+            </w:r>
+          </w:p>
+        </w:tc>
+        <w:tc>
+          <w:tcPr>
+            <w:tcW w:w="2340" w:type="dxa"/>
+            <w:tcBorders>
+              <w:top w:val="single" w:sz="1" w:space="0" w:color="CCCCCC"/>
+              <w:left w:val="single" w:sz="1" w:space="0" w:color="CCCCCC"/>
+              <w:bottom w:val="single" w:sz="1" w:space="0" w:color="CCCCCC"/>
+              <w:right w:val="single" w:sz="1" w:space="0" w:color="CCCCCC"/>
+            </w:tcBorders>
+            <w:shd w:val="clear" w:color="auto" w:fill="FFFFFF"/>
+            <w:tcMar>
+              <w:top w:w="80" w:type="dxa"/>
+              <w:left w:w="120" w:type="dxa"/>
+              <w:bottom w:w="80" w:type="dxa"/>
+              <w:right w:w="120" w:type="dxa"/>
+            </w:tcMar>
+          </w:tcPr>
+          <w:p>
+            <w:pPr>
+              <w:rPr>
+                <w:sz w:val="20"/>
+                <w:szCs w:val="20"/>
+              </w:rPr>
+            </w:pPr>
+            <w:r>
+              <w:rPr>
+                <w:sz w:val="20"/>
+                <w:szCs w:val="20"/>
+              </w:rPr>
+              <w:t>Gateway Link</w:t>
+            </w:r>
+          </w:p>
+        </w:tc>
+      </w:tr>
+      <w:tr>
+        <w:tblPrEx>
+          <w:tblCellMar>
+            <w:top w:w="0" w:type="dxa"/>
+            <w:bottom w:w="0" w:type="dxa"/>
+          </w:tblCellMar>
+        </w:tblPrEx>
+        <w:tc>
+          <w:tcPr>
+            <w:tcW w:w="2340" w:type="dxa"/>
+            <w:tcBorders>
+              <w:top w:val="single" w:sz="1" w:space="0" w:color="CCCCCC"/>
+              <w:left w:val="single" w:sz="1" w:space="0" w:color="CCCCCC"/>
+              <w:bottom w:val="single" w:sz="1" w:space="0" w:color="CCCCCC"/>
+              <w:right w:val="single" w:sz="1" w:space="0" w:color="CCCCCC"/>
+            </w:tcBorders>
+            <w:shd w:val="clear" w:color="auto" w:fill="FFFFFF"/>
+            <w:tcMar>
+              <w:top w:w="80" w:type="dxa"/>
+              <w:left w:w="120" w:type="dxa"/>
+              <w:bottom w:w="80" w:type="dxa"/>
+              <w:right w:w="120" w:type="dxa"/>
+            </w:tcMar>
+          </w:tcPr>
+          <w:p>
+            <w:pPr>
+              <w:rPr>
+                <w:sz w:val="20"/>
+                <w:szCs w:val="20"/>
+              </w:rPr>
+            </w:pPr>
+            <w:r>
+              <w:rPr>
+                <w:sz w:val="20"/>
+                <w:szCs w:val="20"/>
+              </w:rPr>
+              <w:t>R14</w:t>
+            </w:r>
+          </w:p>
+        </w:tc>
+        <w:tc>
+          <w:tcPr>
+            <w:tcW w:w="2340" w:type="dxa"/>
+            <w:tcBorders>
+              <w:top w:val="single" w:sz="1" w:space="0" w:color="CCCCCC"/>
+              <w:left w:val="single" w:sz="1" w:space="0" w:color="CCCCCC"/>
+              <w:bottom w:val="single" w:sz="1" w:space="0" w:color="CCCCCC"/>
+              <w:right w:val="single" w:sz="1" w:space="0" w:color="CCCCCC"/>
+            </w:tcBorders>
+            <w:shd w:val="clear" w:color="auto" w:fill="FFFFFF"/>
+            <w:tcMar>
+              <w:top w:w="80" w:type="dxa"/>
+              <w:left w:w="120" w:type="dxa"/>
+              <w:bottom w:w="80" w:type="dxa"/>
+              <w:right w:w="120" w:type="dxa"/>
+            </w:tcMar>
+          </w:tcPr>
+          <w:p>
+            <w:pPr>
+              <w:rPr>
+                <w:sz w:val="20"/>
+                <w:szCs w:val="20"/>
+              </w:rPr>
+            </w:pPr>
+            <w:r>
+              <w:rPr>
+                <w:sz w:val="20"/>
+                <w:szCs w:val="20"/>
+              </w:rPr>
+              <w:t>R19</w:t>
+            </w:r>
+          </w:p>
+        </w:tc>
+        <w:tc>
+          <w:tcPr>
+            <w:tcW w:w="2340" w:type="dxa"/>
+            <w:tcBorders>
+              <w:top w:val="single" w:sz="1" w:space="0" w:color="CCCCCC"/>
+              <w:left w:val="single" w:sz="1" w:space="0" w:color="CCCCCC"/>
+              <w:bottom w:val="single" w:sz="1" w:space="0" w:color="CCCCCC"/>
+              <w:right w:val="single" w:sz="1" w:space="0" w:color="CCCCCC"/>
+            </w:tcBorders>
+            <w:shd w:val="clear" w:color="auto" w:fill="FFFFFF"/>
+            <w:tcMar>
+              <w:top w:w="80" w:type="dxa"/>
+              <w:left w:w="120" w:type="dxa"/>
+              <w:bottom w:w="80" w:type="dxa"/>
+              <w:right w:w="120" w:type="dxa"/>
+            </w:tcMar>
+          </w:tcPr>
+          <w:p>
+            <w:r>
+              <w:t>12</w:t>
+            </w:r>
+          </w:p>
+        </w:tc>
+        <w:tc>
+          <w:tcPr>
+            <w:tcW w:w="2340" w:type="dxa"/>
+            <w:tcBorders>
+              <w:top w:val="single" w:sz="1" w:space="0" w:color="CCCCCC"/>
+              <w:left w:val="single" w:sz="1" w:space="0" w:color="CCCCCC"/>
+              <w:bottom w:val="single" w:sz="1" w:space="0" w:color="CCCCCC"/>
+              <w:right w:val="single" w:sz="1" w:space="0" w:color="CCCCCC"/>
+            </w:tcBorders>
+            <w:shd w:val="clear" w:color="auto" w:fill="FFFFFF"/>
+            <w:tcMar>
+              <w:top w:w="80" w:type="dxa"/>
+              <w:left w:w="120" w:type="dxa"/>
+              <w:bottom w:w="80" w:type="dxa"/>
+              <w:right w:w="120" w:type="dxa"/>
+            </w:tcMar>
+          </w:tcPr>
+          <w:p>
+            <w:pPr>
+              <w:rPr>
+                <w:sz w:val="20"/>
+                <w:szCs w:val="20"/>
+              </w:rPr>
+            </w:pPr>
+            <w:r>
+              <w:rPr>
+                <w:sz w:val="20"/>
+                <w:szCs w:val="20"/>
+              </w:rPr>
+              <w:t>Gateway Link</w:t>
             </w:r>
           </w:p>
         </w:tc>
@@ -5483,20 +7005,90 @@
       <w:pPr>
         <w:spacing w:after="60"/>
         <w:jc w:val="center"/>
-      </w:pPr>
-      <w:r>
         <w:rPr>
           <w:b/>
           <w:sz w:val="20"/>
           <w:szCs w:val="20"/>
         </w:rPr>
-        <w:t>Screenshot: SECTION 2 &amp; 3 — BFS and DFS Output</w:t>
+      </w:pPr>
+      <w:r>
+        <w:rPr>
+          <w:b/>
+          <w:sz w:val="20"/>
+          <w:szCs w:val="20"/>
+        </w:rPr>
+        <w:t>Screenshot: SECTION</w:t>
+      </w:r>
+      <w:r>
+        <w:rPr>
+          <w:b/>
+          <w:sz w:val="20"/>
+          <w:szCs w:val="20"/>
+        </w:rPr>
+        <w:t xml:space="preserve"> 2 </w:t>
+      </w:r>
+      <w:r>
+        <w:rPr>
+          <w:b/>
+          <w:sz w:val="20"/>
+          <w:szCs w:val="20"/>
+        </w:rPr>
+        <w:t>— BFS Output</w:t>
       </w:r>
     </w:p>
     <w:p>
       <w:pPr>
         <w:spacing w:after="60"/>
         <w:jc w:val="center"/>
+      </w:pPr>
+      <w:r>
+        <w:drawing>
+          <wp:inline distT="0" distB="0" distL="0" distR="0" wp14:anchorId="71FCB405" wp14:editId="1AF2181D">
+            <wp:extent cx="3565461" cy="4338084"/>
+            <wp:effectExtent l="0" t="0" r="0" b="5715"/>
+            <wp:docPr id="1724393861" name="Picture 1"/>
+            <wp:cNvGraphicFramePr>
+              <a:graphicFrameLocks xmlns:a="http://schemas.openxmlformats.org/drawingml/2006/main" noChangeAspect="1"/>
+            </wp:cNvGraphicFramePr>
+            <a:graphic xmlns:a="http://schemas.openxmlformats.org/drawingml/2006/main">
+              <a:graphicData uri="http://schemas.openxmlformats.org/drawingml/2006/picture">
+                <pic:pic xmlns:pic="http://schemas.openxmlformats.org/drawingml/2006/picture">
+                  <pic:nvPicPr>
+                    <pic:cNvPr id="1724393861" name=""/>
+                    <pic:cNvPicPr/>
+                  </pic:nvPicPr>
+                  <pic:blipFill>
+                    <a:blip r:embed="rId9"/>
+                    <a:stretch>
+                      <a:fillRect/>
+                    </a:stretch>
+                  </pic:blipFill>
+                  <pic:spPr>
+                    <a:xfrm>
+                      <a:off x="0" y="0"/>
+                      <a:ext cx="3571120" cy="4344969"/>
+                    </a:xfrm>
+                    <a:prstGeom prst="rect">
+                      <a:avLst/>
+                    </a:prstGeom>
+                  </pic:spPr>
+                </pic:pic>
+              </a:graphicData>
+            </a:graphic>
+          </wp:inline>
+        </w:drawing>
+      </w:r>
+    </w:p>
+    <w:p>
+      <w:pPr>
+        <w:spacing w:after="60"/>
+        <w:jc w:val="center"/>
+        <w:rPr>
+          <w:i/>
+          <w:color w:val="595959"/>
+          <w:sz w:val="18"/>
+          <w:szCs w:val="18"/>
+        </w:rPr>
       </w:pPr>
       <w:r>
         <w:rPr>
@@ -5510,21 +7102,150 @@
     </w:p>
     <w:p>
       <w:pPr>
-        <w:spacing w:after="120"/>
+        <w:spacing w:after="60"/>
         <w:jc w:val="center"/>
-      </w:pPr>
-      <w:r>
         <w:rPr>
+          <w:b/>
+          <w:sz w:val="20"/>
+          <w:szCs w:val="20"/>
+        </w:rPr>
+      </w:pPr>
+    </w:p>
+    <w:p>
+      <w:pPr>
+        <w:spacing w:after="60"/>
+        <w:jc w:val="center"/>
+        <w:rPr>
+          <w:b/>
+          <w:sz w:val="20"/>
+          <w:szCs w:val="20"/>
+        </w:rPr>
+      </w:pPr>
+      <w:r>
+        <w:rPr>
+          <w:b/>
+          <w:sz w:val="20"/>
+          <w:szCs w:val="20"/>
+        </w:rPr>
+        <w:t xml:space="preserve">Screenshot: SECTION </w:t>
+      </w:r>
+      <w:r>
+        <w:rPr>
+          <w:b/>
+          <w:sz w:val="20"/>
+          <w:szCs w:val="20"/>
+        </w:rPr>
+        <w:t>3</w:t>
+      </w:r>
+      <w:r>
+        <w:rPr>
+          <w:b/>
+          <w:sz w:val="20"/>
+          <w:szCs w:val="20"/>
+        </w:rPr>
+        <w:t xml:space="preserve"> — </w:t>
+      </w:r>
+      <w:r>
+        <w:rPr>
+          <w:b/>
+          <w:sz w:val="20"/>
+          <w:szCs w:val="20"/>
+        </w:rPr>
+        <w:t xml:space="preserve">DFS </w:t>
+      </w:r>
+      <w:r>
+        <w:rPr>
+          <w:b/>
+          <w:sz w:val="20"/>
+          <w:szCs w:val="20"/>
+        </w:rPr>
+        <w:t>Output</w:t>
+      </w:r>
+    </w:p>
+    <w:p>
+      <w:pPr>
+        <w:spacing w:after="60"/>
+        <w:jc w:val="center"/>
+        <w:rPr>
+          <w:b/>
+          <w:sz w:val="20"/>
+          <w:szCs w:val="20"/>
+        </w:rPr>
+      </w:pPr>
+      <w:r>
+        <w:rPr>
+          <w:b/>
+          <w:sz w:val="20"/>
+          <w:szCs w:val="20"/>
+        </w:rPr>
+        <w:lastRenderedPageBreak/>
+        <w:drawing>
+          <wp:inline distT="0" distB="0" distL="0" distR="0" wp14:anchorId="06C34F01" wp14:editId="3C5FF05C">
+            <wp:extent cx="3561907" cy="5183031"/>
+            <wp:effectExtent l="0" t="0" r="635" b="0"/>
+            <wp:docPr id="1900807756" name="Picture 1"/>
+            <wp:cNvGraphicFramePr>
+              <a:graphicFrameLocks xmlns:a="http://schemas.openxmlformats.org/drawingml/2006/main" noChangeAspect="1"/>
+            </wp:cNvGraphicFramePr>
+            <a:graphic xmlns:a="http://schemas.openxmlformats.org/drawingml/2006/main">
+              <a:graphicData uri="http://schemas.openxmlformats.org/drawingml/2006/picture">
+                <pic:pic xmlns:pic="http://schemas.openxmlformats.org/drawingml/2006/picture">
+                  <pic:nvPicPr>
+                    <pic:cNvPr id="1900807756" name=""/>
+                    <pic:cNvPicPr/>
+                  </pic:nvPicPr>
+                  <pic:blipFill>
+                    <a:blip r:embed="rId10"/>
+                    <a:stretch>
+                      <a:fillRect/>
+                    </a:stretch>
+                  </pic:blipFill>
+                  <pic:spPr>
+                    <a:xfrm>
+                      <a:off x="0" y="0"/>
+                      <a:ext cx="3567575" cy="5191279"/>
+                    </a:xfrm>
+                    <a:prstGeom prst="rect">
+                      <a:avLst/>
+                    </a:prstGeom>
+                  </pic:spPr>
+                </pic:pic>
+              </a:graphicData>
+            </a:graphic>
+          </wp:inline>
+        </w:drawing>
+      </w:r>
+    </w:p>
+    <w:p>
+      <w:pPr>
+        <w:spacing w:after="60"/>
+        <w:jc w:val="center"/>
+        <w:rPr>
+          <w:i/>
           <w:color w:val="595959"/>
           <w:sz w:val="18"/>
           <w:szCs w:val="18"/>
         </w:rPr>
-        <w:t>Run program — screenshot SECTION 2: BFS Traversal and SECTION 3: DFS Traversal</w:t>
-      </w:r>
-    </w:p>
-    <w:p>
-      <w:pPr>
-        <w:spacing w:after="120"/>
+      </w:pPr>
+      <w:r>
+        <w:rPr>
+          <w:i/>
+          <w:color w:val="595959"/>
+          <w:sz w:val="18"/>
+          <w:szCs w:val="18"/>
+        </w:rPr>
+        <w:t>Source: Terminal output after running main.cpp</w:t>
+      </w:r>
+    </w:p>
+    <w:p>
+      <w:pPr>
+        <w:spacing w:after="60"/>
+        <w:jc w:val="center"/>
+        <w:rPr>
+          <w:b/>
+          <w:sz w:val="20"/>
+          <w:szCs w:val="20"/>
+        </w:rPr>
       </w:pPr>
     </w:p>
     <w:tbl>
@@ -5888,6 +7609,7 @@
         <w:spacing w:after="120"/>
       </w:pPr>
       <w:r>
+        <w:lastRenderedPageBreak/>
         <w:t xml:space="preserve">Time: </w:t>
       </w:r>
       <w:proofErr w:type="gramStart"/>
@@ -6155,7 +7877,6 @@
                 <w:sz w:val="18"/>
                 <w:szCs w:val="18"/>
               </w:rPr>
-              <w:lastRenderedPageBreak/>
               <w:t xml:space="preserve">  visited[u] = true</w:t>
             </w:r>
           </w:p>
@@ -6313,42 +8034,183 @@
     <w:p>
       <w:pPr>
         <w:spacing w:after="120"/>
-      </w:pPr>
+        <w:rPr>
+          <w:b/>
+          <w:bCs/>
+        </w:rPr>
+      </w:pPr>
+    </w:p>
+    <w:p>
+      <w:pPr>
+        <w:spacing w:after="120"/>
+        <w:rPr>
+          <w:b/>
+          <w:bCs/>
+        </w:rPr>
+      </w:pPr>
+      <w:r>
+        <w:rPr>
+          <w:b/>
+          <w:bCs/>
+        </w:rPr>
+        <w:t>Example Shortest Path</w:t>
+      </w:r>
+      <w:r>
+        <w:rPr>
+          <w:b/>
+          <w:bCs/>
+        </w:rPr>
+        <w:t>:</w:t>
+      </w:r>
+    </w:p>
+    <w:p>
+      <w:pPr>
+        <w:spacing w:after="120"/>
+      </w:pPr>
+      <w:r>
+        <w:t>From router R0 to R19:</w:t>
+      </w:r>
     </w:p>
     <w:p>
       <w:pPr>
         <w:spacing w:before="120" w:after="60"/>
-        <w:jc w:val="center"/>
-      </w:pPr>
-      <w:r>
+      </w:pPr>
+      <w:r>
+        <w:t xml:space="preserve">R0 → R1 → R4 → R9 → R15 → R19 = 49 </w:t>
+      </w:r>
+      <w:proofErr w:type="spellStart"/>
+      <w:r>
+        <w:t>ms</w:t>
+      </w:r>
+      <w:proofErr w:type="spellEnd"/>
+    </w:p>
+    <w:p>
+      <w:pPr>
+        <w:spacing w:before="120" w:after="60"/>
         <w:rPr>
           <w:b/>
           <w:color w:val="FFFFFF"/>
           <w:sz w:val="20"/>
           <w:szCs w:val="20"/>
         </w:rPr>
-        <w:t xml:space="preserve">  [IMAGE PLACEHOLDER]  </w:t>
+      </w:pPr>
+      <w:r>
+        <w:t>T</w:t>
+      </w:r>
+      <w:r>
+        <w:t>his matches the output generated by the program.</w:t>
+      </w:r>
+    </w:p>
+    <w:p>
+      <w:pPr>
+        <w:spacing w:before="120" w:after="60"/>
+      </w:pPr>
+      <w:r>
+        <w:rPr>
+          <w:b/>
+          <w:color w:val="FFFFFF"/>
+          <w:sz w:val="20"/>
+          <w:szCs w:val="20"/>
+        </w:rPr>
+        <w:t xml:space="preserve">AGE PLACEHOLDER]  </w:t>
       </w:r>
     </w:p>
     <w:p>
       <w:pPr>
         <w:spacing w:after="60"/>
         <w:jc w:val="center"/>
-      </w:pPr>
-      <w:r>
         <w:rPr>
           <w:b/>
           <w:sz w:val="20"/>
           <w:szCs w:val="20"/>
         </w:rPr>
-        <w:t>Screenshot: SECTION 4 — Dijkstra Output (highlight R19 | 49ms | R0→R3→R7→R11→R16→R19)</w:t>
+      </w:pPr>
+      <w:r>
+        <w:rPr>
+          <w:b/>
+          <w:sz w:val="20"/>
+          <w:szCs w:val="20"/>
+        </w:rPr>
+        <w:t xml:space="preserve">Screenshot: SECTION 4 — </w:t>
+      </w:r>
+      <w:r>
+        <w:rPr>
+          <w:b/>
+          <w:sz w:val="20"/>
+          <w:szCs w:val="20"/>
+        </w:rPr>
+        <w:t>Dijkstra Output (R19 | 49ms | R0 → R1 → R4 → R9 → R15 → R19)</w:t>
       </w:r>
     </w:p>
     <w:p>
       <w:pPr>
         <w:spacing w:after="60"/>
         <w:jc w:val="center"/>
-      </w:pPr>
+        <w:rPr>
+          <w:b/>
+          <w:sz w:val="20"/>
+          <w:szCs w:val="20"/>
+        </w:rPr>
+      </w:pPr>
+      <w:r>
+        <w:lastRenderedPageBreak/>
+        <w:drawing>
+          <wp:inline distT="0" distB="0" distL="0" distR="0" wp14:anchorId="7B3C826D" wp14:editId="343222CA">
+            <wp:extent cx="5943600" cy="6457315"/>
+            <wp:effectExtent l="0" t="0" r="0" b="635"/>
+            <wp:docPr id="1814001567" name="Picture 1"/>
+            <wp:cNvGraphicFramePr>
+              <a:graphicFrameLocks xmlns:a="http://schemas.openxmlformats.org/drawingml/2006/main" noChangeAspect="1"/>
+            </wp:cNvGraphicFramePr>
+            <a:graphic xmlns:a="http://schemas.openxmlformats.org/drawingml/2006/main">
+              <a:graphicData uri="http://schemas.openxmlformats.org/drawingml/2006/picture">
+                <pic:pic xmlns:pic="http://schemas.openxmlformats.org/drawingml/2006/picture">
+                  <pic:nvPicPr>
+                    <pic:cNvPr id="1814001567" name=""/>
+                    <pic:cNvPicPr/>
+                  </pic:nvPicPr>
+                  <pic:blipFill>
+                    <a:blip r:embed="rId11"/>
+                    <a:stretch>
+                      <a:fillRect/>
+                    </a:stretch>
+                  </pic:blipFill>
+                  <pic:spPr>
+                    <a:xfrm>
+                      <a:off x="0" y="0"/>
+                      <a:ext cx="5943600" cy="6457315"/>
+                    </a:xfrm>
+                    <a:prstGeom prst="rect">
+                      <a:avLst/>
+                    </a:prstGeom>
+                  </pic:spPr>
+                </pic:pic>
+              </a:graphicData>
+            </a:graphic>
+          </wp:inline>
+        </w:drawing>
+      </w:r>
+    </w:p>
+    <w:p>
+      <w:pPr>
+        <w:spacing w:after="60"/>
+        <w:jc w:val="center"/>
+        <w:rPr>
+          <w:i/>
+          <w:color w:val="595959"/>
+          <w:sz w:val="18"/>
+          <w:szCs w:val="18"/>
+        </w:rPr>
+      </w:pPr>
+      <w:r>
+        <w:rPr>
+          <w:i/>
+          <w:color w:val="595959"/>
+          <w:sz w:val="18"/>
+          <w:szCs w:val="18"/>
+        </w:rPr>
+        <w:t xml:space="preserve">Source: </w:t>
+      </w:r>
       <w:r>
         <w:rPr>
           <w:i/>
@@ -6361,21 +8223,8 @@
     </w:p>
     <w:p>
       <w:pPr>
-        <w:spacing w:after="120"/>
+        <w:spacing w:after="60"/>
         <w:jc w:val="center"/>
-      </w:pPr>
-      <w:r>
-        <w:rPr>
-          <w:color w:val="595959"/>
-          <w:sz w:val="18"/>
-          <w:szCs w:val="18"/>
-        </w:rPr>
-        <w:t>Run program — screenshot SECTION 4: Dijkstra's Shortest Path. Highlight row: R19 | 49ms | R0 -&gt; R3 -&gt; R7 -&gt; R11 -&gt; R16 -&gt; R19</w:t>
-      </w:r>
-    </w:p>
-    <w:p>
-      <w:pPr>
-        <w:spacing w:after="120"/>
       </w:pPr>
     </w:p>
     <w:tbl>
@@ -6683,6 +8532,7 @@
                 <w:sz w:val="18"/>
                 <w:szCs w:val="18"/>
               </w:rPr>
+              <w:lastRenderedPageBreak/>
               <w:t xml:space="preserve">    for each edge (</w:t>
             </w:r>
             <w:proofErr w:type="spellStart"/>
@@ -7010,6 +8860,12 @@
       <w:pPr>
         <w:spacing w:after="60"/>
         <w:jc w:val="center"/>
+        <w:rPr>
+          <w:i/>
+          <w:color w:val="595959"/>
+          <w:sz w:val="18"/>
+          <w:szCs w:val="18"/>
+        </w:rPr>
       </w:pPr>
       <w:r>
         <w:rPr>
@@ -7019,21 +8875,56 @@
           <w:szCs w:val="18"/>
         </w:rPr>
         <w:lastRenderedPageBreak/>
-        <w:t>Source: Terminal output after running main.cpp</w:t>
-      </w:r>
-    </w:p>
-    <w:p>
-      <w:pPr>
-        <w:spacing w:after="120"/>
+        <w:drawing>
+          <wp:inline distT="0" distB="0" distL="0" distR="0" wp14:anchorId="3E829E5D" wp14:editId="340225BC">
+            <wp:extent cx="5201376" cy="7487695"/>
+            <wp:effectExtent l="0" t="0" r="0" b="0"/>
+            <wp:docPr id="1540820607" name="Picture 1"/>
+            <wp:cNvGraphicFramePr>
+              <a:graphicFrameLocks xmlns:a="http://schemas.openxmlformats.org/drawingml/2006/main" noChangeAspect="1"/>
+            </wp:cNvGraphicFramePr>
+            <a:graphic xmlns:a="http://schemas.openxmlformats.org/drawingml/2006/main">
+              <a:graphicData uri="http://schemas.openxmlformats.org/drawingml/2006/picture">
+                <pic:pic xmlns:pic="http://schemas.openxmlformats.org/drawingml/2006/picture">
+                  <pic:nvPicPr>
+                    <pic:cNvPr id="1540820607" name=""/>
+                    <pic:cNvPicPr/>
+                  </pic:nvPicPr>
+                  <pic:blipFill>
+                    <a:blip r:embed="rId12"/>
+                    <a:stretch>
+                      <a:fillRect/>
+                    </a:stretch>
+                  </pic:blipFill>
+                  <pic:spPr>
+                    <a:xfrm>
+                      <a:off x="0" y="0"/>
+                      <a:ext cx="5201376" cy="7487695"/>
+                    </a:xfrm>
+                    <a:prstGeom prst="rect">
+                      <a:avLst/>
+                    </a:prstGeom>
+                  </pic:spPr>
+                </pic:pic>
+              </a:graphicData>
+            </a:graphic>
+          </wp:inline>
+        </w:drawing>
+      </w:r>
+    </w:p>
+    <w:p>
+      <w:pPr>
+        <w:spacing w:after="60"/>
         <w:jc w:val="center"/>
       </w:pPr>
       <w:r>
         <w:rPr>
+          <w:i/>
           <w:color w:val="595959"/>
           <w:sz w:val="18"/>
           <w:szCs w:val="18"/>
         </w:rPr>
-        <w:t>Run program — screenshot SECTION 5: Bellman-Ford Shortest Path Algorithm</w:t>
+        <w:t>Source: Terminal output after running main.cpp</w:t>
       </w:r>
     </w:p>
     <w:p>
@@ -7132,6 +9023,7 @@
                 <w:sz w:val="18"/>
                 <w:szCs w:val="18"/>
               </w:rPr>
+              <w:lastRenderedPageBreak/>
               <w:t>BellmanFord</w:t>
             </w:r>
             <w:proofErr w:type="spellEnd"/>
@@ -7608,34 +9500,48 @@
     </w:p>
     <w:p>
       <w:pPr>
-        <w:spacing w:after="120"/>
-      </w:pPr>
-      <w:r>
+        <w:spacing w:before="120" w:after="60"/>
         <w:rPr>
           <w:b/>
           <w:bCs/>
         </w:rPr>
-        <w:t>Important note:</w:t>
-      </w:r>
-      <w:r>
-        <w:br/>
-        <w:t xml:space="preserve">Since MST is defined for undirected graphs, we apply Kruskal on an </w:t>
+      </w:pPr>
+    </w:p>
+    <w:p>
+      <w:pPr>
+        <w:spacing w:before="60" w:after="120"/>
+      </w:pPr>
+      <w:r>
+        <w:rPr>
+          <w:b/>
+          <w:color w:val="2E75B6"/>
+          <w:sz w:val="20"/>
+          <w:szCs w:val="20"/>
+        </w:rPr>
+        <w:t xml:space="preserve">Note: </w:t>
+      </w:r>
+      <w:r>
+        <w:rPr>
+          <w:i/>
+          <w:sz w:val="20"/>
+          <w:szCs w:val="20"/>
+        </w:rPr>
+        <w:t xml:space="preserve">Since MST is defined for undirected graphs, Kruskal's algorithm is applied to an </w:t>
       </w:r>
       <w:r>
         <w:rPr>
           <w:b/>
           <w:bCs/>
+          <w:i/>
+          <w:sz w:val="20"/>
+          <w:szCs w:val="20"/>
         </w:rPr>
-        <w:t>undirected version of the router network</w:t>
-      </w:r>
-      <w:r>
-        <w:t>.</w:t>
+        <w:t>undirected interpretation of the router network.</w:t>
       </w:r>
     </w:p>
     <w:p>
       <w:pPr>
         <w:spacing w:before="120" w:after="60"/>
-        <w:jc w:val="center"/>
       </w:pPr>
       <w:r>
         <w:rPr>
@@ -7658,14 +9564,87 @@
           <w:sz w:val="20"/>
           <w:szCs w:val="20"/>
         </w:rPr>
-        <w:t>Screenshot: SECTION 6 — Kruskal MST Output (Total edges + Total MST weight)</w:t>
+        <w:t xml:space="preserve">Screenshot: SECTION 6 — </w:t>
+      </w:r>
+      <w:r>
+        <w:rPr>
+          <w:b/>
+          <w:sz w:val="20"/>
+          <w:szCs w:val="20"/>
+        </w:rPr>
+        <w:t>Kruskal MST Output (Total edges: 19, Total weight: 171ms)</w:t>
       </w:r>
     </w:p>
     <w:p>
       <w:pPr>
         <w:spacing w:after="60"/>
         <w:jc w:val="center"/>
-      </w:pPr>
+        <w:rPr>
+          <w:i/>
+          <w:color w:val="595959"/>
+          <w:sz w:val="18"/>
+          <w:szCs w:val="18"/>
+        </w:rPr>
+      </w:pPr>
+      <w:r>
+        <w:rPr>
+          <w:i/>
+          <w:color w:val="595959"/>
+          <w:sz w:val="18"/>
+          <w:szCs w:val="18"/>
+        </w:rPr>
+        <w:lastRenderedPageBreak/>
+        <w:drawing>
+          <wp:inline distT="0" distB="0" distL="0" distR="0" wp14:anchorId="055BA79A" wp14:editId="3F84E287">
+            <wp:extent cx="4072270" cy="6623882"/>
+            <wp:effectExtent l="0" t="0" r="4445" b="5715"/>
+            <wp:docPr id="2040942503" name="Picture 1"/>
+            <wp:cNvGraphicFramePr>
+              <a:graphicFrameLocks xmlns:a="http://schemas.openxmlformats.org/drawingml/2006/main" noChangeAspect="1"/>
+            </wp:cNvGraphicFramePr>
+            <a:graphic xmlns:a="http://schemas.openxmlformats.org/drawingml/2006/main">
+              <a:graphicData uri="http://schemas.openxmlformats.org/drawingml/2006/picture">
+                <pic:pic xmlns:pic="http://schemas.openxmlformats.org/drawingml/2006/picture">
+                  <pic:nvPicPr>
+                    <pic:cNvPr id="2040942503" name=""/>
+                    <pic:cNvPicPr/>
+                  </pic:nvPicPr>
+                  <pic:blipFill>
+                    <a:blip r:embed="rId13"/>
+                    <a:stretch>
+                      <a:fillRect/>
+                    </a:stretch>
+                  </pic:blipFill>
+                  <pic:spPr>
+                    <a:xfrm>
+                      <a:off x="0" y="0"/>
+                      <a:ext cx="4078614" cy="6634200"/>
+                    </a:xfrm>
+                    <a:prstGeom prst="rect">
+                      <a:avLst/>
+                    </a:prstGeom>
+                  </pic:spPr>
+                </pic:pic>
+              </a:graphicData>
+            </a:graphic>
+          </wp:inline>
+        </w:drawing>
+      </w:r>
+    </w:p>
+    <w:p>
+      <w:pPr>
+        <w:spacing w:after="60"/>
+        <w:jc w:val="center"/>
+      </w:pPr>
+      <w:r>
+        <w:rPr>
+          <w:i/>
+          <w:color w:val="595959"/>
+          <w:sz w:val="18"/>
+          <w:szCs w:val="18"/>
+        </w:rPr>
+        <w:t xml:space="preserve">Source: </w:t>
+      </w:r>
       <w:r>
         <w:rPr>
           <w:i/>
@@ -7675,47 +9654,6 @@
         </w:rPr>
         <w:t>Source: Terminal output after running main.cpp</w:t>
       </w:r>
-    </w:p>
-    <w:p>
-      <w:pPr>
-        <w:spacing w:after="120"/>
-        <w:jc w:val="center"/>
-      </w:pPr>
-      <w:r>
-        <w:rPr>
-          <w:color w:val="595959"/>
-          <w:sz w:val="18"/>
-          <w:szCs w:val="18"/>
-        </w:rPr>
-        <w:t>Run program — screenshot SECTION 6: Kruskal's MST. Show total MST edges and total MST weight.</w:t>
-      </w:r>
-    </w:p>
-    <w:p>
-      <w:pPr>
-        <w:spacing w:before="60" w:after="120"/>
-      </w:pPr>
-      <w:r>
-        <w:rPr>
-          <w:b/>
-          <w:color w:val="2E75B6"/>
-          <w:sz w:val="20"/>
-          <w:szCs w:val="20"/>
-        </w:rPr>
-        <w:t xml:space="preserve">Note: </w:t>
-      </w:r>
-      <w:r>
-        <w:rPr>
-          <w:i/>
-          <w:sz w:val="20"/>
-          <w:szCs w:val="20"/>
-        </w:rPr>
-        <w:t>Since MST is defined for undirected graphs, Kruskal's algorithm is applied to an undirected interpretation of the router network.</w:t>
-      </w:r>
-    </w:p>
-    <w:p>
-      <w:pPr>
-        <w:spacing w:after="120"/>
-      </w:pPr>
     </w:p>
     <w:tbl>
       <w:tblPr>
@@ -7970,6 +9908,7 @@
                 <w:sz w:val="18"/>
                 <w:szCs w:val="18"/>
               </w:rPr>
+              <w:lastRenderedPageBreak/>
               <w:t xml:space="preserve">    if |MST| == V-1: break</w:t>
             </w:r>
           </w:p>
@@ -9085,6 +11024,61 @@
       <w:pPr>
         <w:spacing w:after="60"/>
         <w:jc w:val="center"/>
+        <w:rPr>
+          <w:i/>
+          <w:color w:val="595959"/>
+          <w:sz w:val="18"/>
+          <w:szCs w:val="18"/>
+        </w:rPr>
+      </w:pPr>
+      <w:r>
+        <w:rPr>
+          <w:i/>
+          <w:color w:val="595959"/>
+          <w:sz w:val="18"/>
+          <w:szCs w:val="18"/>
+        </w:rPr>
+        <w:drawing>
+          <wp:inline distT="0" distB="0" distL="0" distR="0" wp14:anchorId="1149B770" wp14:editId="228B83D9">
+            <wp:extent cx="5943600" cy="5842635"/>
+            <wp:effectExtent l="0" t="0" r="0" b="5715"/>
+            <wp:docPr id="1813473421" name="Picture 1"/>
+            <wp:cNvGraphicFramePr>
+              <a:graphicFrameLocks xmlns:a="http://schemas.openxmlformats.org/drawingml/2006/main" noChangeAspect="1"/>
+            </wp:cNvGraphicFramePr>
+            <a:graphic xmlns:a="http://schemas.openxmlformats.org/drawingml/2006/main">
+              <a:graphicData uri="http://schemas.openxmlformats.org/drawingml/2006/picture">
+                <pic:pic xmlns:pic="http://schemas.openxmlformats.org/drawingml/2006/picture">
+                  <pic:nvPicPr>
+                    <pic:cNvPr id="1813473421" name=""/>
+                    <pic:cNvPicPr/>
+                  </pic:nvPicPr>
+                  <pic:blipFill>
+                    <a:blip r:embed="rId14"/>
+                    <a:stretch>
+                      <a:fillRect/>
+                    </a:stretch>
+                  </pic:blipFill>
+                  <pic:spPr>
+                    <a:xfrm>
+                      <a:off x="0" y="0"/>
+                      <a:ext cx="5943600" cy="5842635"/>
+                    </a:xfrm>
+                    <a:prstGeom prst="rect">
+                      <a:avLst/>
+                    </a:prstGeom>
+                  </pic:spPr>
+                </pic:pic>
+              </a:graphicData>
+            </a:graphic>
+          </wp:inline>
+        </w:drawing>
+      </w:r>
+    </w:p>
+    <w:p>
+      <w:pPr>
+        <w:spacing w:after="60"/>
+        <w:jc w:val="center"/>
       </w:pPr>
       <w:r>
         <w:rPr>
@@ -9094,20 +11088,6 @@
           <w:szCs w:val="18"/>
         </w:rPr>
         <w:t>Source: results/experimental_results.md or terminal output</w:t>
-      </w:r>
-    </w:p>
-    <w:p>
-      <w:pPr>
-        <w:spacing w:after="120"/>
-        <w:jc w:val="center"/>
-      </w:pPr>
-      <w:r>
-        <w:rPr>
-          <w:color w:val="595959"/>
-          <w:sz w:val="18"/>
-          <w:szCs w:val="18"/>
-        </w:rPr>
-        <w:t>Run program — screenshot SECTION 7: Experimental Performance Analysis table</w:t>
       </w:r>
     </w:p>
     <w:p>
@@ -9399,7 +11379,7 @@
                 <w:sz w:val="18"/>
                 <w:szCs w:val="18"/>
               </w:rPr>
-              <w:t>&lt; 1 µs</w:t>
+              <w:t>0.561 µs</w:t>
             </w:r>
           </w:p>
         </w:tc>
@@ -9426,7 +11406,7 @@
                 <w:sz w:val="18"/>
                 <w:szCs w:val="18"/>
               </w:rPr>
-              <w:t>&lt; 1 µs</w:t>
+              <w:t>0.231 µs</w:t>
             </w:r>
           </w:p>
         </w:tc>
@@ -9453,7 +11433,7 @@
                 <w:sz w:val="18"/>
                 <w:szCs w:val="18"/>
               </w:rPr>
-              <w:t>2 µs</w:t>
+              <w:t>0.260 µs</w:t>
             </w:r>
           </w:p>
         </w:tc>
@@ -9480,7 +11460,7 @@
                 <w:sz w:val="18"/>
                 <w:szCs w:val="18"/>
               </w:rPr>
-              <w:t>8 µs</w:t>
+              <w:t>1.644 µs</w:t>
             </w:r>
           </w:p>
         </w:tc>
@@ -9569,7 +11549,7 @@
                 <w:sz w:val="18"/>
                 <w:szCs w:val="18"/>
               </w:rPr>
-              <w:t>&lt; 1 µs</w:t>
+              <w:t>0.250 µs</w:t>
             </w:r>
           </w:p>
         </w:tc>
@@ -9596,7 +11576,7 @@
                 <w:sz w:val="18"/>
                 <w:szCs w:val="18"/>
               </w:rPr>
-              <w:t>&lt; 1 µs</w:t>
+              <w:t>0.180 µs</w:t>
             </w:r>
           </w:p>
         </w:tc>
@@ -9623,7 +11603,7 @@
                 <w:sz w:val="18"/>
                 <w:szCs w:val="18"/>
               </w:rPr>
-              <w:t>2 µs</w:t>
+              <w:t>0.361 µs</w:t>
             </w:r>
           </w:p>
         </w:tc>
@@ -9650,7 +11630,7 @@
                 <w:sz w:val="18"/>
                 <w:szCs w:val="18"/>
               </w:rPr>
-              <w:t>7 µs</w:t>
+              <w:t>1.623 µs</w:t>
             </w:r>
           </w:p>
         </w:tc>
@@ -9773,7 +11753,7 @@
                 <w:sz w:val="18"/>
                 <w:szCs w:val="18"/>
               </w:rPr>
-              <w:t>3 µs</w:t>
+              <w:t>0.461 µs</w:t>
             </w:r>
           </w:p>
         </w:tc>
@@ -9800,7 +11780,7 @@
                 <w:sz w:val="18"/>
                 <w:szCs w:val="18"/>
               </w:rPr>
-              <w:t>9 µs</w:t>
+              <w:t>0.471 µs</w:t>
             </w:r>
           </w:p>
         </w:tc>
@@ -9827,7 +11807,7 @@
                 <w:sz w:val="18"/>
                 <w:szCs w:val="18"/>
               </w:rPr>
-              <w:t>18 µs</w:t>
+              <w:t>1.112 µs</w:t>
             </w:r>
           </w:p>
         </w:tc>
@@ -9854,7 +11834,7 @@
                 <w:sz w:val="18"/>
                 <w:szCs w:val="18"/>
               </w:rPr>
-              <w:t>210 µs</w:t>
+              <w:t>3.317 µs</w:t>
             </w:r>
           </w:p>
         </w:tc>
@@ -9889,6 +11869,7 @@
                 <w:sz w:val="18"/>
                 <w:szCs w:val="18"/>
               </w:rPr>
+              <w:lastRenderedPageBreak/>
               <w:t>Bellman-Ford</w:t>
             </w:r>
           </w:p>
@@ -9943,7 +11924,7 @@
                 <w:sz w:val="18"/>
                 <w:szCs w:val="18"/>
               </w:rPr>
-              <w:t>8 µs</w:t>
+              <w:t>0.170 µs</w:t>
             </w:r>
           </w:p>
         </w:tc>
@@ -9970,7 +11951,7 @@
                 <w:sz w:val="18"/>
                 <w:szCs w:val="18"/>
               </w:rPr>
-              <w:t>35 µs</w:t>
+              <w:t>0.140 µs</w:t>
             </w:r>
           </w:p>
         </w:tc>
@@ -9997,7 +11978,7 @@
                 <w:sz w:val="18"/>
                 <w:szCs w:val="18"/>
               </w:rPr>
-              <w:t>120 µs</w:t>
+              <w:t>0.611 µs</w:t>
             </w:r>
           </w:p>
         </w:tc>
@@ -10024,7 +12005,7 @@
                 <w:sz w:val="18"/>
                 <w:szCs w:val="18"/>
               </w:rPr>
-              <w:t>2800 µs</w:t>
+              <w:t>1.644 µs</w:t>
             </w:r>
           </w:p>
         </w:tc>
@@ -10122,7 +12103,7 @@
                 <w:sz w:val="18"/>
                 <w:szCs w:val="18"/>
               </w:rPr>
-              <w:t>2 µs</w:t>
+              <w:t>0.541 µs</w:t>
             </w:r>
           </w:p>
         </w:tc>
@@ -10149,7 +12130,7 @@
                 <w:sz w:val="18"/>
                 <w:szCs w:val="18"/>
               </w:rPr>
-              <w:t>7 µs</w:t>
+              <w:t>1.172 µs</w:t>
             </w:r>
           </w:p>
         </w:tc>
@@ -10176,7 +12157,7 @@
                 <w:sz w:val="18"/>
                 <w:szCs w:val="18"/>
               </w:rPr>
-              <w:t>15 µs</w:t>
+              <w:t>2.194 µs</w:t>
             </w:r>
           </w:p>
         </w:tc>
@@ -10203,7 +12184,7 @@
                 <w:sz w:val="18"/>
                 <w:szCs w:val="18"/>
               </w:rPr>
-              <w:t>175 µs</w:t>
+              <w:t>50.466 µs</w:t>
             </w:r>
           </w:p>
         </w:tc>
@@ -10219,8 +12200,14 @@
         <w:spacing w:after="120"/>
       </w:pPr>
       <w:r>
-        <w:t xml:space="preserve">Results were measured using C++ </w:t>
-      </w:r>
+        <w:t>Results were measured using C++</w:t>
+      </w:r>
+    </w:p>
+    <w:p>
+      <w:pPr>
+        <w:spacing w:after="120"/>
+        <w:ind w:firstLine="720"/>
+      </w:pPr>
       <w:proofErr w:type="gramStart"/>
       <w:r>
         <w:t>chrono::</w:t>
@@ -10232,13 +12219,65 @@
       </w:r>
       <w:proofErr w:type="spellEnd"/>
       <w:r>
-        <w:t xml:space="preserve"> on a 20-router directed graph with 33 edges. As expected, BFS and DFS are fastest due to their O(V+E) linear complexity. Dijkstra is slower than Bellman-Ford on our small dataset due to heap overhead, but Dijkstra scales much better on larger graphs.</w:t>
+        <w:t xml:space="preserve"> </w:t>
       </w:r>
     </w:p>
     <w:p>
       <w:pPr>
         <w:spacing w:after="120"/>
       </w:pPr>
+      <w:r>
+        <w:t>on a 20-router directed graph with 33 edges. As expected, BFS and DFS are fastest due to their O(V+E) linear complexity.</w:t>
+      </w:r>
+    </w:p>
+    <w:p>
+      <w:pPr>
+        <w:spacing w:after="120"/>
+      </w:pPr>
+    </w:p>
+    <w:p>
+      <w:pPr>
+        <w:pStyle w:val="ListParagraph"/>
+        <w:numPr>
+          <w:ilvl w:val="0"/>
+          <w:numId w:val="12"/>
+        </w:numPr>
+        <w:spacing w:after="120"/>
+      </w:pPr>
+      <w:r>
+        <w:t xml:space="preserve">All algorithms perform efficiently at this scale, with BFS/DFS being fastest. </w:t>
+      </w:r>
+    </w:p>
+    <w:p>
+      <w:pPr>
+        <w:pStyle w:val="ListParagraph"/>
+        <w:numPr>
+          <w:ilvl w:val="0"/>
+          <w:numId w:val="12"/>
+        </w:numPr>
+        <w:spacing w:after="120"/>
+      </w:pPr>
+      <w:r>
+        <w:t xml:space="preserve">Kruskal shows noticeable growth on dense graphs due to sorting overhead. </w:t>
+      </w:r>
+    </w:p>
+    <w:p>
+      <w:pPr>
+        <w:pStyle w:val="ListParagraph"/>
+        <w:numPr>
+          <w:ilvl w:val="0"/>
+          <w:numId w:val="12"/>
+        </w:numPr>
+        <w:spacing w:after="120"/>
+      </w:pPr>
+      <w:r>
+        <w:t>Differences between Dijkstra and Bellman-Ford are minimal at this graph size.</w:t>
+      </w:r>
+    </w:p>
+    <w:p>
+      <w:pPr>
+        <w:spacing w:after="120"/>
+      </w:pPr>
     </w:p>
     <w:p>
       <w:pPr>
@@ -10253,15 +12292,39 @@
         <w:spacing w:after="120"/>
       </w:pPr>
       <w:r>
-        <w:t>Our 20-router graph is moderately sparse (33 edges vs. maximum of 380 for a complete directed graph). On sparse graphs, Dijkstra significantly outperforms Bellman-Ford because fewer edge relaxations are needed. On dense graphs approaching E = V², Bellman-Ford's O(V×E) = O(V³) becomes prohibitive while Dijkstra's O((V+</w:t>
+        <w:t>Our 20-router graph is moderately sparse (33 edges vs. a maximum of 380 for a complete directed graph).</w:t>
+      </w:r>
+    </w:p>
+    <w:p>
+      <w:pPr>
+        <w:spacing w:after="120"/>
+      </w:pPr>
+      <w:r>
+        <w:t>For experimental analysis, larger graphs were generated in both sparse and dense configurations. The dense case approaches complete graph behavior, where the number of edges grows significantly relative to nodes.</w:t>
+      </w:r>
+    </w:p>
+    <w:p>
+      <w:pPr>
+        <w:spacing w:after="120"/>
+      </w:pPr>
+      <w:r>
+        <w:t xml:space="preserve">On sparse graphs, Dijkstra performs significantly better than Bellman-Ford since fewer edge relaxations are required. On dense graphs, Bellman-Ford becomes much slower due to its </w:t>
       </w:r>
       <w:proofErr w:type="gramStart"/>
       <w:r>
-        <w:t>E)log</w:t>
+        <w:t>O(</w:t>
       </w:r>
       <w:proofErr w:type="gramEnd"/>
       <w:r>
-        <w:t xml:space="preserve"> V) remains manageable.</w:t>
+        <w:t xml:space="preserve">V × E) complexity, while Dijkstra remains more efficient with </w:t>
+      </w:r>
+      <w:proofErr w:type="gramStart"/>
+      <w:r>
+        <w:t>O(</w:t>
+      </w:r>
+      <w:proofErr w:type="gramEnd"/>
+      <w:r>
+        <w:t>(V + E) log V).</w:t>
       </w:r>
     </w:p>
     <w:p>
@@ -10294,7 +12357,15 @@
         <w:spacing w:after="120"/>
       </w:pPr>
       <w:r>
-        <w:t xml:space="preserve">BFS and DFS are the fastest since they’re linear </w:t>
+        <w:t xml:space="preserve">BFS and DFS scale linearly with </w:t>
+      </w:r>
+      <w:proofErr w:type="gramStart"/>
+      <w:r>
+        <w:t>O(</w:t>
+      </w:r>
+      <w:proofErr w:type="gramEnd"/>
+      <w:r>
+        <w:t>V + E) and show minimal variation across densities</w:t>
       </w:r>
     </w:p>
     <w:p>
@@ -10306,7 +12377,10 @@
         <w:spacing w:after="120"/>
       </w:pPr>
       <w:r>
-        <w:t xml:space="preserve">Dijkstra scales much better than Bellman-Ford </w:t>
+        <w:t>Dijkstra scales much better than Bellman-Ford as graph size increases</w:t>
+      </w:r>
+      <w:r>
+        <w:t xml:space="preserve"> </w:t>
       </w:r>
     </w:p>
     <w:p>
@@ -10318,7 +12392,7 @@
         <w:spacing w:after="120"/>
       </w:pPr>
       <w:r>
-        <w:t xml:space="preserve">Bellman-Ford becomes very slow on dense graphs </w:t>
+        <w:t>Bellman-Ford becomes significantly slower on dense graphs</w:t>
       </w:r>
     </w:p>
     <w:p>
@@ -10330,13 +12404,16 @@
         <w:spacing w:after="120"/>
       </w:pPr>
       <w:r>
-        <w:t xml:space="preserve">Kruskal depends heavily on number of edges </w:t>
-      </w:r>
-    </w:p>
-    <w:p>
-      <w:pPr>
-        <w:spacing w:after="120"/>
-      </w:pPr>
+        <w:t xml:space="preserve">Kruskal’s performance depends on the number of edges and grows with </w:t>
+      </w:r>
+      <w:proofErr w:type="gramStart"/>
+      <w:r>
+        <w:t>O(</w:t>
+      </w:r>
+      <w:proofErr w:type="gramEnd"/>
+      <w:r>
+        <w:t>E log E)</w:t>
+      </w:r>
     </w:p>
     <w:p>
       <w:pPr>
@@ -10685,32 +12762,99 @@
       </w:r>
     </w:p>
     <w:p>
-      <w:pPr>
-        <w:spacing w:after="120"/>
-      </w:pPr>
-      <w:r>
-        <w:t xml:space="preserve">A notable finding from our experiment was that Dijkstra and Bellman-Ford produced identical shortest-path results on our dataset — confirming correctness of both implementations. The MST total weight (115 </w:t>
+      <w:r>
+        <w:t>A notable finding from our experiment was that Dijkstra and Bellman-Ford produced identical shortest-path distances on our dataset, confirming correctness of both implementations.</w:t>
+      </w:r>
+    </w:p>
+    <w:p/>
+    <w:p>
+      <w:r>
+        <w:t>The shortest path from R0 to R19 is:</w:t>
+      </w:r>
+      <w:r>
+        <w:t xml:space="preserve"> </w:t>
+      </w:r>
+      <w:r>
+        <w:rPr>
+          <w:b/>
+          <w:bCs/>
+        </w:rPr>
+        <w:t xml:space="preserve">R0 → R1 → R4 → R9 → R15 → R19 = 49 </w:t>
       </w:r>
       <w:proofErr w:type="spellStart"/>
       <w:r>
+        <w:rPr>
+          <w:b/>
+          <w:bCs/>
+        </w:rPr>
         <w:t>ms</w:t>
       </w:r>
       <w:proofErr w:type="spellEnd"/>
-      <w:r>
-        <w:t xml:space="preserve">) was substantially less than any individual long path (e.g., R0 → R3 → R7 → R11 → R16 → R19 = 49 </w:t>
+    </w:p>
+    <w:p>
+      <w:pPr>
+        <w:rPr>
+          <w:b/>
+          <w:bCs/>
+        </w:rPr>
+      </w:pPr>
+    </w:p>
+    <w:p>
+      <w:r>
+        <w:t xml:space="preserve">The Minimum Spanning Tree contains </w:t>
+      </w:r>
+      <w:r>
+        <w:rPr>
+          <w:b/>
+          <w:bCs/>
+        </w:rPr>
+        <w:t xml:space="preserve">19 edges with a total weight of 171 </w:t>
       </w:r>
       <w:proofErr w:type="spellStart"/>
       <w:r>
+        <w:rPr>
+          <w:b/>
+          <w:bCs/>
+        </w:rPr>
         <w:t>ms</w:t>
       </w:r>
       <w:proofErr w:type="spellEnd"/>
       <w:r>
-        <w:t xml:space="preserve"> by Dijkstra), demonstrating how the MST backbone minimizes total infrastructure cost while individual paths minimize per-packet latency — two distinct but complementary optimization goals.</w:t>
-      </w:r>
-    </w:p>
-    <w:p>
-      <w:r>
-        <w:br w:type="page"/>
+        <w:t>, representing the minimum-cost backbone required to connect all routers.</w:t>
+      </w:r>
+    </w:p>
+    <w:p/>
+    <w:p>
+      <w:r>
+        <w:t>This highlights the difference between the two optimization goals:</w:t>
+      </w:r>
+    </w:p>
+    <w:p/>
+    <w:p>
+      <w:pPr>
+        <w:pStyle w:val="ListParagraph"/>
+        <w:numPr>
+          <w:ilvl w:val="0"/>
+          <w:numId w:val="2"/>
+        </w:numPr>
+        <w:spacing w:after="60"/>
+      </w:pPr>
+      <w:r>
+        <w:lastRenderedPageBreak/>
+        <w:t>Shortest path minimizes latency for a single route</w:t>
+      </w:r>
+    </w:p>
+    <w:p>
+      <w:pPr>
+        <w:pStyle w:val="ListParagraph"/>
+        <w:numPr>
+          <w:ilvl w:val="0"/>
+          <w:numId w:val="2"/>
+        </w:numPr>
+        <w:spacing w:after="60"/>
+      </w:pPr>
+      <w:r>
+        <w:t>MST minimizes total infrastructure cost across the entire network</w:t>
       </w:r>
     </w:p>
     <w:p>
@@ -10718,7 +12862,6 @@
         <w:pStyle w:val="Heading1"/>
       </w:pPr>
       <w:r>
-        <w:lastRenderedPageBreak/>
         <w:t>8. Conclusion</w:t>
       </w:r>
     </w:p>
@@ -10822,8 +12965,8 @@
       </w:r>
     </w:p>
     <w:sectPr>
-      <w:headerReference w:type="default" r:id="rId8"/>
-      <w:footerReference w:type="default" r:id="rId9"/>
+      <w:headerReference w:type="default" r:id="rId15"/>
+      <w:footerReference w:type="default" r:id="rId16"/>
       <w:pgSz w:w="12240" w:h="15840"/>
       <w:pgMar w:top="1440" w:right="1440" w:bottom="1440" w:left="1440" w:header="708" w:footer="708" w:gutter="0"/>
       <w:cols w:space="720"/>
@@ -10973,7 +13116,39 @@
         <w:sz w:val="18"/>
         <w:szCs w:val="18"/>
       </w:rPr>
-      <w:t>Internet Router Network – Graph Algorithm Analysis | COT-4400</w:t>
+      <w:t>Internet Router Network – Graph Algorithm Analysis | COT</w:t>
+    </w:r>
+    <w:r>
+      <w:rPr>
+        <w:color w:val="555555"/>
+        <w:sz w:val="18"/>
+        <w:szCs w:val="18"/>
+      </w:rPr>
+      <w:t xml:space="preserve"> </w:t>
+    </w:r>
+    <w:r>
+      <w:rPr>
+        <w:color w:val="555555"/>
+        <w:sz w:val="18"/>
+        <w:szCs w:val="18"/>
+      </w:rPr>
+      <w:t>-</w:t>
+    </w:r>
+    <w:r>
+      <w:rPr>
+        <w:color w:val="555555"/>
+        <w:sz w:val="18"/>
+        <w:szCs w:val="18"/>
+      </w:rPr>
+      <w:t xml:space="preserve"> </w:t>
+    </w:r>
+    <w:r>
+      <w:rPr>
+        <w:color w:val="555555"/>
+        <w:sz w:val="18"/>
+        <w:szCs w:val="18"/>
+      </w:rPr>
+      <w:t>4400</w:t>
     </w:r>
   </w:p>
 </w:hdr>
@@ -13423,6 +15598,48 @@
       <w:szCs w:val="24"/>
     </w:rPr>
   </w:style>
+  <w:style w:type="paragraph" w:styleId="Header">
+    <w:name w:val="header"/>
+    <w:basedOn w:val="Normal"/>
+    <w:link w:val="HeaderChar"/>
+    <w:uiPriority w:val="99"/>
+    <w:unhideWhenUsed/>
+    <w:rsid w:val="001936AB"/>
+    <w:pPr>
+      <w:tabs>
+        <w:tab w:val="center" w:pos="4680"/>
+        <w:tab w:val="right" w:pos="9360"/>
+      </w:tabs>
+    </w:pPr>
+  </w:style>
+  <w:style w:type="character" w:customStyle="1" w:styleId="HeaderChar">
+    <w:name w:val="Header Char"/>
+    <w:basedOn w:val="DefaultParagraphFont"/>
+    <w:link w:val="Header"/>
+    <w:uiPriority w:val="99"/>
+    <w:rsid w:val="001936AB"/>
+  </w:style>
+  <w:style w:type="paragraph" w:styleId="Footer">
+    <w:name w:val="footer"/>
+    <w:basedOn w:val="Normal"/>
+    <w:link w:val="FooterChar"/>
+    <w:uiPriority w:val="99"/>
+    <w:unhideWhenUsed/>
+    <w:rsid w:val="001936AB"/>
+    <w:pPr>
+      <w:tabs>
+        <w:tab w:val="center" w:pos="4680"/>
+        <w:tab w:val="right" w:pos="9360"/>
+      </w:tabs>
+    </w:pPr>
+  </w:style>
+  <w:style w:type="character" w:customStyle="1" w:styleId="FooterChar">
+    <w:name w:val="Footer Char"/>
+    <w:basedOn w:val="DefaultParagraphFont"/>
+    <w:link w:val="Footer"/>
+    <w:uiPriority w:val="99"/>
+    <w:rsid w:val="001936AB"/>
+  </w:style>
 </w:styles>
 </file>
 

</xml_diff>